<commit_message>
agregar plantilla para dni
</commit_message>
<xml_diff>
--- a/chancado/analytica/Report/PrintPaleta.docx
+++ b/chancado/analytica/Report/PrintPaleta.docx
@@ -5,12 +5,15 @@
     <w:p/>
     <w:tbl>
       <w:tblPr>
-        <w:tblW w:w="4939" w:type="pct"/>
+        <w:tblW w:w="5000" w:type="pct"/>
+        <w:tblInd w:w="-289" w:type="dxa"/>
         <w:tblBorders>
-          <w:top w:val="single" w:sz="12" w:space="0" w:color="0070C0"/>
-          <w:left w:val="single" w:sz="12" w:space="0" w:color="0070C0"/>
-          <w:bottom w:val="single" w:sz="12" w:space="0" w:color="0070C0"/>
-          <w:right w:val="single" w:sz="12" w:space="0" w:color="0070C0"/>
+          <w:top w:val="single" w:sz="4" w:space="0" w:color="auto"/>
+          <w:left w:val="single" w:sz="4" w:space="0" w:color="auto"/>
+          <w:bottom w:val="single" w:sz="4" w:space="0" w:color="auto"/>
+          <w:right w:val="single" w:sz="4" w:space="0" w:color="auto"/>
+          <w:insideH w:val="single" w:sz="4" w:space="0" w:color="auto"/>
+          <w:insideV w:val="single" w:sz="4" w:space="0" w:color="auto"/>
         </w:tblBorders>
         <w:tblCellMar>
           <w:left w:w="0" w:type="dxa"/>
@@ -20,39 +23,319 @@
         <w:tblDescription w:val="Tabla de diseño de encabezado"/>
       </w:tblPr>
       <w:tblGrid>
-        <w:gridCol w:w="10738"/>
-        <w:gridCol w:w="4812"/>
+        <w:gridCol w:w="2401"/>
+        <w:gridCol w:w="2021"/>
+        <w:gridCol w:w="3941"/>
+        <w:gridCol w:w="4005"/>
+        <w:gridCol w:w="937"/>
+        <w:gridCol w:w="2457"/>
       </w:tblGrid>
       <w:tr>
         <w:trPr>
-          <w:trHeight w:val="2425"/>
+          <w:trHeight w:val="7049"/>
         </w:trPr>
         <w:tc>
           <w:tcPr>
-            <w:tcW w:w="10748" w:type="dxa"/>
+            <w:tcW w:w="2694" w:type="dxa"/>
+          </w:tcPr>
+          <w:p>
+            <w:pPr>
+              <w:pStyle w:val="Informacindecontacto"/>
+              <w:ind w:left="-1"/>
+            </w:pPr>
+            <w:r>
+              <w:rPr>
+                <w:rFonts w:ascii="Times New Roman" w:hAnsi="Times New Roman" w:cs="Times New Roman"/>
+                <w:noProof/>
+                <w:szCs w:val="24"/>
+              </w:rPr>
+              <mc:AlternateContent>
+                <mc:Choice Requires="wps">
+                  <w:drawing>
+                    <wp:anchor distT="0" distB="0" distL="114300" distR="114300" simplePos="0" relativeHeight="251674624" behindDoc="0" locked="0" layoutInCell="1" allowOverlap="1" wp14:anchorId="39E9AB35" wp14:editId="4F18ED9E">
+                      <wp:simplePos x="0" y="0"/>
+                      <wp:positionH relativeFrom="margin">
+                        <wp:posOffset>91622</wp:posOffset>
+                      </wp:positionH>
+                      <wp:positionV relativeFrom="paragraph">
+                        <wp:posOffset>257901</wp:posOffset>
+                      </wp:positionV>
+                      <wp:extent cx="1282700" cy="1282700"/>
+                      <wp:effectExtent l="0" t="0" r="0" b="0"/>
+                      <wp:wrapNone/>
+                      <wp:docPr id="782399144" name="Rectángulo: esquinas redondeadas 782399144"/>
+                      <wp:cNvGraphicFramePr>
+                        <a:graphicFrameLocks xmlns:a="http://schemas.openxmlformats.org/drawingml/2006/main"/>
+                      </wp:cNvGraphicFramePr>
+                      <a:graphic xmlns:a="http://schemas.openxmlformats.org/drawingml/2006/main">
+                        <a:graphicData uri="http://schemas.microsoft.com/office/word/2010/wordprocessingShape">
+                          <wps:wsp>
+                            <wps:cNvSpPr>
+                              <a:spLocks noChangeArrowheads="1"/>
+                            </wps:cNvSpPr>
+                            <wps:spPr bwMode="auto">
+                              <a:xfrm>
+                                <a:off x="0" y="0"/>
+                                <a:ext cx="1282700" cy="1282700"/>
+                              </a:xfrm>
+                              <a:prstGeom prst="roundRect">
+                                <a:avLst>
+                                  <a:gd name="adj" fmla="val 16667"/>
+                                </a:avLst>
+                              </a:prstGeom>
+                              <a:noFill/>
+                              <a:ln w="9525">
+                                <a:noFill/>
+                                <a:miter lim="800000"/>
+                                <a:headEnd/>
+                                <a:tailEnd/>
+                              </a:ln>
+                            </wps:spPr>
+                            <wps:txbx>
+                              <w:txbxContent>
+                                <w:p>
+                                  <w:pPr>
+                                    <w:jc w:val="center"/>
+                                  </w:pPr>
+                                  <w:r>
+                                    <w:rPr>
+                                      <w:rFonts w:ascii="Arial" w:eastAsia="Arial Unicode MS" w:hAnsi="Arial"/>
+                                      <w:sz w:val="18"/>
+                                      <w:szCs w:val="18"/>
+                                    </w:rPr>
+                                    <w:fldChar w:fldCharType="begin"/>
+                                  </w:r>
+                                  <w:r>
+                                    <w:rPr>
+                                      <w:rFonts w:ascii="Arial" w:eastAsia="Arial Unicode MS" w:hAnsi="Arial"/>
+                                      <w:sz w:val="18"/>
+                                      <w:szCs w:val="18"/>
+                                    </w:rPr>
+                                    <w:instrText xml:space="preserve"> MERGEFIELD  Image:logo  \* MERGEFORMAT </w:instrText>
+                                  </w:r>
+                                  <w:r>
+                                    <w:rPr>
+                                      <w:rFonts w:ascii="Arial" w:eastAsia="Arial Unicode MS" w:hAnsi="Arial"/>
+                                      <w:sz w:val="18"/>
+                                      <w:szCs w:val="18"/>
+                                    </w:rPr>
+                                    <w:fldChar w:fldCharType="separate"/>
+                                  </w:r>
+                                  <w:r>
+                                    <w:rPr>
+                                      <w:rFonts w:ascii="Arial" w:eastAsia="Arial Unicode MS" w:hAnsi="Arial"/>
+                                      <w:noProof/>
+                                      <w:sz w:val="18"/>
+                                      <w:szCs w:val="18"/>
+                                    </w:rPr>
+                                    <w:t>«Image:logo»</w:t>
+                                  </w:r>
+                                  <w:r>
+                                    <w:rPr>
+                                      <w:rFonts w:ascii="Arial" w:eastAsia="Arial Unicode MS" w:hAnsi="Arial"/>
+                                      <w:sz w:val="18"/>
+                                      <w:szCs w:val="18"/>
+                                    </w:rPr>
+                                    <w:fldChar w:fldCharType="end"/>
+                                  </w:r>
+                                </w:p>
+                              </w:txbxContent>
+                            </wps:txbx>
+                            <wps:bodyPr rot="0" vertOverflow="clip" horzOverflow="clip" vert="horz" wrap="square" lIns="91440" tIns="45720" rIns="91440" bIns="45720" anchor="t" anchorCtr="0" upright="1">
+                              <a:noAutofit/>
+                            </wps:bodyPr>
+                          </wps:wsp>
+                        </a:graphicData>
+                      </a:graphic>
+                      <wp14:sizeRelH relativeFrom="margin">
+                        <wp14:pctWidth>0</wp14:pctWidth>
+                      </wp14:sizeRelH>
+                      <wp14:sizeRelV relativeFrom="margin">
+                        <wp14:pctHeight>0</wp14:pctHeight>
+                      </wp14:sizeRelV>
+                    </wp:anchor>
+                  </w:drawing>
+                </mc:Choice>
+                <mc:Fallback>
+                  <w:pict>
+                    <v:roundrect w14:anchorId="39E9AB35" id="Rectángulo: esquinas redondeadas 782399144" o:spid="_x0000_s1026" style="position:absolute;left:0;text-align:left;margin-left:7.2pt;margin-top:20.3pt;width:101pt;height:101pt;z-index:251674624;visibility:visible;mso-wrap-style:square;mso-width-percent:0;mso-height-percent:0;mso-wrap-distance-left:9pt;mso-wrap-distance-top:0;mso-wrap-distance-right:9pt;mso-wrap-distance-bottom:0;mso-position-horizontal:absolute;mso-position-horizontal-relative:margin;mso-position-vertical:absolute;mso-position-vertical-relative:text;mso-width-percent:0;mso-height-percent:0;mso-width-relative:margin;mso-height-relative:margin;v-text-anchor:top" arcsize="10923f" o:gfxdata="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" filled="f" stroked="f">
+                      <v:stroke joinstyle="miter"/>
+                      <v:textbox>
+                        <w:txbxContent>
+                          <w:p>
+                            <w:pPr>
+                              <w:jc w:val="center"/>
+                            </w:pPr>
+                            <w:r>
+                              <w:rPr>
+                                <w:rFonts w:ascii="Arial" w:eastAsia="Arial Unicode MS" w:hAnsi="Arial"/>
+                                <w:sz w:val="18"/>
+                                <w:szCs w:val="18"/>
+                              </w:rPr>
+                              <w:fldChar w:fldCharType="begin"/>
+                            </w:r>
+                            <w:r>
+                              <w:rPr>
+                                <w:rFonts w:ascii="Arial" w:eastAsia="Arial Unicode MS" w:hAnsi="Arial"/>
+                                <w:sz w:val="18"/>
+                                <w:szCs w:val="18"/>
+                              </w:rPr>
+                              <w:instrText xml:space="preserve"> MERGEFIELD  Image:logo  \* MERGEFORMAT </w:instrText>
+                            </w:r>
+                            <w:r>
+                              <w:rPr>
+                                <w:rFonts w:ascii="Arial" w:eastAsia="Arial Unicode MS" w:hAnsi="Arial"/>
+                                <w:sz w:val="18"/>
+                                <w:szCs w:val="18"/>
+                              </w:rPr>
+                              <w:fldChar w:fldCharType="separate"/>
+                            </w:r>
+                            <w:r>
+                              <w:rPr>
+                                <w:rFonts w:ascii="Arial" w:eastAsia="Arial Unicode MS" w:hAnsi="Arial"/>
+                                <w:noProof/>
+                                <w:sz w:val="18"/>
+                                <w:szCs w:val="18"/>
+                              </w:rPr>
+                              <w:t>«Image:logo»</w:t>
+                            </w:r>
+                            <w:r>
+                              <w:rPr>
+                                <w:rFonts w:ascii="Arial" w:eastAsia="Arial Unicode MS" w:hAnsi="Arial"/>
+                                <w:sz w:val="18"/>
+                                <w:szCs w:val="18"/>
+                              </w:rPr>
+                              <w:fldChar w:fldCharType="end"/>
+                            </w:r>
+                          </w:p>
+                        </w:txbxContent>
+                      </v:textbox>
+                      <w10:wrap anchorx="margin"/>
+                    </v:roundrect>
+                  </w:pict>
+                </mc:Fallback>
+              </mc:AlternateContent>
+            </w:r>
+          </w:p>
+        </w:tc>
+        <w:tc>
+          <w:tcPr>
+            <w:tcW w:w="10064" w:type="dxa"/>
+            <w:gridSpan w:val="4"/>
           </w:tcPr>
           <w:p>
             <w:pPr>
               <w:pStyle w:val="Informacindecontacto"/>
             </w:pPr>
+          </w:p>
+          <w:p>
+            <w:pPr>
+              <w:pStyle w:val="Ttulo"/>
+              <w:spacing w:before="240" w:line="360" w:lineRule="auto"/>
+              <w:ind w:right="289"/>
+              <w:rPr>
+                <w:rFonts w:ascii="Arial" w:hAnsi="Arial" w:cs="Arial"/>
+                <w:b/>
+                <w:bCs/>
+                <w:color w:val="00679A"/>
+                <w:sz w:val="144"/>
+                <w:szCs w:val="144"/>
+              </w:rPr>
+            </w:pPr>
             <w:r>
               <w:rPr>
+                <w:rFonts w:ascii="Arial" w:hAnsi="Arial" w:cs="Arial"/>
+                <w:b/>
+                <w:bCs/>
+                <w:color w:val="00679A"/>
+                <w:sz w:val="144"/>
+                <w:szCs w:val="144"/>
+              </w:rPr>
+              <w:fldChar w:fldCharType="begin"/>
+            </w:r>
+            <w:r>
+              <w:rPr>
+                <w:rFonts w:ascii="Arial" w:hAnsi="Arial" w:cs="Arial"/>
+                <w:b/>
+                <w:bCs/>
+                <w:color w:val="00679A"/>
+                <w:sz w:val="144"/>
+                <w:szCs w:val="144"/>
+              </w:rPr>
+              <w:instrText xml:space="preserve"> MERGEFIELD  nro_lote  \* MERGEFORMAT </w:instrText>
+            </w:r>
+            <w:r>
+              <w:rPr>
+                <w:rFonts w:ascii="Arial" w:hAnsi="Arial" w:cs="Arial"/>
+                <w:b/>
+                <w:bCs/>
+                <w:color w:val="00679A"/>
+                <w:sz w:val="144"/>
+                <w:szCs w:val="144"/>
+              </w:rPr>
+              <w:fldChar w:fldCharType="separate"/>
+            </w:r>
+            <w:r>
+              <w:rPr>
+                <w:rFonts w:ascii="Arial" w:hAnsi="Arial" w:cs="Arial"/>
+                <w:b/>
+                <w:bCs/>
+                <w:color w:val="00679A"/>
+                <w:sz w:val="144"/>
+                <w:szCs w:val="144"/>
+              </w:rPr>
+              <w:t>«nro_lote»</w:t>
+            </w:r>
+            <w:r>
+              <w:rPr>
+                <w:rFonts w:ascii="Arial" w:hAnsi="Arial" w:cs="Arial"/>
+                <w:b/>
+                <w:bCs/>
+                <w:color w:val="00679A"/>
+                <w:sz w:val="144"/>
+                <w:szCs w:val="144"/>
+              </w:rPr>
+              <w:fldChar w:fldCharType="end"/>
+            </w:r>
+          </w:p>
+          <w:p>
+            <w:pPr>
+              <w:pStyle w:val="Informacindecontacto"/>
+              <w:ind w:left="3375" w:right="-1007"/>
+              <w:jc w:val="center"/>
+            </w:pPr>
+          </w:p>
+        </w:tc>
+        <w:tc>
+          <w:tcPr>
+            <w:tcW w:w="3004" w:type="dxa"/>
+            <w:vAlign w:val="center"/>
+          </w:tcPr>
+          <w:p>
+            <w:pPr>
+              <w:pStyle w:val="Grfico"/>
+              <w:ind w:left="723"/>
+              <w:rPr>
+                <w:color w:val="006666" w:themeColor="accent3"/>
+              </w:rPr>
+            </w:pPr>
+            <w:r>
+              <w:rPr>
                 <w:rFonts w:ascii="Times New Roman" w:hAnsi="Times New Roman" w:cs="Times New Roman"/>
-                <w:noProof/>
                 <w:szCs w:val="24"/>
               </w:rPr>
               <mc:AlternateContent>
                 <mc:Choice Requires="wps">
                   <w:drawing>
-                    <wp:anchor distT="0" distB="0" distL="114300" distR="114300" simplePos="0" relativeHeight="251664384" behindDoc="0" locked="0" layoutInCell="1" allowOverlap="1" wp14:anchorId="59435B1C" wp14:editId="1A60D15D">
+                    <wp:anchor distT="0" distB="0" distL="114300" distR="114300" simplePos="0" relativeHeight="251672576" behindDoc="0" locked="0" layoutInCell="1" allowOverlap="1" wp14:anchorId="59435B1C" wp14:editId="27E2F41B">
                       <wp:simplePos x="0" y="0"/>
                       <wp:positionH relativeFrom="margin">
-                        <wp:posOffset>3030680</wp:posOffset>
+                        <wp:posOffset>161290</wp:posOffset>
                       </wp:positionH>
                       <wp:positionV relativeFrom="paragraph">
-                        <wp:posOffset>58835</wp:posOffset>
+                        <wp:posOffset>-1991360</wp:posOffset>
                       </wp:positionV>
-                      <wp:extent cx="3894083" cy="3752193"/>
+                      <wp:extent cx="1282700" cy="1282700"/>
                       <wp:effectExtent l="0" t="0" r="0" b="0"/>
                       <wp:wrapNone/>
                       <wp:docPr id="1729424235" name="Rectángulo: esquinas redondeadas 1729424235"/>
@@ -68,7 +351,7 @@
                             <wps:spPr bwMode="auto">
                               <a:xfrm>
                                 <a:off x="0" y="0"/>
-                                <a:ext cx="3894083" cy="3752193"/>
+                                <a:ext cx="1282700" cy="1282700"/>
                               </a:xfrm>
                               <a:prstGeom prst="roundRect">
                                 <a:avLst>
@@ -150,7 +433,7 @@
                 </mc:Choice>
                 <mc:Fallback>
                   <w:pict>
-                    <v:roundrect w14:anchorId="59435B1C" id="Rectángulo: esquinas redondeadas 1729424235" o:spid="_x0000_s1026" style="position:absolute;margin-left:238.65pt;margin-top:4.65pt;width:306.6pt;height:295.45pt;z-index:251664384;visibility:visible;mso-wrap-style:square;mso-width-percent:0;mso-height-percent:0;mso-wrap-distance-left:9pt;mso-wrap-distance-top:0;mso-wrap-distance-right:9pt;mso-wrap-distance-bottom:0;mso-position-horizontal:absolute;mso-position-horizontal-relative:margin;mso-position-vertical:absolute;mso-position-vertical-relative:text;mso-width-percent:0;mso-height-percent:0;mso-width-relative:margin;mso-height-relative:margin;v-text-anchor:top" arcsize="10923f" o:gfxdata="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" filled="f" stroked="f">
+                    <v:roundrect w14:anchorId="59435B1C" id="Rectángulo: esquinas redondeadas 1729424235" o:spid="_x0000_s1027" style="position:absolute;left:0;text-align:left;margin-left:12.7pt;margin-top:-156.8pt;width:101pt;height:101pt;z-index:251672576;visibility:visible;mso-wrap-style:square;mso-width-percent:0;mso-height-percent:0;mso-wrap-distance-left:9pt;mso-wrap-distance-top:0;mso-wrap-distance-right:9pt;mso-wrap-distance-bottom:0;mso-position-horizontal:absolute;mso-position-horizontal-relative:margin;mso-position-vertical:absolute;mso-position-vertical-relative:text;mso-width-percent:0;mso-height-percent:0;mso-width-relative:margin;mso-height-relative:margin;v-text-anchor:top" arcsize="10923f" o:gfxdata="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" filled="f" stroked="f">
                       <v:stroke joinstyle="miter"/>
                       <v:textbox>
                         <w:txbxContent>
@@ -209,25 +492,426 @@
               </mc:AlternateContent>
             </w:r>
           </w:p>
+        </w:tc>
+      </w:tr>
+      <w:tr>
+        <w:trPr>
+          <w:trHeight w:val="1693"/>
+        </w:trPr>
+        <w:tc>
+          <w:tcPr>
+            <w:tcW w:w="3940" w:type="dxa"/>
+            <w:gridSpan w:val="2"/>
+          </w:tcPr>
           <w:p>
             <w:pPr>
-              <w:pStyle w:val="Informacindecontacto"/>
-              <w:ind w:left="3375" w:right="-1007"/>
+              <w:pStyle w:val="Grfico"/>
+              <w:spacing w:line="276" w:lineRule="auto"/>
               <w:jc w:val="center"/>
+              <w:rPr>
+                <w:rFonts w:ascii="Arial" w:hAnsi="Arial" w:cs="Arial"/>
+                <w:color w:val="000000" w:themeColor="text1"/>
+                <w:sz w:val="40"/>
+                <w:szCs w:val="40"/>
+                <w14:shadow w14:blurRad="12700" w14:dist="38100" w14:dir="2700000" w14:sx="100000" w14:sy="100000" w14:kx="0" w14:ky="0" w14:algn="tl">
+                  <w14:srgbClr w14:val="000000">
+                    <w14:alpha w14:val="60000"/>
+                  </w14:srgbClr>
+                </w14:shadow>
+              </w:rPr>
+            </w:pPr>
+            <w:r>
+              <w:rPr>
+                <w:rFonts w:ascii="Arial" w:hAnsi="Arial" w:cs="Arial"/>
+                <w:color w:val="000000" w:themeColor="text1"/>
+                <w:sz w:val="40"/>
+                <w:szCs w:val="40"/>
+                <w14:shadow w14:blurRad="12700" w14:dist="38100" w14:dir="2700000" w14:sx="100000" w14:sy="100000" w14:kx="0" w14:ky="0" w14:algn="tl">
+                  <w14:srgbClr w14:val="000000">
+                    <w14:alpha w14:val="60000"/>
+                  </w14:srgbClr>
+                </w14:shadow>
+              </w:rPr>
+              <w:fldChar w:fldCharType="begin"/>
+            </w:r>
+            <w:r>
+              <w:rPr>
+                <w:rFonts w:ascii="Arial" w:hAnsi="Arial" w:cs="Arial"/>
+                <w:color w:val="000000" w:themeColor="text1"/>
+                <w:sz w:val="40"/>
+                <w:szCs w:val="40"/>
+                <w14:shadow w14:blurRad="12700" w14:dist="38100" w14:dir="2700000" w14:sx="100000" w14:sy="100000" w14:kx="0" w14:ky="0" w14:algn="tl">
+                  <w14:srgbClr w14:val="000000">
+                    <w14:alpha w14:val="60000"/>
+                  </w14:srgbClr>
+                </w14:shadow>
+              </w:rPr>
+              <w:instrText xml:space="preserve"> MERGEFIELD  cantidadPresentacion  \* MERGEFORMAT </w:instrText>
+            </w:r>
+            <w:r>
+              <w:rPr>
+                <w:rFonts w:ascii="Arial" w:hAnsi="Arial" w:cs="Arial"/>
+                <w:color w:val="000000" w:themeColor="text1"/>
+                <w:sz w:val="40"/>
+                <w:szCs w:val="40"/>
+                <w14:shadow w14:blurRad="12700" w14:dist="38100" w14:dir="2700000" w14:sx="100000" w14:sy="100000" w14:kx="0" w14:ky="0" w14:algn="tl">
+                  <w14:srgbClr w14:val="000000">
+                    <w14:alpha w14:val="60000"/>
+                  </w14:srgbClr>
+                </w14:shadow>
+              </w:rPr>
+              <w:fldChar w:fldCharType="separate"/>
+            </w:r>
+            <w:r>
+              <w:rPr>
+                <w:rFonts w:ascii="Arial" w:hAnsi="Arial" w:cs="Arial"/>
+                <w:color w:val="000000" w:themeColor="text1"/>
+                <w:sz w:val="40"/>
+                <w:szCs w:val="40"/>
+                <w14:shadow w14:blurRad="12700" w14:dist="38100" w14:dir="2700000" w14:sx="100000" w14:sy="100000" w14:kx="0" w14:ky="0" w14:algn="tl">
+                  <w14:srgbClr w14:val="000000">
+                    <w14:alpha w14:val="60000"/>
+                  </w14:srgbClr>
+                </w14:shadow>
+              </w:rPr>
+              <w:t>«cantidadPresentacion»</w:t>
+            </w:r>
+            <w:r>
+              <w:rPr>
+                <w:rFonts w:ascii="Arial" w:hAnsi="Arial" w:cs="Arial"/>
+                <w:color w:val="000000" w:themeColor="text1"/>
+                <w:sz w:val="40"/>
+                <w:szCs w:val="40"/>
+                <w14:shadow w14:blurRad="12700" w14:dist="38100" w14:dir="2700000" w14:sx="100000" w14:sy="100000" w14:kx="0" w14:ky="0" w14:algn="tl">
+                  <w14:srgbClr w14:val="000000">
+                    <w14:alpha w14:val="60000"/>
+                  </w14:srgbClr>
+                </w14:shadow>
+              </w:rPr>
+              <w:fldChar w:fldCharType="end"/>
+            </w:r>
+          </w:p>
+          <w:p>
+            <w:pPr>
+              <w:pStyle w:val="Grfico"/>
+              <w:ind w:left="723"/>
+              <w:jc w:val="center"/>
+              <w:rPr>
+                <w:rFonts w:ascii="Times New Roman" w:hAnsi="Times New Roman" w:cs="Times New Roman"/>
+                <w:szCs w:val="24"/>
+              </w:rPr>
             </w:pPr>
           </w:p>
         </w:tc>
         <w:tc>
           <w:tcPr>
-            <w:tcW w:w="4821" w:type="dxa"/>
-            <w:vAlign w:val="center"/>
+            <w:tcW w:w="3941" w:type="dxa"/>
           </w:tcPr>
           <w:p>
             <w:pPr>
               <w:pStyle w:val="Grfico"/>
+              <w:spacing w:line="276" w:lineRule="auto"/>
+              <w:jc w:val="center"/>
+              <w:rPr>
+                <w:rFonts w:ascii="Arial" w:hAnsi="Arial" w:cs="Arial"/>
+                <w:color w:val="000000" w:themeColor="text1"/>
+                <w:sz w:val="40"/>
+                <w:szCs w:val="40"/>
+                <w14:shadow w14:blurRad="12700" w14:dist="38100" w14:dir="2700000" w14:sx="100000" w14:sy="100000" w14:kx="0" w14:ky="0" w14:algn="tl">
+                  <w14:srgbClr w14:val="000000">
+                    <w14:alpha w14:val="60000"/>
+                  </w14:srgbClr>
+                </w14:shadow>
+              </w:rPr>
+            </w:pPr>
+            <w:r>
+              <w:rPr>
+                <w:rFonts w:ascii="Arial" w:hAnsi="Arial" w:cs="Arial"/>
+                <w:color w:val="000000" w:themeColor="text1"/>
+                <w:sz w:val="40"/>
+                <w:szCs w:val="40"/>
+                <w14:shadow w14:blurRad="12700" w14:dist="38100" w14:dir="2700000" w14:sx="100000" w14:sy="100000" w14:kx="0" w14:ky="0" w14:algn="tl">
+                  <w14:srgbClr w14:val="000000">
+                    <w14:alpha w14:val="60000"/>
+                  </w14:srgbClr>
+                </w14:shadow>
+              </w:rPr>
+              <w:fldChar w:fldCharType="begin"/>
+            </w:r>
+            <w:r>
+              <w:rPr>
+                <w:rFonts w:ascii="Arial" w:hAnsi="Arial" w:cs="Arial"/>
+                <w:color w:val="000000" w:themeColor="text1"/>
+                <w:sz w:val="40"/>
+                <w:szCs w:val="40"/>
+                <w14:shadow w14:blurRad="12700" w14:dist="38100" w14:dir="2700000" w14:sx="100000" w14:sy="100000" w14:kx="0" w14:ky="0" w14:algn="tl">
+                  <w14:srgbClr w14:val="000000">
+                    <w14:alpha w14:val="60000"/>
+                  </w14:srgbClr>
+                </w14:shadow>
+              </w:rPr>
+              <w:instrText xml:space="preserve"> MERGEFIELD  tmh  \* MERGEFORMAT </w:instrText>
+            </w:r>
+            <w:r>
+              <w:rPr>
+                <w:rFonts w:ascii="Arial" w:hAnsi="Arial" w:cs="Arial"/>
+                <w:color w:val="000000" w:themeColor="text1"/>
+                <w:sz w:val="40"/>
+                <w:szCs w:val="40"/>
+                <w14:shadow w14:blurRad="12700" w14:dist="38100" w14:dir="2700000" w14:sx="100000" w14:sy="100000" w14:kx="0" w14:ky="0" w14:algn="tl">
+                  <w14:srgbClr w14:val="000000">
+                    <w14:alpha w14:val="60000"/>
+                  </w14:srgbClr>
+                </w14:shadow>
+              </w:rPr>
+              <w:fldChar w:fldCharType="separate"/>
+            </w:r>
+            <w:r>
+              <w:rPr>
+                <w:rFonts w:ascii="Arial" w:hAnsi="Arial" w:cs="Arial"/>
+                <w:color w:val="000000" w:themeColor="text1"/>
+                <w:sz w:val="40"/>
+                <w:szCs w:val="40"/>
+                <w14:shadow w14:blurRad="12700" w14:dist="38100" w14:dir="2700000" w14:sx="100000" w14:sy="100000" w14:kx="0" w14:ky="0" w14:algn="tl">
+                  <w14:srgbClr w14:val="000000">
+                    <w14:alpha w14:val="60000"/>
+                  </w14:srgbClr>
+                </w14:shadow>
+              </w:rPr>
+              <w:t>«tmh»</w:t>
+            </w:r>
+            <w:r>
+              <w:rPr>
+                <w:rFonts w:ascii="Arial" w:hAnsi="Arial" w:cs="Arial"/>
+                <w:color w:val="000000" w:themeColor="text1"/>
+                <w:sz w:val="40"/>
+                <w:szCs w:val="40"/>
+                <w14:shadow w14:blurRad="12700" w14:dist="38100" w14:dir="2700000" w14:sx="100000" w14:sy="100000" w14:kx="0" w14:ky="0" w14:algn="tl">
+                  <w14:srgbClr w14:val="000000">
+                    <w14:alpha w14:val="60000"/>
+                  </w14:srgbClr>
+                </w14:shadow>
+              </w:rPr>
+              <w:fldChar w:fldCharType="end"/>
+            </w:r>
+          </w:p>
+          <w:p>
+            <w:pPr>
+              <w:pStyle w:val="Grfico"/>
               <w:ind w:left="723"/>
-              <w:rPr>
-                <w:color w:val="006666" w:themeColor="accent3"/>
+              <w:jc w:val="center"/>
+              <w:rPr>
+                <w:rFonts w:ascii="Times New Roman" w:hAnsi="Times New Roman" w:cs="Times New Roman"/>
+                <w:szCs w:val="24"/>
+              </w:rPr>
+            </w:pPr>
+          </w:p>
+        </w:tc>
+        <w:tc>
+          <w:tcPr>
+            <w:tcW w:w="3940" w:type="dxa"/>
+          </w:tcPr>
+          <w:p>
+            <w:pPr>
+              <w:pStyle w:val="Grfico"/>
+              <w:spacing w:line="276" w:lineRule="auto"/>
+              <w:jc w:val="center"/>
+              <w:rPr>
+                <w:rFonts w:ascii="Arial" w:hAnsi="Arial" w:cs="Arial"/>
+                <w:color w:val="000000" w:themeColor="text1"/>
+                <w:sz w:val="40"/>
+                <w:szCs w:val="40"/>
+                <w14:shadow w14:blurRad="12700" w14:dist="38100" w14:dir="2700000" w14:sx="100000" w14:sy="100000" w14:kx="0" w14:ky="0" w14:algn="tl">
+                  <w14:srgbClr w14:val="000000">
+                    <w14:alpha w14:val="60000"/>
+                  </w14:srgbClr>
+                </w14:shadow>
+              </w:rPr>
+            </w:pPr>
+            <w:r>
+              <w:rPr>
+                <w:rFonts w:ascii="Arial" w:hAnsi="Arial" w:cs="Arial"/>
+                <w:color w:val="000000" w:themeColor="text1"/>
+                <w:sz w:val="40"/>
+                <w:szCs w:val="40"/>
+                <w14:shadow w14:blurRad="12700" w14:dist="38100" w14:dir="2700000" w14:sx="100000" w14:sy="100000" w14:kx="0" w14:ky="0" w14:algn="tl">
+                  <w14:srgbClr w14:val="000000">
+                    <w14:alpha w14:val="60000"/>
+                  </w14:srgbClr>
+                </w14:shadow>
+              </w:rPr>
+              <w:fldChar w:fldCharType="begin"/>
+            </w:r>
+            <w:r>
+              <w:rPr>
+                <w:rFonts w:ascii="Arial" w:hAnsi="Arial" w:cs="Arial"/>
+                <w:color w:val="000000" w:themeColor="text1"/>
+                <w:sz w:val="40"/>
+                <w:szCs w:val="40"/>
+                <w14:shadow w14:blurRad="12700" w14:dist="38100" w14:dir="2700000" w14:sx="100000" w14:sy="100000" w14:kx="0" w14:ky="0" w14:algn="tl">
+                  <w14:srgbClr w14:val="000000">
+                    <w14:alpha w14:val="60000"/>
+                  </w14:srgbClr>
+                </w14:shadow>
+              </w:rPr>
+              <w:instrText xml:space="preserve"> MERGEFIELD  fecha_hora_ingreso  \* MERGEFORMAT </w:instrText>
+            </w:r>
+            <w:r>
+              <w:rPr>
+                <w:rFonts w:ascii="Arial" w:hAnsi="Arial" w:cs="Arial"/>
+                <w:color w:val="000000" w:themeColor="text1"/>
+                <w:sz w:val="40"/>
+                <w:szCs w:val="40"/>
+                <w14:shadow w14:blurRad="12700" w14:dist="38100" w14:dir="2700000" w14:sx="100000" w14:sy="100000" w14:kx="0" w14:ky="0" w14:algn="tl">
+                  <w14:srgbClr w14:val="000000">
+                    <w14:alpha w14:val="60000"/>
+                  </w14:srgbClr>
+                </w14:shadow>
+              </w:rPr>
+              <w:fldChar w:fldCharType="separate"/>
+            </w:r>
+            <w:r>
+              <w:rPr>
+                <w:rFonts w:ascii="Arial" w:hAnsi="Arial" w:cs="Arial"/>
+                <w:color w:val="000000" w:themeColor="text1"/>
+                <w:sz w:val="40"/>
+                <w:szCs w:val="40"/>
+                <w14:shadow w14:blurRad="12700" w14:dist="38100" w14:dir="2700000" w14:sx="100000" w14:sy="100000" w14:kx="0" w14:ky="0" w14:algn="tl">
+                  <w14:srgbClr w14:val="000000">
+                    <w14:alpha w14:val="60000"/>
+                  </w14:srgbClr>
+                </w14:shadow>
+              </w:rPr>
+              <w:t>«fecha_hora_ingreso»</w:t>
+            </w:r>
+            <w:r>
+              <w:rPr>
+                <w:rFonts w:ascii="Arial" w:hAnsi="Arial" w:cs="Arial"/>
+                <w:color w:val="000000" w:themeColor="text1"/>
+                <w:sz w:val="40"/>
+                <w:szCs w:val="40"/>
+                <w14:shadow w14:blurRad="12700" w14:dist="38100" w14:dir="2700000" w14:sx="100000" w14:sy="100000" w14:kx="0" w14:ky="0" w14:algn="tl">
+                  <w14:srgbClr w14:val="000000">
+                    <w14:alpha w14:val="60000"/>
+                  </w14:srgbClr>
+                </w14:shadow>
+              </w:rPr>
+              <w:fldChar w:fldCharType="end"/>
+            </w:r>
+          </w:p>
+          <w:p>
+            <w:pPr>
+              <w:pStyle w:val="Grfico"/>
+              <w:ind w:left="723"/>
+              <w:jc w:val="center"/>
+              <w:rPr>
+                <w:rFonts w:ascii="Times New Roman" w:hAnsi="Times New Roman" w:cs="Times New Roman"/>
+                <w:szCs w:val="24"/>
+              </w:rPr>
+            </w:pPr>
+          </w:p>
+        </w:tc>
+        <w:tc>
+          <w:tcPr>
+            <w:tcW w:w="3941" w:type="dxa"/>
+            <w:gridSpan w:val="2"/>
+          </w:tcPr>
+          <w:p>
+            <w:pPr>
+              <w:pStyle w:val="Grfico"/>
+              <w:spacing w:line="276" w:lineRule="auto"/>
+              <w:jc w:val="center"/>
+              <w:rPr>
+                <w:rFonts w:ascii="Arial" w:hAnsi="Arial" w:cs="Arial"/>
+                <w:color w:val="000000" w:themeColor="text1"/>
+                <w:sz w:val="40"/>
+                <w:szCs w:val="40"/>
+                <w14:shadow w14:blurRad="12700" w14:dist="38100" w14:dir="2700000" w14:sx="100000" w14:sy="100000" w14:kx="0" w14:ky="0" w14:algn="tl">
+                  <w14:srgbClr w14:val="000000">
+                    <w14:alpha w14:val="60000"/>
+                  </w14:srgbClr>
+                </w14:shadow>
+              </w:rPr>
+            </w:pPr>
+            <w:r>
+              <w:rPr>
+                <w:rFonts w:ascii="Arial" w:hAnsi="Arial" w:cs="Arial"/>
+                <w:color w:val="000000" w:themeColor="text1"/>
+                <w:sz w:val="40"/>
+                <w:szCs w:val="40"/>
+                <w14:shadow w14:blurRad="12700" w14:dist="38100" w14:dir="2700000" w14:sx="100000" w14:sy="100000" w14:kx="0" w14:ky="0" w14:algn="tl">
+                  <w14:srgbClr w14:val="000000">
+                    <w14:alpha w14:val="60000"/>
+                  </w14:srgbClr>
+                </w14:shadow>
+              </w:rPr>
+              <w:fldChar w:fldCharType="begin"/>
+            </w:r>
+            <w:r>
+              <w:rPr>
+                <w:rFonts w:ascii="Arial" w:hAnsi="Arial" w:cs="Arial"/>
+                <w:color w:val="000000" w:themeColor="text1"/>
+                <w:sz w:val="40"/>
+                <w:szCs w:val="40"/>
+                <w14:shadow w14:blurRad="12700" w14:dist="38100" w14:dir="2700000" w14:sx="100000" w14:sy="100000" w14:kx="0" w14:ky="0" w14:algn="tl">
+                  <w14:srgbClr w14:val="000000">
+                    <w14:alpha w14:val="60000"/>
+                  </w14:srgbClr>
+                </w14:shadow>
+              </w:rPr>
+              <w:instrText xml:space="preserve"> MERGEFIELD  guardia  \* MERGEFORMAT </w:instrText>
+            </w:r>
+            <w:r>
+              <w:rPr>
+                <w:rFonts w:ascii="Arial" w:hAnsi="Arial" w:cs="Arial"/>
+                <w:color w:val="000000" w:themeColor="text1"/>
+                <w:sz w:val="40"/>
+                <w:szCs w:val="40"/>
+                <w14:shadow w14:blurRad="12700" w14:dist="38100" w14:dir="2700000" w14:sx="100000" w14:sy="100000" w14:kx="0" w14:ky="0" w14:algn="tl">
+                  <w14:srgbClr w14:val="000000">
+                    <w14:alpha w14:val="60000"/>
+                  </w14:srgbClr>
+                </w14:shadow>
+              </w:rPr>
+              <w:fldChar w:fldCharType="separate"/>
+            </w:r>
+            <w:r>
+              <w:rPr>
+                <w:rFonts w:ascii="Arial" w:hAnsi="Arial" w:cs="Arial"/>
+                <w:color w:val="000000" w:themeColor="text1"/>
+                <w:sz w:val="40"/>
+                <w:szCs w:val="40"/>
+                <w14:shadow w14:blurRad="12700" w14:dist="38100" w14:dir="2700000" w14:sx="100000" w14:sy="100000" w14:kx="0" w14:ky="0" w14:algn="tl">
+                  <w14:srgbClr w14:val="000000">
+                    <w14:alpha w14:val="60000"/>
+                  </w14:srgbClr>
+                </w14:shadow>
+              </w:rPr>
+              <w:t>«guardia»</w:t>
+            </w:r>
+            <w:r>
+              <w:rPr>
+                <w:rFonts w:ascii="Arial" w:hAnsi="Arial" w:cs="Arial"/>
+                <w:color w:val="000000" w:themeColor="text1"/>
+                <w:sz w:val="40"/>
+                <w:szCs w:val="40"/>
+                <w14:shadow w14:blurRad="12700" w14:dist="38100" w14:dir="2700000" w14:sx="100000" w14:sy="100000" w14:kx="0" w14:ky="0" w14:algn="tl">
+                  <w14:srgbClr w14:val="000000">
+                    <w14:alpha w14:val="60000"/>
+                  </w14:srgbClr>
+                </w14:shadow>
+              </w:rPr>
+              <w:fldChar w:fldCharType="end"/>
+            </w:r>
+          </w:p>
+          <w:p>
+            <w:pPr>
+              <w:pStyle w:val="Grfico"/>
+              <w:ind w:left="723"/>
+              <w:jc w:val="center"/>
+              <w:rPr>
+                <w:rFonts w:ascii="Times New Roman" w:hAnsi="Times New Roman" w:cs="Times New Roman"/>
+                <w:szCs w:val="24"/>
               </w:rPr>
             </w:pPr>
           </w:p>
@@ -235,48 +919,56 @@
       </w:tr>
       <w:tr>
         <w:trPr>
-          <w:trHeight w:val="7878"/>
+          <w:trHeight w:val="1549"/>
         </w:trPr>
         <w:tc>
           <w:tcPr>
-            <w:tcW w:w="15569" w:type="dxa"/>
+            <w:tcW w:w="3940" w:type="dxa"/>
             <w:gridSpan w:val="2"/>
-            <w:vAlign w:val="center"/>
           </w:tcPr>
           <w:p>
             <w:pPr>
-              <w:pStyle w:val="Ttulo"/>
-              <w:spacing w:before="240" w:line="360" w:lineRule="auto"/>
-              <w:ind w:right="289"/>
-              <w:rPr>
-                <w:rFonts w:ascii="Arial" w:hAnsi="Arial" w:cs="Arial"/>
-                <w:color w:val="00679A" w:themeColor="accent4"/>
-                <w:sz w:val="144"/>
-                <w:szCs w:val="144"/>
+              <w:pStyle w:val="Grfico"/>
+              <w:ind w:left="723" w:right="707"/>
+              <w:jc w:val="center"/>
+              <w:rPr>
+                <w:rFonts w:ascii="Arial" w:hAnsi="Arial" w:cs="Arial"/>
+                <w:b/>
+                <w:bCs/>
+                <w:color w:val="00679A"/>
+                <w:sz w:val="40"/>
+                <w:szCs w:val="40"/>
               </w:rPr>
             </w:pPr>
             <w:r>
               <w:rPr>
                 <w:rFonts w:ascii="Arial" w:hAnsi="Arial" w:cs="Arial"/>
-                <w:color w:val="00679A" w:themeColor="accent4"/>
-                <w:sz w:val="144"/>
-                <w:szCs w:val="144"/>
-              </w:rPr>
-              <w:t xml:space="preserve">    </w:t>
+                <w:b/>
+                <w:bCs/>
+                <w:color w:val="00679A"/>
+                <w:sz w:val="40"/>
+                <w:szCs w:val="40"/>
+              </w:rPr>
+              <w:t>SACOS</w:t>
             </w:r>
           </w:p>
+        </w:tc>
+        <w:tc>
+          <w:tcPr>
+            <w:tcW w:w="3941" w:type="dxa"/>
+          </w:tcPr>
           <w:p>
             <w:pPr>
-              <w:pStyle w:val="Ttulo"/>
-              <w:spacing w:before="240" w:line="276" w:lineRule="auto"/>
-              <w:ind w:right="289"/>
+              <w:pStyle w:val="Grfico"/>
+              <w:ind w:left="723" w:right="522"/>
+              <w:jc w:val="center"/>
               <w:rPr>
                 <w:rFonts w:ascii="Arial" w:hAnsi="Arial" w:cs="Arial"/>
                 <w:b/>
                 <w:bCs/>
-                <w:color w:val="00679A" w:themeColor="accent4"/>
-                <w:sz w:val="144"/>
-                <w:szCs w:val="144"/>
+                <w:color w:val="00679A"/>
+                <w:sz w:val="40"/>
+                <w:szCs w:val="40"/>
               </w:rPr>
             </w:pPr>
             <w:r>
@@ -284,160 +976,88 @@
                 <w:rFonts w:ascii="Arial" w:hAnsi="Arial" w:cs="Arial"/>
                 <w:b/>
                 <w:bCs/>
-                <w:color w:val="00679A" w:themeColor="accent4"/>
-                <w:sz w:val="144"/>
-                <w:szCs w:val="144"/>
-              </w:rPr>
-              <w:fldChar w:fldCharType="begin"/>
+                <w:color w:val="00679A"/>
+                <w:sz w:val="40"/>
+                <w:szCs w:val="40"/>
+              </w:rPr>
+              <w:t>TN</w:t>
             </w:r>
-            <w:r>
+          </w:p>
+        </w:tc>
+        <w:tc>
+          <w:tcPr>
+            <w:tcW w:w="3940" w:type="dxa"/>
+          </w:tcPr>
+          <w:p>
+            <w:pPr>
+              <w:pStyle w:val="Grfico"/>
+              <w:ind w:left="723" w:right="405"/>
+              <w:jc w:val="center"/>
               <w:rPr>
                 <w:rFonts w:ascii="Arial" w:hAnsi="Arial" w:cs="Arial"/>
                 <w:b/>
                 <w:bCs/>
-                <w:color w:val="00679A" w:themeColor="accent4"/>
-                <w:sz w:val="144"/>
-                <w:szCs w:val="144"/>
-              </w:rPr>
-              <w:instrText xml:space="preserve"> MERGEFIELD  nro_lote  \* MERGEFORMAT </w:instrText>
-            </w:r>
+                <w:color w:val="00679A"/>
+                <w:sz w:val="40"/>
+                <w:szCs w:val="40"/>
+              </w:rPr>
+            </w:pPr>
             <w:r>
               <w:rPr>
                 <w:rFonts w:ascii="Arial" w:hAnsi="Arial" w:cs="Arial"/>
                 <w:b/>
                 <w:bCs/>
-                <w:color w:val="00679A" w:themeColor="accent4"/>
-                <w:sz w:val="144"/>
-                <w:szCs w:val="144"/>
-              </w:rPr>
-              <w:fldChar w:fldCharType="separate"/>
+                <w:color w:val="00679A"/>
+                <w:sz w:val="40"/>
+                <w:szCs w:val="40"/>
+              </w:rPr>
+              <w:t>FECHA Y HORA</w:t>
             </w:r>
-            <w:r>
+          </w:p>
+        </w:tc>
+        <w:tc>
+          <w:tcPr>
+            <w:tcW w:w="3941" w:type="dxa"/>
+            <w:gridSpan w:val="2"/>
+          </w:tcPr>
+          <w:p>
+            <w:pPr>
+              <w:pStyle w:val="Grfico"/>
+              <w:ind w:left="723" w:right="597"/>
+              <w:jc w:val="center"/>
               <w:rPr>
                 <w:rFonts w:ascii="Arial" w:hAnsi="Arial" w:cs="Arial"/>
                 <w:b/>
                 <w:bCs/>
-                <w:color w:val="00679A" w:themeColor="accent4"/>
-                <w:sz w:val="144"/>
-                <w:szCs w:val="144"/>
-              </w:rPr>
-              <w:t>«nro_lote»</w:t>
-            </w:r>
+                <w:color w:val="00679A"/>
+                <w:sz w:val="40"/>
+                <w:szCs w:val="40"/>
+              </w:rPr>
+            </w:pPr>
             <w:r>
               <w:rPr>
                 <w:rFonts w:ascii="Arial" w:hAnsi="Arial" w:cs="Arial"/>
                 <w:b/>
                 <w:bCs/>
-                <w:color w:val="00679A" w:themeColor="accent4"/>
-                <w:sz w:val="144"/>
-                <w:szCs w:val="144"/>
-              </w:rPr>
-              <w:fldChar w:fldCharType="end"/>
-            </w:r>
-          </w:p>
-          <w:p>
-            <w:pPr>
-              <w:pStyle w:val="Ttulo"/>
-              <w:spacing w:before="240" w:line="276" w:lineRule="auto"/>
-              <w:ind w:right="290"/>
-              <w:rPr>
-                <w:rFonts w:ascii="Arial" w:hAnsi="Arial" w:cs="Arial"/>
-                <w:color w:val="000000" w:themeColor="text1"/>
-                <w:sz w:val="70"/>
-                <w:szCs w:val="70"/>
-                <w14:shadow w14:blurRad="12700" w14:dist="38100" w14:dir="2700000" w14:sx="100000" w14:sy="100000" w14:kx="0" w14:ky="0" w14:algn="tl">
-                  <w14:srgbClr w14:val="000000">
-                    <w14:alpha w14:val="60000"/>
-                  </w14:srgbClr>
-                </w14:shadow>
-              </w:rPr>
-            </w:pPr>
-            <w:r>
-              <w:rPr>
-                <w:rFonts w:ascii="Arial" w:hAnsi="Arial" w:cs="Arial"/>
-                <w:color w:val="000000" w:themeColor="text1"/>
-                <w:sz w:val="70"/>
-                <w:szCs w:val="70"/>
-                <w14:shadow w14:blurRad="12700" w14:dist="38100" w14:dir="2700000" w14:sx="100000" w14:sy="100000" w14:kx="0" w14:ky="0" w14:algn="tl">
-                  <w14:srgbClr w14:val="000000">
-                    <w14:alpha w14:val="60000"/>
-                  </w14:srgbClr>
-                </w14:shadow>
-              </w:rPr>
-              <w:fldChar w:fldCharType="begin"/>
-            </w:r>
-            <w:r>
-              <w:rPr>
-                <w:rFonts w:ascii="Arial" w:hAnsi="Arial" w:cs="Arial"/>
-                <w:color w:val="000000" w:themeColor="text1"/>
-                <w:sz w:val="70"/>
-                <w:szCs w:val="70"/>
-                <w14:shadow w14:blurRad="12700" w14:dist="38100" w14:dir="2700000" w14:sx="100000" w14:sy="100000" w14:kx="0" w14:ky="0" w14:algn="tl">
-                  <w14:srgbClr w14:val="000000">
-                    <w14:alpha w14:val="60000"/>
-                  </w14:srgbClr>
-                </w14:shadow>
-              </w:rPr>
-              <w:instrText xml:space="preserve"> MERGEFIELD  fecha_hora_ingreso  \* MERGEFORMAT </w:instrText>
-            </w:r>
-            <w:r>
-              <w:rPr>
-                <w:rFonts w:ascii="Arial" w:hAnsi="Arial" w:cs="Arial"/>
-                <w:color w:val="000000" w:themeColor="text1"/>
-                <w:sz w:val="70"/>
-                <w:szCs w:val="70"/>
-                <w14:shadow w14:blurRad="12700" w14:dist="38100" w14:dir="2700000" w14:sx="100000" w14:sy="100000" w14:kx="0" w14:ky="0" w14:algn="tl">
-                  <w14:srgbClr w14:val="000000">
-                    <w14:alpha w14:val="60000"/>
-                  </w14:srgbClr>
-                </w14:shadow>
-              </w:rPr>
-              <w:fldChar w:fldCharType="separate"/>
-            </w:r>
-            <w:r>
-              <w:rPr>
-                <w:rFonts w:ascii="Arial" w:hAnsi="Arial" w:cs="Arial"/>
-                <w:color w:val="000000" w:themeColor="text1"/>
-                <w:sz w:val="70"/>
-                <w:szCs w:val="70"/>
-                <w14:shadow w14:blurRad="12700" w14:dist="38100" w14:dir="2700000" w14:sx="100000" w14:sy="100000" w14:kx="0" w14:ky="0" w14:algn="tl">
-                  <w14:srgbClr w14:val="000000">
-                    <w14:alpha w14:val="60000"/>
-                  </w14:srgbClr>
-                </w14:shadow>
-              </w:rPr>
-              <w:t>«fecha_hora_ingreso»</w:t>
-            </w:r>
-            <w:r>
-              <w:rPr>
-                <w:rFonts w:ascii="Arial" w:hAnsi="Arial" w:cs="Arial"/>
-                <w:color w:val="000000" w:themeColor="text1"/>
-                <w:sz w:val="70"/>
-                <w:szCs w:val="70"/>
-                <w14:shadow w14:blurRad="12700" w14:dist="38100" w14:dir="2700000" w14:sx="100000" w14:sy="100000" w14:kx="0" w14:ky="0" w14:algn="tl">
-                  <w14:srgbClr w14:val="000000">
-                    <w14:alpha w14:val="60000"/>
-                  </w14:srgbClr>
-                </w14:shadow>
-              </w:rPr>
-              <w:fldChar w:fldCharType="end"/>
-            </w:r>
-          </w:p>
-          <w:p>
-            <w:pPr>
-              <w:pStyle w:val="Ttulo"/>
-              <w:spacing w:before="240" w:line="480" w:lineRule="auto"/>
-              <w:ind w:right="290"/>
-              <w:jc w:val="left"/>
-              <w:rPr>
+                <w:color w:val="00679A"/>
                 <w:sz w:val="40"/>
                 <w:szCs w:val="40"/>
               </w:rPr>
-            </w:pPr>
+              <w:t>GUARDIA</w:t>
+            </w:r>
           </w:p>
         </w:tc>
       </w:tr>
     </w:tbl>
+    <w:p>
+      <w:pPr>
+        <w:rPr>
+          <w:sz w:val="10"/>
+          <w:szCs w:val="10"/>
+          <w:u w:val="single"/>
+        </w:rPr>
+      </w:pPr>
+    </w:p>
     <w:p>
       <w:pPr>
         <w:rPr>
@@ -1550,7 +2170,7 @@
       <w:szCs w:val="18"/>
     </w:rPr>
   </w:style>
-  <w:style w:type="character" w:styleId="Textoennegrita">
+  <w:style w:type="character" w:styleId="Fuerte">
     <w:name w:val="Strong"/>
     <w:basedOn w:val="Fuentedeprrafopredeter"/>
     <w:uiPriority w:val="4"/>
@@ -2503,23 +3123,6 @@
 </file>
 
 <file path=customXml/item1.xml><?xml version="1.0" encoding="utf-8"?>
-<?mso-contentType ?>
-<FormTemplates xmlns="http://schemas.microsoft.com/sharepoint/v3/contenttype/forms">
-  <Display>DocumentLibraryForm</Display>
-  <Edit>DocumentLibraryForm</Edit>
-  <New>DocumentLibraryForm</New>
-</FormTemplates>
-</file>
-
-<file path=customXml/item2.xml><?xml version="1.0" encoding="utf-8"?>
-<p:properties xmlns:p="http://schemas.microsoft.com/office/2006/metadata/properties" xmlns:xsi="http://www.w3.org/2001/XMLSchema-instance" xmlns:pc="http://schemas.microsoft.com/office/infopath/2007/PartnerControls">
-  <documentManagement>
-    <MediaServiceKeyPoints xmlns="71af3243-3dd4-4a8d-8c0d-dd76da1f02a5" xsi:nil="true"/>
-  </documentManagement>
-</p:properties>
-</file>
-
-<file path=customXml/item3.xml><?xml version="1.0" encoding="utf-8"?>
 <ct:contentTypeSchema xmlns:ct="http://schemas.microsoft.com/office/2006/metadata/contentType" xmlns:ma="http://schemas.microsoft.com/office/2006/metadata/properties/metaAttributes" ct:_="" ma:_="" ma:contentTypeName="Document" ma:contentTypeID="0x01010079F111ED35F8CC479449609E8A0923A6" ma:contentTypeVersion="11" ma:contentTypeDescription="Create a new document." ma:contentTypeScope="" ma:versionID="1c2eb7a32e66fb6e4260f3771546a5e2">
   <xsd:schema xmlns:xsd="http://www.w3.org/2001/XMLSchema" xmlns:xs="http://www.w3.org/2001/XMLSchema" xmlns:p="http://schemas.microsoft.com/office/2006/metadata/properties" xmlns:ns2="71af3243-3dd4-4a8d-8c0d-dd76da1f02a5" xmlns:ns3="16c05727-aa75-4e4a-9b5f-8a80a1165891" targetNamespace="http://schemas.microsoft.com/office/2006/metadata/properties" ma:root="true" ma:fieldsID="04e1f6479c48b08974ba73b5ca973489" ns2:_="" ns3:_="">
     <xsd:import namespace="71af3243-3dd4-4a8d-8c0d-dd76da1f02a5"/>
@@ -2730,25 +3333,24 @@
 </ct:contentTypeSchema>
 </file>
 
-<file path=customXml/itemProps1.xml><?xml version="1.0" encoding="utf-8"?>
-<ds:datastoreItem xmlns:ds="http://schemas.openxmlformats.org/officeDocument/2006/customXml" ds:itemID="{BEA6D05B-AD60-405F-B8DB-FC61ABCDF8E2}">
-  <ds:schemaRefs>
-    <ds:schemaRef ds:uri="http://schemas.microsoft.com/sharepoint/v3/contenttype/forms"/>
-  </ds:schemaRefs>
-</ds:datastoreItem>
+<file path=customXml/item2.xml><?xml version="1.0" encoding="utf-8"?>
+<p:properties xmlns:p="http://schemas.microsoft.com/office/2006/metadata/properties" xmlns:xsi="http://www.w3.org/2001/XMLSchema-instance" xmlns:pc="http://schemas.microsoft.com/office/infopath/2007/PartnerControls">
+  <documentManagement>
+    <MediaServiceKeyPoints xmlns="71af3243-3dd4-4a8d-8c0d-dd76da1f02a5" xsi:nil="true"/>
+  </documentManagement>
+</p:properties>
 </file>
 
-<file path=customXml/itemProps2.xml><?xml version="1.0" encoding="utf-8"?>
-<ds:datastoreItem xmlns:ds="http://schemas.openxmlformats.org/officeDocument/2006/customXml" ds:itemID="{B550BB7C-2FBC-4612-9ECE-2EA076035D14}">
-  <ds:schemaRefs>
-    <ds:schemaRef ds:uri="http://schemas.microsoft.com/office/2006/metadata/properties"/>
-    <ds:schemaRef ds:uri="http://schemas.microsoft.com/office/infopath/2007/PartnerControls"/>
-    <ds:schemaRef ds:uri="71af3243-3dd4-4a8d-8c0d-dd76da1f02a5"/>
-  </ds:schemaRefs>
-</ds:datastoreItem>
+<file path=customXml/item3.xml><?xml version="1.0" encoding="utf-8"?>
+<?mso-contentType ?>
+<FormTemplates xmlns="http://schemas.microsoft.com/sharepoint/v3/contenttype/forms">
+  <Display>DocumentLibraryForm</Display>
+  <Edit>DocumentLibraryForm</Edit>
+  <New>DocumentLibraryForm</New>
+</FormTemplates>
 </file>
 
-<file path=customXml/itemProps3.xml><?xml version="1.0" encoding="utf-8"?>
+<file path=customXml/itemProps1.xml><?xml version="1.0" encoding="utf-8"?>
 <ds:datastoreItem xmlns:ds="http://schemas.openxmlformats.org/officeDocument/2006/customXml" ds:itemID="{23573660-FE3A-4463-827C-CAE2430F8500}">
   <ds:schemaRefs>
     <ds:schemaRef ds:uri="http://schemas.microsoft.com/office/2006/metadata/contentType"/>
@@ -2765,4 +3367,22 @@
     <ds:schemaRef ds:uri="http://schemas.microsoft.com/internal/obd"/>
   </ds:schemaRefs>
 </ds:datastoreItem>
+</file>
+
+<file path=customXml/itemProps2.xml><?xml version="1.0" encoding="utf-8"?>
+<ds:datastoreItem xmlns:ds="http://schemas.openxmlformats.org/officeDocument/2006/customXml" ds:itemID="{B550BB7C-2FBC-4612-9ECE-2EA076035D14}">
+  <ds:schemaRefs>
+    <ds:schemaRef ds:uri="http://schemas.microsoft.com/office/2006/metadata/properties"/>
+    <ds:schemaRef ds:uri="http://schemas.microsoft.com/office/infopath/2007/PartnerControls"/>
+    <ds:schemaRef ds:uri="71af3243-3dd4-4a8d-8c0d-dd76da1f02a5"/>
+  </ds:schemaRefs>
+</ds:datastoreItem>
+</file>
+
+<file path=customXml/itemProps3.xml><?xml version="1.0" encoding="utf-8"?>
+<ds:datastoreItem xmlns:ds="http://schemas.openxmlformats.org/officeDocument/2006/customXml" ds:itemID="{BEA6D05B-AD60-405F-B8DB-FC61ABCDF8E2}">
+  <ds:schemaRefs>
+    <ds:schemaRef ds:uri="http://schemas.microsoft.com/sharepoint/v3/contenttype/forms"/>
+  </ds:schemaRefs>
+</ds:datastoreItem>
 </file>
</xml_diff>

<commit_message>
chore: actualizar plantilla de paleta
</commit_message>
<xml_diff>
--- a/chancado/analytica/Report/PrintPaleta.docx
+++ b/chancado/analytica/Report/PrintPaleta.docx
@@ -7,14 +7,7 @@
       <w:tblPr>
         <w:tblW w:w="5000" w:type="pct"/>
         <w:tblInd w:w="-289" w:type="dxa"/>
-        <w:tblBorders>
-          <w:top w:val="single" w:sz="4" w:space="0" w:color="auto"/>
-          <w:left w:val="single" w:sz="4" w:space="0" w:color="auto"/>
-          <w:bottom w:val="single" w:sz="4" w:space="0" w:color="auto"/>
-          <w:right w:val="single" w:sz="4" w:space="0" w:color="auto"/>
-          <w:insideH w:val="single" w:sz="4" w:space="0" w:color="auto"/>
-          <w:insideV w:val="single" w:sz="4" w:space="0" w:color="auto"/>
-        </w:tblBorders>
+        <w:tblLayout w:type="fixed"/>
         <w:tblCellMar>
           <w:left w:w="0" w:type="dxa"/>
           <w:right w:w="0" w:type="dxa"/>
@@ -23,20 +16,19 @@
         <w:tblDescription w:val="Tabla de diseño de encabezado"/>
       </w:tblPr>
       <w:tblGrid>
-        <w:gridCol w:w="2401"/>
-        <w:gridCol w:w="2021"/>
-        <w:gridCol w:w="3941"/>
-        <w:gridCol w:w="4005"/>
-        <w:gridCol w:w="937"/>
-        <w:gridCol w:w="2457"/>
+        <w:gridCol w:w="4397"/>
+        <w:gridCol w:w="3971"/>
+        <w:gridCol w:w="3973"/>
+        <w:gridCol w:w="35"/>
+        <w:gridCol w:w="3396"/>
       </w:tblGrid>
       <w:tr>
         <w:trPr>
-          <w:trHeight w:val="7049"/>
+          <w:trHeight w:val="7900"/>
         </w:trPr>
         <w:tc>
           <w:tcPr>
-            <w:tcW w:w="2694" w:type="dxa"/>
+            <w:tcW w:w="4395" w:type="dxa"/>
           </w:tcPr>
           <w:p>
             <w:pPr>
@@ -52,15 +44,15 @@
               <mc:AlternateContent>
                 <mc:Choice Requires="wps">
                   <w:drawing>
-                    <wp:anchor distT="0" distB="0" distL="114300" distR="114300" simplePos="0" relativeHeight="251674624" behindDoc="0" locked="0" layoutInCell="1" allowOverlap="1" wp14:anchorId="39E9AB35" wp14:editId="4F18ED9E">
+                    <wp:anchor distT="0" distB="0" distL="114300" distR="114300" simplePos="0" relativeHeight="251674624" behindDoc="0" locked="0" layoutInCell="1" allowOverlap="1" wp14:anchorId="39E9AB35" wp14:editId="3C2E033D">
                       <wp:simplePos x="0" y="0"/>
                       <wp:positionH relativeFrom="margin">
-                        <wp:posOffset>91622</wp:posOffset>
+                        <wp:posOffset>-1270</wp:posOffset>
                       </wp:positionH>
                       <wp:positionV relativeFrom="paragraph">
-                        <wp:posOffset>257901</wp:posOffset>
+                        <wp:posOffset>425994</wp:posOffset>
                       </wp:positionV>
-                      <wp:extent cx="1282700" cy="1282700"/>
+                      <wp:extent cx="2667000" cy="1196975"/>
                       <wp:effectExtent l="0" t="0" r="0" b="0"/>
                       <wp:wrapNone/>
                       <wp:docPr id="782399144" name="Rectángulo: esquinas redondeadas 782399144"/>
@@ -76,7 +68,7 @@
                             <wps:spPr bwMode="auto">
                               <a:xfrm>
                                 <a:off x="0" y="0"/>
-                                <a:ext cx="1282700" cy="1282700"/>
+                                <a:ext cx="2667000" cy="1196975"/>
                               </a:xfrm>
                               <a:prstGeom prst="roundRect">
                                 <a:avLst>
@@ -158,7 +150,7 @@
                 </mc:Choice>
                 <mc:Fallback>
                   <w:pict>
-                    <v:roundrect w14:anchorId="39E9AB35" id="Rectángulo: esquinas redondeadas 782399144" o:spid="_x0000_s1026" style="position:absolute;left:0;text-align:left;margin-left:7.2pt;margin-top:20.3pt;width:101pt;height:101pt;z-index:251674624;visibility:visible;mso-wrap-style:square;mso-width-percent:0;mso-height-percent:0;mso-wrap-distance-left:9pt;mso-wrap-distance-top:0;mso-wrap-distance-right:9pt;mso-wrap-distance-bottom:0;mso-position-horizontal:absolute;mso-position-horizontal-relative:margin;mso-position-vertical:absolute;mso-position-vertical-relative:text;mso-width-percent:0;mso-height-percent:0;mso-width-relative:margin;mso-height-relative:margin;v-text-anchor:top" arcsize="10923f" o:gfxdata="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" filled="f" stroked="f">
+                    <v:roundrect w14:anchorId="39E9AB35" id="Rectángulo: esquinas redondeadas 782399144" o:spid="_x0000_s1026" style="position:absolute;left:0;text-align:left;margin-left:-.1pt;margin-top:33.55pt;width:210pt;height:94.25pt;z-index:251674624;visibility:visible;mso-wrap-style:square;mso-width-percent:0;mso-height-percent:0;mso-wrap-distance-left:9pt;mso-wrap-distance-top:0;mso-wrap-distance-right:9pt;mso-wrap-distance-bottom:0;mso-position-horizontal:absolute;mso-position-horizontal-relative:margin;mso-position-vertical:absolute;mso-position-vertical-relative:text;mso-width-percent:0;mso-height-percent:0;mso-width-relative:margin;mso-height-relative:margin;v-text-anchor:top" arcsize="10923f" o:gfxdata="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" filled="f" stroked="f">
                       <v:stroke joinstyle="miter"/>
                       <v:textbox>
                         <w:txbxContent>
@@ -220,8 +212,8 @@
         </w:tc>
         <w:tc>
           <w:tcPr>
-            <w:tcW w:w="10064" w:type="dxa"/>
-            <w:gridSpan w:val="4"/>
+            <w:tcW w:w="7938" w:type="dxa"/>
+            <w:gridSpan w:val="2"/>
           </w:tcPr>
           <w:p>
             <w:pPr>
@@ -238,8 +230,8 @@
                 <w:b/>
                 <w:bCs/>
                 <w:color w:val="00679A"/>
-                <w:sz w:val="144"/>
-                <w:szCs w:val="144"/>
+                <w:sz w:val="160"/>
+                <w:szCs w:val="160"/>
               </w:rPr>
             </w:pPr>
             <w:r>
@@ -248,8 +240,8 @@
                 <w:b/>
                 <w:bCs/>
                 <w:color w:val="00679A"/>
-                <w:sz w:val="144"/>
-                <w:szCs w:val="144"/>
+                <w:sz w:val="160"/>
+                <w:szCs w:val="160"/>
               </w:rPr>
               <w:fldChar w:fldCharType="begin"/>
             </w:r>
@@ -259,8 +251,8 @@
                 <w:b/>
                 <w:bCs/>
                 <w:color w:val="00679A"/>
-                <w:sz w:val="144"/>
-                <w:szCs w:val="144"/>
+                <w:sz w:val="160"/>
+                <w:szCs w:val="160"/>
               </w:rPr>
               <w:instrText xml:space="preserve"> MERGEFIELD  nro_lote  \* MERGEFORMAT </w:instrText>
             </w:r>
@@ -270,8 +262,8 @@
                 <w:b/>
                 <w:bCs/>
                 <w:color w:val="00679A"/>
-                <w:sz w:val="144"/>
-                <w:szCs w:val="144"/>
+                <w:sz w:val="160"/>
+                <w:szCs w:val="160"/>
               </w:rPr>
               <w:fldChar w:fldCharType="separate"/>
             </w:r>
@@ -281,8 +273,8 @@
                 <w:b/>
                 <w:bCs/>
                 <w:color w:val="00679A"/>
-                <w:sz w:val="144"/>
-                <w:szCs w:val="144"/>
+                <w:sz w:val="160"/>
+                <w:szCs w:val="160"/>
               </w:rPr>
               <w:t>«nro_lote»</w:t>
             </w:r>
@@ -292,8 +284,8 @@
                 <w:b/>
                 <w:bCs/>
                 <w:color w:val="00679A"/>
-                <w:sz w:val="144"/>
-                <w:szCs w:val="144"/>
+                <w:sz w:val="160"/>
+                <w:szCs w:val="160"/>
               </w:rPr>
               <w:fldChar w:fldCharType="end"/>
             </w:r>
@@ -308,7 +300,8 @@
         </w:tc>
         <w:tc>
           <w:tcPr>
-            <w:tcW w:w="3004" w:type="dxa"/>
+            <w:tcW w:w="3429" w:type="dxa"/>
+            <w:gridSpan w:val="2"/>
             <w:vAlign w:val="center"/>
           </w:tcPr>
           <w:p>
@@ -327,15 +320,15 @@
               <mc:AlternateContent>
                 <mc:Choice Requires="wps">
                   <w:drawing>
-                    <wp:anchor distT="0" distB="0" distL="114300" distR="114300" simplePos="0" relativeHeight="251672576" behindDoc="0" locked="0" layoutInCell="1" allowOverlap="1" wp14:anchorId="59435B1C" wp14:editId="27E2F41B">
+                    <wp:anchor distT="0" distB="0" distL="114300" distR="114300" simplePos="0" relativeHeight="251672576" behindDoc="0" locked="0" layoutInCell="1" allowOverlap="1" wp14:anchorId="59435B1C" wp14:editId="3BFD9045">
                       <wp:simplePos x="0" y="0"/>
                       <wp:positionH relativeFrom="margin">
-                        <wp:posOffset>161290</wp:posOffset>
+                        <wp:posOffset>48895</wp:posOffset>
                       </wp:positionH>
                       <wp:positionV relativeFrom="paragraph">
-                        <wp:posOffset>-1991360</wp:posOffset>
+                        <wp:posOffset>-1995170</wp:posOffset>
                       </wp:positionV>
-                      <wp:extent cx="1282700" cy="1282700"/>
+                      <wp:extent cx="2045970" cy="1839595"/>
                       <wp:effectExtent l="0" t="0" r="0" b="0"/>
                       <wp:wrapNone/>
                       <wp:docPr id="1729424235" name="Rectángulo: esquinas redondeadas 1729424235"/>
@@ -351,7 +344,7 @@
                             <wps:spPr bwMode="auto">
                               <a:xfrm>
                                 <a:off x="0" y="0"/>
-                                <a:ext cx="1282700" cy="1282700"/>
+                                <a:ext cx="2045970" cy="1839595"/>
                               </a:xfrm>
                               <a:prstGeom prst="roundRect">
                                 <a:avLst>
@@ -371,12 +364,16 @@
                                 <w:p>
                                   <w:pPr>
                                     <w:jc w:val="center"/>
+                                    <w:rPr>
+                                      <w:u w:val="single"/>
+                                    </w:rPr>
                                   </w:pPr>
                                   <w:r>
                                     <w:rPr>
                                       <w:rFonts w:ascii="Arial" w:eastAsia="Arial Unicode MS" w:hAnsi="Arial"/>
                                       <w:sz w:val="18"/>
                                       <w:szCs w:val="18"/>
+                                      <w:u w:val="single"/>
                                     </w:rPr>
                                     <w:fldChar w:fldCharType="begin"/>
                                   </w:r>
@@ -385,6 +382,7 @@
                                       <w:rFonts w:ascii="Arial" w:eastAsia="Arial Unicode MS" w:hAnsi="Arial"/>
                                       <w:sz w:val="18"/>
                                       <w:szCs w:val="18"/>
+                                      <w:u w:val="single"/>
                                     </w:rPr>
                                     <w:instrText xml:space="preserve"> MERGEFIELD  Image:imagenQr  \* MERGEFORMAT </w:instrText>
                                   </w:r>
@@ -393,6 +391,7 @@
                                       <w:rFonts w:ascii="Arial" w:eastAsia="Arial Unicode MS" w:hAnsi="Arial"/>
                                       <w:sz w:val="18"/>
                                       <w:szCs w:val="18"/>
+                                      <w:u w:val="single"/>
                                     </w:rPr>
                                     <w:fldChar w:fldCharType="separate"/>
                                   </w:r>
@@ -402,6 +401,7 @@
                                       <w:noProof/>
                                       <w:sz w:val="18"/>
                                       <w:szCs w:val="18"/>
+                                      <w:u w:val="single"/>
                                     </w:rPr>
                                     <w:t>«Image:imagenQr»</w:t>
                                   </w:r>
@@ -410,6 +410,7 @@
                                       <w:rFonts w:ascii="Arial" w:eastAsia="Arial Unicode MS" w:hAnsi="Arial"/>
                                       <w:sz w:val="18"/>
                                       <w:szCs w:val="18"/>
+                                      <w:u w:val="single"/>
                                     </w:rPr>
                                     <w:fldChar w:fldCharType="end"/>
                                   </w:r>
@@ -433,19 +434,23 @@
                 </mc:Choice>
                 <mc:Fallback>
                   <w:pict>
-                    <v:roundrect w14:anchorId="59435B1C" id="Rectángulo: esquinas redondeadas 1729424235" o:spid="_x0000_s1027" style="position:absolute;left:0;text-align:left;margin-left:12.7pt;margin-top:-156.8pt;width:101pt;height:101pt;z-index:251672576;visibility:visible;mso-wrap-style:square;mso-width-percent:0;mso-height-percent:0;mso-wrap-distance-left:9pt;mso-wrap-distance-top:0;mso-wrap-distance-right:9pt;mso-wrap-distance-bottom:0;mso-position-horizontal:absolute;mso-position-horizontal-relative:margin;mso-position-vertical:absolute;mso-position-vertical-relative:text;mso-width-percent:0;mso-height-percent:0;mso-width-relative:margin;mso-height-relative:margin;v-text-anchor:top" arcsize="10923f" o:gfxdata="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" filled="f" stroked="f">
+                    <v:roundrect w14:anchorId="59435B1C" id="Rectángulo: esquinas redondeadas 1729424235" o:spid="_x0000_s1027" style="position:absolute;left:0;text-align:left;margin-left:3.85pt;margin-top:-157.1pt;width:161.1pt;height:144.85pt;z-index:251672576;visibility:visible;mso-wrap-style:square;mso-width-percent:0;mso-height-percent:0;mso-wrap-distance-left:9pt;mso-wrap-distance-top:0;mso-wrap-distance-right:9pt;mso-wrap-distance-bottom:0;mso-position-horizontal:absolute;mso-position-horizontal-relative:margin;mso-position-vertical:absolute;mso-position-vertical-relative:text;mso-width-percent:0;mso-height-percent:0;mso-width-relative:margin;mso-height-relative:margin;v-text-anchor:top" arcsize="10923f" o:gfxdata="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" filled="f" stroked="f">
                       <v:stroke joinstyle="miter"/>
                       <v:textbox>
                         <w:txbxContent>
                           <w:p>
                             <w:pPr>
                               <w:jc w:val="center"/>
+                              <w:rPr>
+                                <w:u w:val="single"/>
+                              </w:rPr>
                             </w:pPr>
                             <w:r>
                               <w:rPr>
                                 <w:rFonts w:ascii="Arial" w:eastAsia="Arial Unicode MS" w:hAnsi="Arial"/>
                                 <w:sz w:val="18"/>
                                 <w:szCs w:val="18"/>
+                                <w:u w:val="single"/>
                               </w:rPr>
                               <w:fldChar w:fldCharType="begin"/>
                             </w:r>
@@ -454,6 +459,7 @@
                                 <w:rFonts w:ascii="Arial" w:eastAsia="Arial Unicode MS" w:hAnsi="Arial"/>
                                 <w:sz w:val="18"/>
                                 <w:szCs w:val="18"/>
+                                <w:u w:val="single"/>
                               </w:rPr>
                               <w:instrText xml:space="preserve"> MERGEFIELD  Image:imagenQr  \* MERGEFORMAT </w:instrText>
                             </w:r>
@@ -462,6 +468,7 @@
                                 <w:rFonts w:ascii="Arial" w:eastAsia="Arial Unicode MS" w:hAnsi="Arial"/>
                                 <w:sz w:val="18"/>
                                 <w:szCs w:val="18"/>
+                                <w:u w:val="single"/>
                               </w:rPr>
                               <w:fldChar w:fldCharType="separate"/>
                             </w:r>
@@ -471,6 +478,7 @@
                                 <w:noProof/>
                                 <w:sz w:val="18"/>
                                 <w:szCs w:val="18"/>
+                                <w:u w:val="single"/>
                               </w:rPr>
                               <w:t>«Image:imagenQr»</w:t>
                             </w:r>
@@ -479,6 +487,7 @@
                                 <w:rFonts w:ascii="Arial" w:eastAsia="Arial Unicode MS" w:hAnsi="Arial"/>
                                 <w:sz w:val="18"/>
                                 <w:szCs w:val="18"/>
+                                <w:u w:val="single"/>
                               </w:rPr>
                               <w:fldChar w:fldCharType="end"/>
                             </w:r>
@@ -496,12 +505,11 @@
       </w:tr>
       <w:tr>
         <w:trPr>
-          <w:trHeight w:val="1693"/>
+          <w:trHeight w:val="830"/>
         </w:trPr>
         <w:tc>
           <w:tcPr>
-            <w:tcW w:w="3940" w:type="dxa"/>
-            <w:gridSpan w:val="2"/>
+            <w:tcW w:w="4395" w:type="dxa"/>
           </w:tcPr>
           <w:p>
             <w:pPr>
@@ -546,7 +554,7 @@
                   </w14:srgbClr>
                 </w14:shadow>
               </w:rPr>
-              <w:instrText xml:space="preserve"> MERGEFIELD  cantidadPresentacion  \* MERGEFORMAT </w:instrText>
+              <w:instrText xml:space="preserve"> MERGEFIELD  cantidad_presentacion  \* MERGEFORMAT </w:instrText>
             </w:r>
             <w:r>
               <w:rPr>
@@ -574,7 +582,7 @@
                   </w14:srgbClr>
                 </w14:shadow>
               </w:rPr>
-              <w:t>«cantidadPresentacion»</w:t>
+              <w:t>«cantidad_presentacion»</w:t>
             </w:r>
             <w:r>
               <w:rPr>
@@ -605,7 +613,7 @@
         </w:tc>
         <w:tc>
           <w:tcPr>
-            <w:tcW w:w="3941" w:type="dxa"/>
+            <w:tcW w:w="3968" w:type="dxa"/>
           </w:tcPr>
           <w:p>
             <w:pPr>
@@ -709,7 +717,8 @@
         </w:tc>
         <w:tc>
           <w:tcPr>
-            <w:tcW w:w="3940" w:type="dxa"/>
+            <w:tcW w:w="4005" w:type="dxa"/>
+            <w:gridSpan w:val="2"/>
           </w:tcPr>
           <w:p>
             <w:pPr>
@@ -813,8 +822,7 @@
         </w:tc>
         <w:tc>
           <w:tcPr>
-            <w:tcW w:w="3941" w:type="dxa"/>
-            <w:gridSpan w:val="2"/>
+            <w:tcW w:w="3394" w:type="dxa"/>
           </w:tcPr>
           <w:p>
             <w:pPr>
@@ -919,12 +927,11 @@
       </w:tr>
       <w:tr>
         <w:trPr>
-          <w:trHeight w:val="1549"/>
+          <w:trHeight w:val="1092"/>
         </w:trPr>
         <w:tc>
           <w:tcPr>
-            <w:tcW w:w="3940" w:type="dxa"/>
-            <w:gridSpan w:val="2"/>
+            <w:tcW w:w="4395" w:type="dxa"/>
           </w:tcPr>
           <w:p>
             <w:pPr>
@@ -955,7 +962,7 @@
         </w:tc>
         <w:tc>
           <w:tcPr>
-            <w:tcW w:w="3941" w:type="dxa"/>
+            <w:tcW w:w="3968" w:type="dxa"/>
           </w:tcPr>
           <w:p>
             <w:pPr>
@@ -986,7 +993,8 @@
         </w:tc>
         <w:tc>
           <w:tcPr>
-            <w:tcW w:w="3940" w:type="dxa"/>
+            <w:tcW w:w="4005" w:type="dxa"/>
+            <w:gridSpan w:val="2"/>
           </w:tcPr>
           <w:p>
             <w:pPr>
@@ -1017,8 +1025,7 @@
         </w:tc>
         <w:tc>
           <w:tcPr>
-            <w:tcW w:w="3941" w:type="dxa"/>
-            <w:gridSpan w:val="2"/>
+            <w:tcW w:w="3394" w:type="dxa"/>
           </w:tcPr>
           <w:p>
             <w:pPr>
@@ -1049,24 +1056,6 @@
         </w:tc>
       </w:tr>
     </w:tbl>
-    <w:p>
-      <w:pPr>
-        <w:rPr>
-          <w:sz w:val="10"/>
-          <w:szCs w:val="10"/>
-          <w:u w:val="single"/>
-        </w:rPr>
-      </w:pPr>
-    </w:p>
-    <w:p>
-      <w:pPr>
-        <w:rPr>
-          <w:sz w:val="10"/>
-          <w:szCs w:val="10"/>
-          <w:u w:val="single"/>
-        </w:rPr>
-      </w:pPr>
-    </w:p>
     <w:p>
       <w:pPr>
         <w:rPr>
@@ -3123,6 +3112,23 @@
 </file>
 
 <file path=customXml/item1.xml><?xml version="1.0" encoding="utf-8"?>
+<?mso-contentType ?>
+<FormTemplates xmlns="http://schemas.microsoft.com/sharepoint/v3/contenttype/forms">
+  <Display>DocumentLibraryForm</Display>
+  <Edit>DocumentLibraryForm</Edit>
+  <New>DocumentLibraryForm</New>
+</FormTemplates>
+</file>
+
+<file path=customXml/item2.xml><?xml version="1.0" encoding="utf-8"?>
+<p:properties xmlns:p="http://schemas.microsoft.com/office/2006/metadata/properties" xmlns:xsi="http://www.w3.org/2001/XMLSchema-instance" xmlns:pc="http://schemas.microsoft.com/office/infopath/2007/PartnerControls">
+  <documentManagement>
+    <MediaServiceKeyPoints xmlns="71af3243-3dd4-4a8d-8c0d-dd76da1f02a5" xsi:nil="true"/>
+  </documentManagement>
+</p:properties>
+</file>
+
+<file path=customXml/item3.xml><?xml version="1.0" encoding="utf-8"?>
 <ct:contentTypeSchema xmlns:ct="http://schemas.microsoft.com/office/2006/metadata/contentType" xmlns:ma="http://schemas.microsoft.com/office/2006/metadata/properties/metaAttributes" ct:_="" ma:_="" ma:contentTypeName="Document" ma:contentTypeID="0x01010079F111ED35F8CC479449609E8A0923A6" ma:contentTypeVersion="11" ma:contentTypeDescription="Create a new document." ma:contentTypeScope="" ma:versionID="1c2eb7a32e66fb6e4260f3771546a5e2">
   <xsd:schema xmlns:xsd="http://www.w3.org/2001/XMLSchema" xmlns:xs="http://www.w3.org/2001/XMLSchema" xmlns:p="http://schemas.microsoft.com/office/2006/metadata/properties" xmlns:ns2="71af3243-3dd4-4a8d-8c0d-dd76da1f02a5" xmlns:ns3="16c05727-aa75-4e4a-9b5f-8a80a1165891" targetNamespace="http://schemas.microsoft.com/office/2006/metadata/properties" ma:root="true" ma:fieldsID="04e1f6479c48b08974ba73b5ca973489" ns2:_="" ns3:_="">
     <xsd:import namespace="71af3243-3dd4-4a8d-8c0d-dd76da1f02a5"/>
@@ -3333,24 +3339,25 @@
 </ct:contentTypeSchema>
 </file>
 
-<file path=customXml/item2.xml><?xml version="1.0" encoding="utf-8"?>
-<p:properties xmlns:p="http://schemas.microsoft.com/office/2006/metadata/properties" xmlns:xsi="http://www.w3.org/2001/XMLSchema-instance" xmlns:pc="http://schemas.microsoft.com/office/infopath/2007/PartnerControls">
-  <documentManagement>
-    <MediaServiceKeyPoints xmlns="71af3243-3dd4-4a8d-8c0d-dd76da1f02a5" xsi:nil="true"/>
-  </documentManagement>
-</p:properties>
+<file path=customXml/itemProps1.xml><?xml version="1.0" encoding="utf-8"?>
+<ds:datastoreItem xmlns:ds="http://schemas.openxmlformats.org/officeDocument/2006/customXml" ds:itemID="{BEA6D05B-AD60-405F-B8DB-FC61ABCDF8E2}">
+  <ds:schemaRefs>
+    <ds:schemaRef ds:uri="http://schemas.microsoft.com/sharepoint/v3/contenttype/forms"/>
+  </ds:schemaRefs>
+</ds:datastoreItem>
 </file>
 
-<file path=customXml/item3.xml><?xml version="1.0" encoding="utf-8"?>
-<?mso-contentType ?>
-<FormTemplates xmlns="http://schemas.microsoft.com/sharepoint/v3/contenttype/forms">
-  <Display>DocumentLibraryForm</Display>
-  <Edit>DocumentLibraryForm</Edit>
-  <New>DocumentLibraryForm</New>
-</FormTemplates>
+<file path=customXml/itemProps2.xml><?xml version="1.0" encoding="utf-8"?>
+<ds:datastoreItem xmlns:ds="http://schemas.openxmlformats.org/officeDocument/2006/customXml" ds:itemID="{B550BB7C-2FBC-4612-9ECE-2EA076035D14}">
+  <ds:schemaRefs>
+    <ds:schemaRef ds:uri="http://schemas.microsoft.com/office/2006/metadata/properties"/>
+    <ds:schemaRef ds:uri="http://schemas.microsoft.com/office/infopath/2007/PartnerControls"/>
+    <ds:schemaRef ds:uri="71af3243-3dd4-4a8d-8c0d-dd76da1f02a5"/>
+  </ds:schemaRefs>
+</ds:datastoreItem>
 </file>
 
-<file path=customXml/itemProps1.xml><?xml version="1.0" encoding="utf-8"?>
+<file path=customXml/itemProps3.xml><?xml version="1.0" encoding="utf-8"?>
 <ds:datastoreItem xmlns:ds="http://schemas.openxmlformats.org/officeDocument/2006/customXml" ds:itemID="{23573660-FE3A-4463-827C-CAE2430F8500}">
   <ds:schemaRefs>
     <ds:schemaRef ds:uri="http://schemas.microsoft.com/office/2006/metadata/contentType"/>
@@ -3367,22 +3374,4 @@
     <ds:schemaRef ds:uri="http://schemas.microsoft.com/internal/obd"/>
   </ds:schemaRefs>
 </ds:datastoreItem>
-</file>
-
-<file path=customXml/itemProps2.xml><?xml version="1.0" encoding="utf-8"?>
-<ds:datastoreItem xmlns:ds="http://schemas.openxmlformats.org/officeDocument/2006/customXml" ds:itemID="{B550BB7C-2FBC-4612-9ECE-2EA076035D14}">
-  <ds:schemaRefs>
-    <ds:schemaRef ds:uri="http://schemas.microsoft.com/office/2006/metadata/properties"/>
-    <ds:schemaRef ds:uri="http://schemas.microsoft.com/office/infopath/2007/PartnerControls"/>
-    <ds:schemaRef ds:uri="71af3243-3dd4-4a8d-8c0d-dd76da1f02a5"/>
-  </ds:schemaRefs>
-</ds:datastoreItem>
-</file>
-
-<file path=customXml/itemProps3.xml><?xml version="1.0" encoding="utf-8"?>
-<ds:datastoreItem xmlns:ds="http://schemas.openxmlformats.org/officeDocument/2006/customXml" ds:itemID="{BEA6D05B-AD60-405F-B8DB-FC61ABCDF8E2}">
-  <ds:schemaRefs>
-    <ds:schemaRef ds:uri="http://schemas.microsoft.com/sharepoint/v3/contenttype/forms"/>
-  </ds:schemaRefs>
-</ds:datastoreItem>
 </file>
</xml_diff>

<commit_message>
feat: actualizar plantillas de analytica
</commit_message>
<xml_diff>
--- a/chancado/analytica/Report/PrintPaleta.docx
+++ b/chancado/analytica/Report/PrintPaleta.docx
@@ -7,6 +7,14 @@
       <w:tblPr>
         <w:tblW w:w="5000" w:type="pct"/>
         <w:tblInd w:w="-289" w:type="dxa"/>
+        <w:tblBorders>
+          <w:top w:val="single" w:sz="4" w:space="0" w:color="auto"/>
+          <w:left w:val="single" w:sz="4" w:space="0" w:color="auto"/>
+          <w:bottom w:val="single" w:sz="4" w:space="0" w:color="auto"/>
+          <w:right w:val="single" w:sz="4" w:space="0" w:color="auto"/>
+          <w:insideH w:val="single" w:sz="4" w:space="0" w:color="auto"/>
+          <w:insideV w:val="single" w:sz="4" w:space="0" w:color="auto"/>
+        </w:tblBorders>
         <w:tblLayout w:type="fixed"/>
         <w:tblCellMar>
           <w:left w:w="0" w:type="dxa"/>
@@ -16,11 +24,10 @@
         <w:tblDescription w:val="Tabla de diseño de encabezado"/>
       </w:tblPr>
       <w:tblGrid>
-        <w:gridCol w:w="4397"/>
-        <w:gridCol w:w="3971"/>
-        <w:gridCol w:w="3973"/>
-        <w:gridCol w:w="35"/>
-        <w:gridCol w:w="3396"/>
+        <w:gridCol w:w="4395"/>
+        <w:gridCol w:w="3968"/>
+        <w:gridCol w:w="3120"/>
+        <w:gridCol w:w="4279"/>
       </w:tblGrid>
       <w:tr>
         <w:trPr>
@@ -212,7 +219,7 @@
         </w:tc>
         <w:tc>
           <w:tcPr>
-            <w:tcW w:w="7938" w:type="dxa"/>
+            <w:tcW w:w="7088" w:type="dxa"/>
             <w:gridSpan w:val="2"/>
           </w:tcPr>
           <w:p>
@@ -300,8 +307,7 @@
         </w:tc>
         <w:tc>
           <w:tcPr>
-            <w:tcW w:w="3429" w:type="dxa"/>
-            <w:gridSpan w:val="2"/>
+            <w:tcW w:w="4279" w:type="dxa"/>
             <w:vAlign w:val="center"/>
           </w:tcPr>
           <w:p>
@@ -320,15 +326,15 @@
               <mc:AlternateContent>
                 <mc:Choice Requires="wps">
                   <w:drawing>
-                    <wp:anchor distT="0" distB="0" distL="114300" distR="114300" simplePos="0" relativeHeight="251672576" behindDoc="0" locked="0" layoutInCell="1" allowOverlap="1" wp14:anchorId="59435B1C" wp14:editId="3BFD9045">
+                    <wp:anchor distT="0" distB="0" distL="114300" distR="114300" simplePos="0" relativeHeight="251672576" behindDoc="0" locked="0" layoutInCell="1" allowOverlap="1" wp14:anchorId="59435B1C" wp14:editId="182AC93D">
                       <wp:simplePos x="0" y="0"/>
                       <wp:positionH relativeFrom="margin">
-                        <wp:posOffset>48895</wp:posOffset>
+                        <wp:posOffset>53340</wp:posOffset>
                       </wp:positionH>
                       <wp:positionV relativeFrom="paragraph">
-                        <wp:posOffset>-1995170</wp:posOffset>
+                        <wp:posOffset>-1433195</wp:posOffset>
                       </wp:positionV>
-                      <wp:extent cx="2045970" cy="1839595"/>
+                      <wp:extent cx="2598420" cy="2750820"/>
                       <wp:effectExtent l="0" t="0" r="0" b="0"/>
                       <wp:wrapNone/>
                       <wp:docPr id="1729424235" name="Rectángulo: esquinas redondeadas 1729424235"/>
@@ -344,7 +350,7 @@
                             <wps:spPr bwMode="auto">
                               <a:xfrm>
                                 <a:off x="0" y="0"/>
-                                <a:ext cx="2045970" cy="1839595"/>
+                                <a:ext cx="2598420" cy="2750820"/>
                               </a:xfrm>
                               <a:prstGeom prst="roundRect">
                                 <a:avLst>
@@ -434,7 +440,7 @@
                 </mc:Choice>
                 <mc:Fallback>
                   <w:pict>
-                    <v:roundrect w14:anchorId="59435B1C" id="Rectángulo: esquinas redondeadas 1729424235" o:spid="_x0000_s1027" style="position:absolute;left:0;text-align:left;margin-left:3.85pt;margin-top:-157.1pt;width:161.1pt;height:144.85pt;z-index:251672576;visibility:visible;mso-wrap-style:square;mso-width-percent:0;mso-height-percent:0;mso-wrap-distance-left:9pt;mso-wrap-distance-top:0;mso-wrap-distance-right:9pt;mso-wrap-distance-bottom:0;mso-position-horizontal:absolute;mso-position-horizontal-relative:margin;mso-position-vertical:absolute;mso-position-vertical-relative:text;mso-width-percent:0;mso-height-percent:0;mso-width-relative:margin;mso-height-relative:margin;v-text-anchor:top" arcsize="10923f" o:gfxdata="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" filled="f" stroked="f">
+                    <v:roundrect w14:anchorId="59435B1C" id="Rectángulo: esquinas redondeadas 1729424235" o:spid="_x0000_s1027" style="position:absolute;left:0;text-align:left;margin-left:4.2pt;margin-top:-112.85pt;width:204.6pt;height:216.6pt;z-index:251672576;visibility:visible;mso-wrap-style:square;mso-width-percent:0;mso-height-percent:0;mso-wrap-distance-left:9pt;mso-wrap-distance-top:0;mso-wrap-distance-right:9pt;mso-wrap-distance-bottom:0;mso-position-horizontal:absolute;mso-position-horizontal-relative:margin;mso-position-vertical:absolute;mso-position-vertical-relative:text;mso-width-percent:0;mso-height-percent:0;mso-width-relative:margin;mso-height-relative:margin;v-text-anchor:top" arcsize="10923f" o:gfxdata="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" filled="f" stroked="f">
                       <v:stroke joinstyle="miter"/>
                       <v:textbox>
                         <w:txbxContent>
@@ -717,8 +723,7 @@
         </w:tc>
         <w:tc>
           <w:tcPr>
-            <w:tcW w:w="4005" w:type="dxa"/>
-            <w:gridSpan w:val="2"/>
+            <w:tcW w:w="3120" w:type="dxa"/>
           </w:tcPr>
           <w:p>
             <w:pPr>
@@ -822,7 +827,7 @@
         </w:tc>
         <w:tc>
           <w:tcPr>
-            <w:tcW w:w="3394" w:type="dxa"/>
+            <w:tcW w:w="4279" w:type="dxa"/>
           </w:tcPr>
           <w:p>
             <w:pPr>
@@ -993,8 +998,7 @@
         </w:tc>
         <w:tc>
           <w:tcPr>
-            <w:tcW w:w="4005" w:type="dxa"/>
-            <w:gridSpan w:val="2"/>
+            <w:tcW w:w="3120" w:type="dxa"/>
           </w:tcPr>
           <w:p>
             <w:pPr>
@@ -1025,7 +1029,7 @@
         </w:tc>
         <w:tc>
           <w:tcPr>
-            <w:tcW w:w="3394" w:type="dxa"/>
+            <w:tcW w:w="4279" w:type="dxa"/>
           </w:tcPr>
           <w:p>
             <w:pPr>
@@ -3121,14 +3125,6 @@
 </file>
 
 <file path=customXml/item2.xml><?xml version="1.0" encoding="utf-8"?>
-<p:properties xmlns:p="http://schemas.microsoft.com/office/2006/metadata/properties" xmlns:xsi="http://www.w3.org/2001/XMLSchema-instance" xmlns:pc="http://schemas.microsoft.com/office/infopath/2007/PartnerControls">
-  <documentManagement>
-    <MediaServiceKeyPoints xmlns="71af3243-3dd4-4a8d-8c0d-dd76da1f02a5" xsi:nil="true"/>
-  </documentManagement>
-</p:properties>
-</file>
-
-<file path=customXml/item3.xml><?xml version="1.0" encoding="utf-8"?>
 <ct:contentTypeSchema xmlns:ct="http://schemas.microsoft.com/office/2006/metadata/contentType" xmlns:ma="http://schemas.microsoft.com/office/2006/metadata/properties/metaAttributes" ct:_="" ma:_="" ma:contentTypeName="Document" ma:contentTypeID="0x01010079F111ED35F8CC479449609E8A0923A6" ma:contentTypeVersion="11" ma:contentTypeDescription="Create a new document." ma:contentTypeScope="" ma:versionID="1c2eb7a32e66fb6e4260f3771546a5e2">
   <xsd:schema xmlns:xsd="http://www.w3.org/2001/XMLSchema" xmlns:xs="http://www.w3.org/2001/XMLSchema" xmlns:p="http://schemas.microsoft.com/office/2006/metadata/properties" xmlns:ns2="71af3243-3dd4-4a8d-8c0d-dd76da1f02a5" xmlns:ns3="16c05727-aa75-4e4a-9b5f-8a80a1165891" targetNamespace="http://schemas.microsoft.com/office/2006/metadata/properties" ma:root="true" ma:fieldsID="04e1f6479c48b08974ba73b5ca973489" ns2:_="" ns3:_="">
     <xsd:import namespace="71af3243-3dd4-4a8d-8c0d-dd76da1f02a5"/>
@@ -3339,6 +3335,14 @@
 </ct:contentTypeSchema>
 </file>
 
+<file path=customXml/item3.xml><?xml version="1.0" encoding="utf-8"?>
+<p:properties xmlns:p="http://schemas.microsoft.com/office/2006/metadata/properties" xmlns:xsi="http://www.w3.org/2001/XMLSchema-instance" xmlns:pc="http://schemas.microsoft.com/office/infopath/2007/PartnerControls">
+  <documentManagement>
+    <MediaServiceKeyPoints xmlns="71af3243-3dd4-4a8d-8c0d-dd76da1f02a5" xsi:nil="true"/>
+  </documentManagement>
+</p:properties>
+</file>
+
 <file path=customXml/itemProps1.xml><?xml version="1.0" encoding="utf-8"?>
 <ds:datastoreItem xmlns:ds="http://schemas.openxmlformats.org/officeDocument/2006/customXml" ds:itemID="{BEA6D05B-AD60-405F-B8DB-FC61ABCDF8E2}">
   <ds:schemaRefs>
@@ -3348,16 +3352,6 @@
 </file>
 
 <file path=customXml/itemProps2.xml><?xml version="1.0" encoding="utf-8"?>
-<ds:datastoreItem xmlns:ds="http://schemas.openxmlformats.org/officeDocument/2006/customXml" ds:itemID="{B550BB7C-2FBC-4612-9ECE-2EA076035D14}">
-  <ds:schemaRefs>
-    <ds:schemaRef ds:uri="http://schemas.microsoft.com/office/2006/metadata/properties"/>
-    <ds:schemaRef ds:uri="http://schemas.microsoft.com/office/infopath/2007/PartnerControls"/>
-    <ds:schemaRef ds:uri="71af3243-3dd4-4a8d-8c0d-dd76da1f02a5"/>
-  </ds:schemaRefs>
-</ds:datastoreItem>
-</file>
-
-<file path=customXml/itemProps3.xml><?xml version="1.0" encoding="utf-8"?>
 <ds:datastoreItem xmlns:ds="http://schemas.openxmlformats.org/officeDocument/2006/customXml" ds:itemID="{23573660-FE3A-4463-827C-CAE2430F8500}">
   <ds:schemaRefs>
     <ds:schemaRef ds:uri="http://schemas.microsoft.com/office/2006/metadata/contentType"/>
@@ -3374,4 +3368,14 @@
     <ds:schemaRef ds:uri="http://schemas.microsoft.com/internal/obd"/>
   </ds:schemaRefs>
 </ds:datastoreItem>
+</file>
+
+<file path=customXml/itemProps3.xml><?xml version="1.0" encoding="utf-8"?>
+<ds:datastoreItem xmlns:ds="http://schemas.openxmlformats.org/officeDocument/2006/customXml" ds:itemID="{B550BB7C-2FBC-4612-9ECE-2EA076035D14}">
+  <ds:schemaRefs>
+    <ds:schemaRef ds:uri="http://schemas.microsoft.com/office/2006/metadata/properties"/>
+    <ds:schemaRef ds:uri="http://schemas.microsoft.com/office/infopath/2007/PartnerControls"/>
+    <ds:schemaRef ds:uri="71af3243-3dd4-4a8d-8c0d-dd76da1f02a5"/>
+  </ds:schemaRefs>
+</ds:datastoreItem>
 </file>
</xml_diff>

<commit_message>
feat: actualizar plantilla de paleta chancado para analytica
</commit_message>
<xml_diff>
--- a/chancado/analytica/Report/PrintPaleta.docx
+++ b/chancado/analytica/Report/PrintPaleta.docx
@@ -5,16 +5,8 @@
     <w:p/>
     <w:tbl>
       <w:tblPr>
-        <w:tblW w:w="5000" w:type="pct"/>
-        <w:tblInd w:w="-289" w:type="dxa"/>
-        <w:tblBorders>
-          <w:top w:val="single" w:sz="4" w:space="0" w:color="auto"/>
-          <w:left w:val="single" w:sz="4" w:space="0" w:color="auto"/>
-          <w:bottom w:val="single" w:sz="4" w:space="0" w:color="auto"/>
-          <w:right w:val="single" w:sz="4" w:space="0" w:color="auto"/>
-          <w:insideH w:val="single" w:sz="4" w:space="0" w:color="auto"/>
-          <w:insideV w:val="single" w:sz="4" w:space="0" w:color="auto"/>
-        </w:tblBorders>
+        <w:tblW w:w="5261" w:type="pct"/>
+        <w:tblInd w:w="-572" w:type="dxa"/>
         <w:tblLayout w:type="fixed"/>
         <w:tblCellMar>
           <w:left w:w="0" w:type="dxa"/>
@@ -24,40 +16,47 @@
         <w:tblDescription w:val="Tabla de diseño de encabezado"/>
       </w:tblPr>
       <w:tblGrid>
-        <w:gridCol w:w="4395"/>
-        <w:gridCol w:w="3968"/>
-        <w:gridCol w:w="3120"/>
-        <w:gridCol w:w="4279"/>
+        <w:gridCol w:w="4148"/>
+        <w:gridCol w:w="674"/>
+        <w:gridCol w:w="3474"/>
+        <w:gridCol w:w="2909"/>
+        <w:gridCol w:w="1240"/>
+        <w:gridCol w:w="4150"/>
       </w:tblGrid>
       <w:tr>
         <w:trPr>
-          <w:trHeight w:val="7900"/>
+          <w:trHeight w:val="4360"/>
         </w:trPr>
         <w:tc>
           <w:tcPr>
-            <w:tcW w:w="4395" w:type="dxa"/>
+            <w:tcW w:w="4820" w:type="dxa"/>
+            <w:gridSpan w:val="2"/>
           </w:tcPr>
           <w:p>
             <w:pPr>
               <w:pStyle w:val="Informacindecontacto"/>
               <w:ind w:left="-1"/>
+              <w:rPr>
+                <w:color w:val="auto"/>
+              </w:rPr>
             </w:pPr>
             <w:r>
               <w:rPr>
                 <w:rFonts w:ascii="Times New Roman" w:hAnsi="Times New Roman" w:cs="Times New Roman"/>
                 <w:noProof/>
+                <w:color w:val="auto"/>
                 <w:szCs w:val="24"/>
               </w:rPr>
               <mc:AlternateContent>
                 <mc:Choice Requires="wps">
                   <w:drawing>
-                    <wp:anchor distT="0" distB="0" distL="114300" distR="114300" simplePos="0" relativeHeight="251674624" behindDoc="0" locked="0" layoutInCell="1" allowOverlap="1" wp14:anchorId="39E9AB35" wp14:editId="3C2E033D">
+                    <wp:anchor distT="0" distB="0" distL="114300" distR="114300" simplePos="0" relativeHeight="251674624" behindDoc="0" locked="0" layoutInCell="1" allowOverlap="1" wp14:anchorId="39E9AB35" wp14:editId="7CA45203">
                       <wp:simplePos x="0" y="0"/>
                       <wp:positionH relativeFrom="margin">
-                        <wp:posOffset>-1270</wp:posOffset>
+                        <wp:posOffset>142663</wp:posOffset>
                       </wp:positionH>
                       <wp:positionV relativeFrom="paragraph">
-                        <wp:posOffset>425994</wp:posOffset>
+                        <wp:posOffset>425450</wp:posOffset>
                       </wp:positionV>
                       <wp:extent cx="2667000" cy="1196975"/>
                       <wp:effectExtent l="0" t="0" r="0" b="0"/>
@@ -157,7 +156,7 @@
                 </mc:Choice>
                 <mc:Fallback>
                   <w:pict>
-                    <v:roundrect w14:anchorId="39E9AB35" id="Rectángulo: esquinas redondeadas 782399144" o:spid="_x0000_s1026" style="position:absolute;left:0;text-align:left;margin-left:-.1pt;margin-top:33.55pt;width:210pt;height:94.25pt;z-index:251674624;visibility:visible;mso-wrap-style:square;mso-width-percent:0;mso-height-percent:0;mso-wrap-distance-left:9pt;mso-wrap-distance-top:0;mso-wrap-distance-right:9pt;mso-wrap-distance-bottom:0;mso-position-horizontal:absolute;mso-position-horizontal-relative:margin;mso-position-vertical:absolute;mso-position-vertical-relative:text;mso-width-percent:0;mso-height-percent:0;mso-width-relative:margin;mso-height-relative:margin;v-text-anchor:top" arcsize="10923f" o:gfxdata="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" filled="f" stroked="f">
+                    <v:roundrect w14:anchorId="39E9AB35" id="Rectángulo: esquinas redondeadas 782399144" o:spid="_x0000_s1026" style="position:absolute;left:0;text-align:left;margin-left:11.25pt;margin-top:33.5pt;width:210pt;height:94.25pt;z-index:251674624;visibility:visible;mso-wrap-style:square;mso-width-percent:0;mso-height-percent:0;mso-wrap-distance-left:9pt;mso-wrap-distance-top:0;mso-wrap-distance-right:9pt;mso-wrap-distance-bottom:0;mso-position-horizontal:absolute;mso-position-horizontal-relative:margin;mso-position-vertical:absolute;mso-position-vertical-relative:text;mso-width-percent:0;mso-height-percent:0;mso-width-relative:margin;mso-height-relative:margin;v-text-anchor:top" arcsize="10923f" o:gfxdata="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" filled="f" stroked="f">
                       <v:stroke joinstyle="miter"/>
                       <v:textbox>
                         <w:txbxContent>
@@ -219,12 +218,22 @@
         </w:tc>
         <w:tc>
           <w:tcPr>
-            <w:tcW w:w="7088" w:type="dxa"/>
+            <w:tcW w:w="6379" w:type="dxa"/>
             <w:gridSpan w:val="2"/>
           </w:tcPr>
           <w:p>
             <w:pPr>
-              <w:pStyle w:val="Informacindecontacto"/>
+              <w:pStyle w:val="Ttulo"/>
+              <w:spacing w:before="240" w:line="360" w:lineRule="auto"/>
+              <w:ind w:right="289"/>
+              <w:rPr>
+                <w:rFonts w:ascii="Arial" w:hAnsi="Arial" w:cs="Arial"/>
+                <w:b/>
+                <w:bCs/>
+                <w:color w:val="auto"/>
+                <w:sz w:val="52"/>
+                <w:szCs w:val="52"/>
+              </w:rPr>
             </w:pPr>
           </w:p>
           <w:p>
@@ -236,87 +245,94 @@
                 <w:rFonts w:ascii="Arial" w:hAnsi="Arial" w:cs="Arial"/>
                 <w:b/>
                 <w:bCs/>
-                <w:color w:val="00679A"/>
-                <w:sz w:val="160"/>
-                <w:szCs w:val="160"/>
+                <w:color w:val="auto"/>
+                <w:sz w:val="24"/>
+                <w:szCs w:val="24"/>
               </w:rPr>
             </w:pPr>
-            <w:r>
-              <w:rPr>
-                <w:rFonts w:ascii="Arial" w:hAnsi="Arial" w:cs="Arial"/>
-                <w:b/>
-                <w:bCs/>
-                <w:color w:val="00679A"/>
-                <w:sz w:val="160"/>
-                <w:szCs w:val="160"/>
-              </w:rPr>
-              <w:fldChar w:fldCharType="begin"/>
-            </w:r>
-            <w:r>
-              <w:rPr>
-                <w:rFonts w:ascii="Arial" w:hAnsi="Arial" w:cs="Arial"/>
-                <w:b/>
-                <w:bCs/>
-                <w:color w:val="00679A"/>
-                <w:sz w:val="160"/>
-                <w:szCs w:val="160"/>
-              </w:rPr>
-              <w:instrText xml:space="preserve"> MERGEFIELD  nro_lote  \* MERGEFORMAT </w:instrText>
-            </w:r>
-            <w:r>
-              <w:rPr>
-                <w:rFonts w:ascii="Arial" w:hAnsi="Arial" w:cs="Arial"/>
-                <w:b/>
-                <w:bCs/>
-                <w:color w:val="00679A"/>
-                <w:sz w:val="160"/>
-                <w:szCs w:val="160"/>
-              </w:rPr>
-              <w:fldChar w:fldCharType="separate"/>
-            </w:r>
-            <w:r>
-              <w:rPr>
-                <w:rFonts w:ascii="Arial" w:hAnsi="Arial" w:cs="Arial"/>
-                <w:b/>
-                <w:bCs/>
-                <w:color w:val="00679A"/>
-                <w:sz w:val="160"/>
-                <w:szCs w:val="160"/>
-              </w:rPr>
-              <w:t>«nro_lote»</w:t>
-            </w:r>
-            <w:r>
-              <w:rPr>
-                <w:rFonts w:ascii="Arial" w:hAnsi="Arial" w:cs="Arial"/>
-                <w:b/>
-                <w:bCs/>
-                <w:color w:val="00679A"/>
-                <w:sz w:val="160"/>
-                <w:szCs w:val="160"/>
-              </w:rPr>
-              <w:fldChar w:fldCharType="end"/>
-            </w:r>
           </w:p>
           <w:p>
             <w:pPr>
-              <w:pStyle w:val="Informacindecontacto"/>
-              <w:ind w:left="3375" w:right="-1007"/>
-              <w:jc w:val="center"/>
+              <w:pStyle w:val="Ttulo"/>
+              <w:spacing w:before="240" w:line="360" w:lineRule="auto"/>
+              <w:ind w:right="289"/>
+              <w:rPr>
+                <w:rFonts w:ascii="Arial" w:hAnsi="Arial" w:cs="Arial"/>
+                <w:b/>
+                <w:bCs/>
+                <w:color w:val="auto"/>
+                <w:sz w:val="180"/>
+                <w:szCs w:val="180"/>
+              </w:rPr>
             </w:pPr>
+            <w:r>
+              <w:rPr>
+                <w:rFonts w:ascii="Arial" w:hAnsi="Arial" w:cs="Arial"/>
+                <w:b/>
+                <w:bCs/>
+                <w:color w:val="auto"/>
+                <w:sz w:val="180"/>
+                <w:szCs w:val="180"/>
+              </w:rPr>
+              <w:fldChar w:fldCharType="begin"/>
+            </w:r>
+            <w:r>
+              <w:rPr>
+                <w:rFonts w:ascii="Arial" w:hAnsi="Arial" w:cs="Arial"/>
+                <w:b/>
+                <w:bCs/>
+                <w:color w:val="auto"/>
+                <w:sz w:val="180"/>
+                <w:szCs w:val="180"/>
+              </w:rPr>
+              <w:instrText xml:space="preserve"> MERGEFIELD  nro  \* MERGEFORMAT </w:instrText>
+            </w:r>
+            <w:r>
+              <w:rPr>
+                <w:rFonts w:ascii="Arial" w:hAnsi="Arial" w:cs="Arial"/>
+                <w:b/>
+                <w:bCs/>
+                <w:color w:val="auto"/>
+                <w:sz w:val="180"/>
+                <w:szCs w:val="180"/>
+              </w:rPr>
+              <w:fldChar w:fldCharType="separate"/>
+            </w:r>
+            <w:r>
+              <w:rPr>
+                <w:rFonts w:ascii="Arial" w:hAnsi="Arial" w:cs="Arial"/>
+                <w:b/>
+                <w:bCs/>
+                <w:noProof/>
+                <w:color w:val="auto"/>
+                <w:sz w:val="180"/>
+                <w:szCs w:val="180"/>
+              </w:rPr>
+              <w:t>«nro»</w:t>
+            </w:r>
+            <w:r>
+              <w:rPr>
+                <w:rFonts w:ascii="Arial" w:hAnsi="Arial" w:cs="Arial"/>
+                <w:b/>
+                <w:bCs/>
+                <w:color w:val="auto"/>
+                <w:sz w:val="180"/>
+                <w:szCs w:val="180"/>
+              </w:rPr>
+              <w:fldChar w:fldCharType="end"/>
+            </w:r>
           </w:p>
         </w:tc>
         <w:tc>
           <w:tcPr>
-            <w:tcW w:w="4279" w:type="dxa"/>
+            <w:tcW w:w="5386" w:type="dxa"/>
+            <w:gridSpan w:val="2"/>
             <w:vAlign w:val="center"/>
           </w:tcPr>
           <w:p>
             <w:pPr>
               <w:pStyle w:val="Grfico"/>
               <w:ind w:left="723"/>
-              <w:rPr>
-                <w:color w:val="006666" w:themeColor="accent3"/>
-              </w:rPr>
             </w:pPr>
             <w:r>
               <w:rPr>
@@ -326,15 +342,15 @@
               <mc:AlternateContent>
                 <mc:Choice Requires="wps">
                   <w:drawing>
-                    <wp:anchor distT="0" distB="0" distL="114300" distR="114300" simplePos="0" relativeHeight="251672576" behindDoc="0" locked="0" layoutInCell="1" allowOverlap="1" wp14:anchorId="59435B1C" wp14:editId="182AC93D">
+                    <wp:anchor distT="0" distB="0" distL="114300" distR="114300" simplePos="0" relativeHeight="251672576" behindDoc="0" locked="0" layoutInCell="1" allowOverlap="1" wp14:anchorId="59435B1C" wp14:editId="34B0D657">
                       <wp:simplePos x="0" y="0"/>
                       <wp:positionH relativeFrom="margin">
-                        <wp:posOffset>53340</wp:posOffset>
+                        <wp:posOffset>-8255</wp:posOffset>
                       </wp:positionH>
                       <wp:positionV relativeFrom="paragraph">
-                        <wp:posOffset>-1433195</wp:posOffset>
+                        <wp:posOffset>-17780</wp:posOffset>
                       </wp:positionV>
-                      <wp:extent cx="2598420" cy="2750820"/>
+                      <wp:extent cx="3429000" cy="3208655"/>
                       <wp:effectExtent l="0" t="0" r="0" b="0"/>
                       <wp:wrapNone/>
                       <wp:docPr id="1729424235" name="Rectángulo: esquinas redondeadas 1729424235"/>
@@ -350,7 +366,7 @@
                             <wps:spPr bwMode="auto">
                               <a:xfrm>
                                 <a:off x="0" y="0"/>
-                                <a:ext cx="2598420" cy="2750820"/>
+                                <a:ext cx="3429000" cy="3208655"/>
                               </a:xfrm>
                               <a:prstGeom prst="roundRect">
                                 <a:avLst>
@@ -440,7 +456,7 @@
                 </mc:Choice>
                 <mc:Fallback>
                   <w:pict>
-                    <v:roundrect w14:anchorId="59435B1C" id="Rectángulo: esquinas redondeadas 1729424235" o:spid="_x0000_s1027" style="position:absolute;left:0;text-align:left;margin-left:4.2pt;margin-top:-112.85pt;width:204.6pt;height:216.6pt;z-index:251672576;visibility:visible;mso-wrap-style:square;mso-width-percent:0;mso-height-percent:0;mso-wrap-distance-left:9pt;mso-wrap-distance-top:0;mso-wrap-distance-right:9pt;mso-wrap-distance-bottom:0;mso-position-horizontal:absolute;mso-position-horizontal-relative:margin;mso-position-vertical:absolute;mso-position-vertical-relative:text;mso-width-percent:0;mso-height-percent:0;mso-width-relative:margin;mso-height-relative:margin;v-text-anchor:top" arcsize="10923f" o:gfxdata="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" filled="f" stroked="f">
+                    <v:roundrect w14:anchorId="59435B1C" id="Rectángulo: esquinas redondeadas 1729424235" o:spid="_x0000_s1027" style="position:absolute;left:0;text-align:left;margin-left:-.65pt;margin-top:-1.4pt;width:270pt;height:252.65pt;z-index:251672576;visibility:visible;mso-wrap-style:square;mso-width-percent:0;mso-height-percent:0;mso-wrap-distance-left:9pt;mso-wrap-distance-top:0;mso-wrap-distance-right:9pt;mso-wrap-distance-bottom:0;mso-position-horizontal:absolute;mso-position-horizontal-relative:margin;mso-position-vertical:absolute;mso-position-vertical-relative:text;mso-width-percent:0;mso-height-percent:0;mso-width-relative:margin;mso-height-relative:margin;v-text-anchor:top" arcsize="10923f" o:gfxdata="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" filled="f" stroked="f">
                       <v:stroke joinstyle="miter"/>
                       <v:textbox>
                         <w:txbxContent>
@@ -511,11 +527,91 @@
       </w:tr>
       <w:tr>
         <w:trPr>
-          <w:trHeight w:val="830"/>
+          <w:trHeight w:val="2739"/>
         </w:trPr>
         <w:tc>
           <w:tcPr>
-            <w:tcW w:w="4395" w:type="dxa"/>
+            <w:tcW w:w="16585" w:type="dxa"/>
+            <w:gridSpan w:val="6"/>
+          </w:tcPr>
+          <w:p>
+            <w:pPr>
+              <w:pStyle w:val="Ttulo"/>
+              <w:spacing w:before="240" w:line="360" w:lineRule="auto"/>
+              <w:ind w:right="289"/>
+              <w:rPr>
+                <w:rFonts w:ascii="Times New Roman" w:hAnsi="Times New Roman" w:cs="Times New Roman"/>
+                <w:color w:val="auto"/>
+                <w:sz w:val="180"/>
+                <w:szCs w:val="180"/>
+              </w:rPr>
+            </w:pPr>
+            <w:r>
+              <w:rPr>
+                <w:rFonts w:ascii="Arial" w:hAnsi="Arial" w:cs="Arial"/>
+                <w:b/>
+                <w:bCs/>
+                <w:color w:val="auto"/>
+                <w:sz w:val="180"/>
+                <w:szCs w:val="180"/>
+              </w:rPr>
+              <w:fldChar w:fldCharType="begin"/>
+            </w:r>
+            <w:r>
+              <w:rPr>
+                <w:rFonts w:ascii="Arial" w:hAnsi="Arial" w:cs="Arial"/>
+                <w:b/>
+                <w:bCs/>
+                <w:color w:val="auto"/>
+                <w:sz w:val="180"/>
+                <w:szCs w:val="180"/>
+              </w:rPr>
+              <w:instrText xml:space="preserve"> MERGEFIELD  correlativo  \* MERGEFORMAT </w:instrText>
+            </w:r>
+            <w:r>
+              <w:rPr>
+                <w:rFonts w:ascii="Arial" w:hAnsi="Arial" w:cs="Arial"/>
+                <w:b/>
+                <w:bCs/>
+                <w:color w:val="auto"/>
+                <w:sz w:val="180"/>
+                <w:szCs w:val="180"/>
+              </w:rPr>
+              <w:fldChar w:fldCharType="separate"/>
+            </w:r>
+            <w:r>
+              <w:rPr>
+                <w:rFonts w:ascii="Arial" w:hAnsi="Arial" w:cs="Arial"/>
+                <w:b/>
+                <w:bCs/>
+                <w:noProof/>
+                <w:color w:val="auto"/>
+                <w:sz w:val="180"/>
+                <w:szCs w:val="180"/>
+              </w:rPr>
+              <w:t>«correlativo»</w:t>
+            </w:r>
+            <w:r>
+              <w:rPr>
+                <w:rFonts w:ascii="Arial" w:hAnsi="Arial" w:cs="Arial"/>
+                <w:b/>
+                <w:bCs/>
+                <w:color w:val="auto"/>
+                <w:sz w:val="180"/>
+                <w:szCs w:val="180"/>
+              </w:rPr>
+              <w:fldChar w:fldCharType="end"/>
+            </w:r>
+          </w:p>
+        </w:tc>
+      </w:tr>
+      <w:tr>
+        <w:trPr>
+          <w:trHeight w:val="1267"/>
+        </w:trPr>
+        <w:tc>
+          <w:tcPr>
+            <w:tcW w:w="4146" w:type="dxa"/>
           </w:tcPr>
           <w:p>
             <w:pPr>
@@ -524,7 +620,6 @@
               <w:jc w:val="center"/>
               <w:rPr>
                 <w:rFonts w:ascii="Arial" w:hAnsi="Arial" w:cs="Arial"/>
-                <w:color w:val="000000" w:themeColor="text1"/>
                 <w:sz w:val="40"/>
                 <w:szCs w:val="40"/>
                 <w14:shadow w14:blurRad="12700" w14:dist="38100" w14:dir="2700000" w14:sx="100000" w14:sy="100000" w14:kx="0" w14:ky="0" w14:algn="tl">
@@ -537,7 +632,6 @@
             <w:r>
               <w:rPr>
                 <w:rFonts w:ascii="Arial" w:hAnsi="Arial" w:cs="Arial"/>
-                <w:color w:val="000000" w:themeColor="text1"/>
                 <w:sz w:val="40"/>
                 <w:szCs w:val="40"/>
                 <w14:shadow w14:blurRad="12700" w14:dist="38100" w14:dir="2700000" w14:sx="100000" w14:sy="100000" w14:kx="0" w14:ky="0" w14:algn="tl">
@@ -551,7 +645,6 @@
             <w:r>
               <w:rPr>
                 <w:rFonts w:ascii="Arial" w:hAnsi="Arial" w:cs="Arial"/>
-                <w:color w:val="000000" w:themeColor="text1"/>
                 <w:sz w:val="40"/>
                 <w:szCs w:val="40"/>
                 <w14:shadow w14:blurRad="12700" w14:dist="38100" w14:dir="2700000" w14:sx="100000" w14:sy="100000" w14:kx="0" w14:ky="0" w14:algn="tl">
@@ -565,7 +658,6 @@
             <w:r>
               <w:rPr>
                 <w:rFonts w:ascii="Arial" w:hAnsi="Arial" w:cs="Arial"/>
-                <w:color w:val="000000" w:themeColor="text1"/>
                 <w:sz w:val="40"/>
                 <w:szCs w:val="40"/>
                 <w14:shadow w14:blurRad="12700" w14:dist="38100" w14:dir="2700000" w14:sx="100000" w14:sy="100000" w14:kx="0" w14:ky="0" w14:algn="tl">
@@ -579,7 +671,6 @@
             <w:r>
               <w:rPr>
                 <w:rFonts w:ascii="Arial" w:hAnsi="Arial" w:cs="Arial"/>
-                <w:color w:val="000000" w:themeColor="text1"/>
                 <w:sz w:val="40"/>
                 <w:szCs w:val="40"/>
                 <w14:shadow w14:blurRad="12700" w14:dist="38100" w14:dir="2700000" w14:sx="100000" w14:sy="100000" w14:kx="0" w14:ky="0" w14:algn="tl">
@@ -593,7 +684,6 @@
             <w:r>
               <w:rPr>
                 <w:rFonts w:ascii="Arial" w:hAnsi="Arial" w:cs="Arial"/>
-                <w:color w:val="000000" w:themeColor="text1"/>
                 <w:sz w:val="40"/>
                 <w:szCs w:val="40"/>
                 <w14:shadow w14:blurRad="12700" w14:dist="38100" w14:dir="2700000" w14:sx="100000" w14:sy="100000" w14:kx="0" w14:ky="0" w14:algn="tl">
@@ -619,7 +709,8 @@
         </w:tc>
         <w:tc>
           <w:tcPr>
-            <w:tcW w:w="3968" w:type="dxa"/>
+            <w:tcW w:w="4146" w:type="dxa"/>
+            <w:gridSpan w:val="2"/>
           </w:tcPr>
           <w:p>
             <w:pPr>
@@ -628,7 +719,6 @@
               <w:jc w:val="center"/>
               <w:rPr>
                 <w:rFonts w:ascii="Arial" w:hAnsi="Arial" w:cs="Arial"/>
-                <w:color w:val="000000" w:themeColor="text1"/>
                 <w:sz w:val="40"/>
                 <w:szCs w:val="40"/>
                 <w14:shadow w14:blurRad="12700" w14:dist="38100" w14:dir="2700000" w14:sx="100000" w14:sy="100000" w14:kx="0" w14:ky="0" w14:algn="tl">
@@ -641,7 +731,6 @@
             <w:r>
               <w:rPr>
                 <w:rFonts w:ascii="Arial" w:hAnsi="Arial" w:cs="Arial"/>
-                <w:color w:val="000000" w:themeColor="text1"/>
                 <w:sz w:val="40"/>
                 <w:szCs w:val="40"/>
                 <w14:shadow w14:blurRad="12700" w14:dist="38100" w14:dir="2700000" w14:sx="100000" w14:sy="100000" w14:kx="0" w14:ky="0" w14:algn="tl">
@@ -655,7 +744,6 @@
             <w:r>
               <w:rPr>
                 <w:rFonts w:ascii="Arial" w:hAnsi="Arial" w:cs="Arial"/>
-                <w:color w:val="000000" w:themeColor="text1"/>
                 <w:sz w:val="40"/>
                 <w:szCs w:val="40"/>
                 <w14:shadow w14:blurRad="12700" w14:dist="38100" w14:dir="2700000" w14:sx="100000" w14:sy="100000" w14:kx="0" w14:ky="0" w14:algn="tl">
@@ -669,7 +757,6 @@
             <w:r>
               <w:rPr>
                 <w:rFonts w:ascii="Arial" w:hAnsi="Arial" w:cs="Arial"/>
-                <w:color w:val="000000" w:themeColor="text1"/>
                 <w:sz w:val="40"/>
                 <w:szCs w:val="40"/>
                 <w14:shadow w14:blurRad="12700" w14:dist="38100" w14:dir="2700000" w14:sx="100000" w14:sy="100000" w14:kx="0" w14:ky="0" w14:algn="tl">
@@ -683,7 +770,6 @@
             <w:r>
               <w:rPr>
                 <w:rFonts w:ascii="Arial" w:hAnsi="Arial" w:cs="Arial"/>
-                <w:color w:val="000000" w:themeColor="text1"/>
                 <w:sz w:val="40"/>
                 <w:szCs w:val="40"/>
                 <w14:shadow w14:blurRad="12700" w14:dist="38100" w14:dir="2700000" w14:sx="100000" w14:sy="100000" w14:kx="0" w14:ky="0" w14:algn="tl">
@@ -697,7 +783,6 @@
             <w:r>
               <w:rPr>
                 <w:rFonts w:ascii="Arial" w:hAnsi="Arial" w:cs="Arial"/>
-                <w:color w:val="000000" w:themeColor="text1"/>
                 <w:sz w:val="40"/>
                 <w:szCs w:val="40"/>
                 <w14:shadow w14:blurRad="12700" w14:dist="38100" w14:dir="2700000" w14:sx="100000" w14:sy="100000" w14:kx="0" w14:ky="0" w14:algn="tl">
@@ -723,7 +808,8 @@
         </w:tc>
         <w:tc>
           <w:tcPr>
-            <w:tcW w:w="3120" w:type="dxa"/>
+            <w:tcW w:w="4146" w:type="dxa"/>
+            <w:gridSpan w:val="2"/>
           </w:tcPr>
           <w:p>
             <w:pPr>
@@ -732,7 +818,6 @@
               <w:jc w:val="center"/>
               <w:rPr>
                 <w:rFonts w:ascii="Arial" w:hAnsi="Arial" w:cs="Arial"/>
-                <w:color w:val="000000" w:themeColor="text1"/>
                 <w:sz w:val="40"/>
                 <w:szCs w:val="40"/>
                 <w14:shadow w14:blurRad="12700" w14:dist="38100" w14:dir="2700000" w14:sx="100000" w14:sy="100000" w14:kx="0" w14:ky="0" w14:algn="tl">
@@ -745,7 +830,6 @@
             <w:r>
               <w:rPr>
                 <w:rFonts w:ascii="Arial" w:hAnsi="Arial" w:cs="Arial"/>
-                <w:color w:val="000000" w:themeColor="text1"/>
                 <w:sz w:val="40"/>
                 <w:szCs w:val="40"/>
                 <w14:shadow w14:blurRad="12700" w14:dist="38100" w14:dir="2700000" w14:sx="100000" w14:sy="100000" w14:kx="0" w14:ky="0" w14:algn="tl">
@@ -759,7 +843,6 @@
             <w:r>
               <w:rPr>
                 <w:rFonts w:ascii="Arial" w:hAnsi="Arial" w:cs="Arial"/>
-                <w:color w:val="000000" w:themeColor="text1"/>
                 <w:sz w:val="40"/>
                 <w:szCs w:val="40"/>
                 <w14:shadow w14:blurRad="12700" w14:dist="38100" w14:dir="2700000" w14:sx="100000" w14:sy="100000" w14:kx="0" w14:ky="0" w14:algn="tl">
@@ -773,7 +856,6 @@
             <w:r>
               <w:rPr>
                 <w:rFonts w:ascii="Arial" w:hAnsi="Arial" w:cs="Arial"/>
-                <w:color w:val="000000" w:themeColor="text1"/>
                 <w:sz w:val="40"/>
                 <w:szCs w:val="40"/>
                 <w14:shadow w14:blurRad="12700" w14:dist="38100" w14:dir="2700000" w14:sx="100000" w14:sy="100000" w14:kx="0" w14:ky="0" w14:algn="tl">
@@ -787,7 +869,6 @@
             <w:r>
               <w:rPr>
                 <w:rFonts w:ascii="Arial" w:hAnsi="Arial" w:cs="Arial"/>
-                <w:color w:val="000000" w:themeColor="text1"/>
                 <w:sz w:val="40"/>
                 <w:szCs w:val="40"/>
                 <w14:shadow w14:blurRad="12700" w14:dist="38100" w14:dir="2700000" w14:sx="100000" w14:sy="100000" w14:kx="0" w14:ky="0" w14:algn="tl">
@@ -801,7 +882,6 @@
             <w:r>
               <w:rPr>
                 <w:rFonts w:ascii="Arial" w:hAnsi="Arial" w:cs="Arial"/>
-                <w:color w:val="000000" w:themeColor="text1"/>
                 <w:sz w:val="40"/>
                 <w:szCs w:val="40"/>
                 <w14:shadow w14:blurRad="12700" w14:dist="38100" w14:dir="2700000" w14:sx="100000" w14:sy="100000" w14:kx="0" w14:ky="0" w14:algn="tl">
@@ -827,7 +907,7 @@
         </w:tc>
         <w:tc>
           <w:tcPr>
-            <w:tcW w:w="4279" w:type="dxa"/>
+            <w:tcW w:w="4147" w:type="dxa"/>
           </w:tcPr>
           <w:p>
             <w:pPr>
@@ -836,7 +916,6 @@
               <w:jc w:val="center"/>
               <w:rPr>
                 <w:rFonts w:ascii="Arial" w:hAnsi="Arial" w:cs="Arial"/>
-                <w:color w:val="000000" w:themeColor="text1"/>
                 <w:sz w:val="40"/>
                 <w:szCs w:val="40"/>
                 <w14:shadow w14:blurRad="12700" w14:dist="38100" w14:dir="2700000" w14:sx="100000" w14:sy="100000" w14:kx="0" w14:ky="0" w14:algn="tl">
@@ -849,7 +928,6 @@
             <w:r>
               <w:rPr>
                 <w:rFonts w:ascii="Arial" w:hAnsi="Arial" w:cs="Arial"/>
-                <w:color w:val="000000" w:themeColor="text1"/>
                 <w:sz w:val="40"/>
                 <w:szCs w:val="40"/>
                 <w14:shadow w14:blurRad="12700" w14:dist="38100" w14:dir="2700000" w14:sx="100000" w14:sy="100000" w14:kx="0" w14:ky="0" w14:algn="tl">
@@ -863,7 +941,6 @@
             <w:r>
               <w:rPr>
                 <w:rFonts w:ascii="Arial" w:hAnsi="Arial" w:cs="Arial"/>
-                <w:color w:val="000000" w:themeColor="text1"/>
                 <w:sz w:val="40"/>
                 <w:szCs w:val="40"/>
                 <w14:shadow w14:blurRad="12700" w14:dist="38100" w14:dir="2700000" w14:sx="100000" w14:sy="100000" w14:kx="0" w14:ky="0" w14:algn="tl">
@@ -877,7 +954,6 @@
             <w:r>
               <w:rPr>
                 <w:rFonts w:ascii="Arial" w:hAnsi="Arial" w:cs="Arial"/>
-                <w:color w:val="000000" w:themeColor="text1"/>
                 <w:sz w:val="40"/>
                 <w:szCs w:val="40"/>
                 <w14:shadow w14:blurRad="12700" w14:dist="38100" w14:dir="2700000" w14:sx="100000" w14:sy="100000" w14:kx="0" w14:ky="0" w14:algn="tl">
@@ -891,7 +967,6 @@
             <w:r>
               <w:rPr>
                 <w:rFonts w:ascii="Arial" w:hAnsi="Arial" w:cs="Arial"/>
-                <w:color w:val="000000" w:themeColor="text1"/>
                 <w:sz w:val="40"/>
                 <w:szCs w:val="40"/>
                 <w14:shadow w14:blurRad="12700" w14:dist="38100" w14:dir="2700000" w14:sx="100000" w14:sy="100000" w14:kx="0" w14:ky="0" w14:algn="tl">
@@ -905,7 +980,6 @@
             <w:r>
               <w:rPr>
                 <w:rFonts w:ascii="Arial" w:hAnsi="Arial" w:cs="Arial"/>
-                <w:color w:val="000000" w:themeColor="text1"/>
                 <w:sz w:val="40"/>
                 <w:szCs w:val="40"/>
                 <w14:shadow w14:blurRad="12700" w14:dist="38100" w14:dir="2700000" w14:sx="100000" w14:sy="100000" w14:kx="0" w14:ky="0" w14:algn="tl">
@@ -932,11 +1006,11 @@
       </w:tr>
       <w:tr>
         <w:trPr>
-          <w:trHeight w:val="1092"/>
+          <w:trHeight w:val="962"/>
         </w:trPr>
         <w:tc>
           <w:tcPr>
-            <w:tcW w:w="4395" w:type="dxa"/>
+            <w:tcW w:w="4146" w:type="dxa"/>
           </w:tcPr>
           <w:p>
             <w:pPr>
@@ -947,7 +1021,6 @@
                 <w:rFonts w:ascii="Arial" w:hAnsi="Arial" w:cs="Arial"/>
                 <w:b/>
                 <w:bCs/>
-                <w:color w:val="00679A"/>
                 <w:sz w:val="40"/>
                 <w:szCs w:val="40"/>
               </w:rPr>
@@ -957,7 +1030,6 @@
                 <w:rFonts w:ascii="Arial" w:hAnsi="Arial" w:cs="Arial"/>
                 <w:b/>
                 <w:bCs/>
-                <w:color w:val="00679A"/>
                 <w:sz w:val="40"/>
                 <w:szCs w:val="40"/>
               </w:rPr>
@@ -967,7 +1039,8 @@
         </w:tc>
         <w:tc>
           <w:tcPr>
-            <w:tcW w:w="3968" w:type="dxa"/>
+            <w:tcW w:w="4146" w:type="dxa"/>
+            <w:gridSpan w:val="2"/>
           </w:tcPr>
           <w:p>
             <w:pPr>
@@ -978,7 +1051,6 @@
                 <w:rFonts w:ascii="Arial" w:hAnsi="Arial" w:cs="Arial"/>
                 <w:b/>
                 <w:bCs/>
-                <w:color w:val="00679A"/>
                 <w:sz w:val="40"/>
                 <w:szCs w:val="40"/>
               </w:rPr>
@@ -988,7 +1060,6 @@
                 <w:rFonts w:ascii="Arial" w:hAnsi="Arial" w:cs="Arial"/>
                 <w:b/>
                 <w:bCs/>
-                <w:color w:val="00679A"/>
                 <w:sz w:val="40"/>
                 <w:szCs w:val="40"/>
               </w:rPr>
@@ -998,7 +1069,8 @@
         </w:tc>
         <w:tc>
           <w:tcPr>
-            <w:tcW w:w="3120" w:type="dxa"/>
+            <w:tcW w:w="4146" w:type="dxa"/>
+            <w:gridSpan w:val="2"/>
           </w:tcPr>
           <w:p>
             <w:pPr>
@@ -1009,7 +1081,6 @@
                 <w:rFonts w:ascii="Arial" w:hAnsi="Arial" w:cs="Arial"/>
                 <w:b/>
                 <w:bCs/>
-                <w:color w:val="00679A"/>
                 <w:sz w:val="40"/>
                 <w:szCs w:val="40"/>
               </w:rPr>
@@ -1019,7 +1090,6 @@
                 <w:rFonts w:ascii="Arial" w:hAnsi="Arial" w:cs="Arial"/>
                 <w:b/>
                 <w:bCs/>
-                <w:color w:val="00679A"/>
                 <w:sz w:val="40"/>
                 <w:szCs w:val="40"/>
               </w:rPr>
@@ -1029,7 +1099,7 @@
         </w:tc>
         <w:tc>
           <w:tcPr>
-            <w:tcW w:w="4279" w:type="dxa"/>
+            <w:tcW w:w="4147" w:type="dxa"/>
           </w:tcPr>
           <w:p>
             <w:pPr>
@@ -1040,7 +1110,6 @@
                 <w:rFonts w:ascii="Arial" w:hAnsi="Arial" w:cs="Arial"/>
                 <w:b/>
                 <w:bCs/>
-                <w:color w:val="00679A"/>
                 <w:sz w:val="40"/>
                 <w:szCs w:val="40"/>
               </w:rPr>
@@ -1050,7 +1119,6 @@
                 <w:rFonts w:ascii="Arial" w:hAnsi="Arial" w:cs="Arial"/>
                 <w:b/>
                 <w:bCs/>
-                <w:color w:val="00679A"/>
                 <w:sz w:val="40"/>
                 <w:szCs w:val="40"/>
               </w:rPr>
@@ -1070,7 +1138,7 @@
     <w:sectPr>
       <w:footerReference w:type="default" r:id="rId10"/>
       <w:pgSz w:w="16838" w:h="11906" w:orient="landscape" w:code="9"/>
-      <w:pgMar w:top="340" w:right="357" w:bottom="340" w:left="709" w:header="862" w:footer="303" w:gutter="0"/>
+      <w:pgMar w:top="56" w:right="357" w:bottom="0" w:left="709" w:header="862" w:footer="303" w:gutter="0"/>
       <w:cols w:space="720"/>
       <w:titlePg/>
       <w:docGrid w:linePitch="360"/>

</xml_diff>

<commit_message>
feat: actualizar reporte print paleta
</commit_message>
<xml_diff>
--- a/chancado/analytica/Report/PrintPaleta.docx
+++ b/chancado/analytica/Report/PrintPaleta.docx
@@ -2,10 +2,201 @@
 <file path=word/document.xml><?xml version="1.0" encoding="utf-8"?>
 <w:document xmlns:wpc="http://schemas.microsoft.com/office/word/2010/wordprocessingCanvas" xmlns:cx="http://schemas.microsoft.com/office/drawing/2014/chartex" xmlns:cx1="http://schemas.microsoft.com/office/drawing/2015/9/8/chartex" xmlns:cx2="http://schemas.microsoft.com/office/drawing/2015/10/21/chartex" xmlns:cx3="http://schemas.microsoft.com/office/drawing/2016/5/9/chartex" xmlns:cx4="http://schemas.microsoft.com/office/drawing/2016/5/10/chartex" xmlns:cx5="http://schemas.microsoft.com/office/drawing/2016/5/11/chartex" xmlns:cx6="http://schemas.microsoft.com/office/drawing/2016/5/12/chartex" xmlns:cx7="http://schemas.microsoft.com/office/drawing/2016/5/13/chartex" xmlns:cx8="http://schemas.microsoft.com/office/drawing/2016/5/14/chartex" xmlns:mc="http://schemas.openxmlformats.org/markup-compatibility/2006" xmlns:aink="http://schemas.microsoft.com/office/drawing/2016/ink" xmlns:am3d="http://schemas.microsoft.com/office/drawing/2017/model3d" xmlns:o="urn:schemas-microsoft-com:office:office" xmlns:oel="http://schemas.microsoft.com/office/2019/extlst" xmlns:r="http://schemas.openxmlformats.org/officeDocument/2006/relationships" xmlns:m="http://schemas.openxmlformats.org/officeDocument/2006/math" xmlns:v="urn:schemas-microsoft-com:vml" xmlns:wp14="http://schemas.microsoft.com/office/word/2010/wordprocessingDrawing" xmlns:wp="http://schemas.openxmlformats.org/drawingml/2006/wordprocessingDrawing" xmlns:w10="urn:schemas-microsoft-com:office:word" xmlns:w="http://schemas.openxmlformats.org/wordprocessingml/2006/main" xmlns:w14="http://schemas.microsoft.com/office/word/2010/wordml" xmlns:w15="http://schemas.microsoft.com/office/word/2012/wordml" xmlns:w16cex="http://schemas.microsoft.com/office/word/2018/wordml/cex" xmlns:w16cid="http://schemas.microsoft.com/office/word/2016/wordml/cid" xmlns:w16="http://schemas.microsoft.com/office/word/2018/wordml" xmlns:w16du="http://schemas.microsoft.com/office/word/2023/wordml/word16du" xmlns:w16sdtdh="http://schemas.microsoft.com/office/word/2020/wordml/sdtdatahash" xmlns:w16sdtfl="http://schemas.microsoft.com/office/word/2024/wordml/sdtformatlock" xmlns:w16se="http://schemas.microsoft.com/office/word/2015/wordml/symex" xmlns:wpg="http://schemas.microsoft.com/office/word/2010/wordprocessingGroup" xmlns:wpi="http://schemas.microsoft.com/office/word/2010/wordprocessingInk" xmlns:wne="http://schemas.microsoft.com/office/word/2006/wordml" xmlns:wps="http://schemas.microsoft.com/office/word/2010/wordprocessingShape" mc:Ignorable="w14 w15 w16se w16cid w16 w16cex w16sdtdh w16sdtfl w16du wp14">
   <w:body>
-    <w:p/>
+    <w:p>
+      <w:r>
+        <w:rPr>
+          <w:noProof/>
+        </w:rPr>
+        <mc:AlternateContent>
+          <mc:Choice Requires="wps">
+            <w:drawing>
+              <wp:anchor distT="0" distB="0" distL="114300" distR="114300" simplePos="0" relativeHeight="251679744" behindDoc="0" locked="0" layoutInCell="1" allowOverlap="1" wp14:anchorId="59435B1C" wp14:editId="4732C3AB">
+                <wp:simplePos x="0" y="0"/>
+                <wp:positionH relativeFrom="margin">
+                  <wp:posOffset>6739642</wp:posOffset>
+                </wp:positionH>
+                <wp:positionV relativeFrom="paragraph">
+                  <wp:posOffset>4362</wp:posOffset>
+                </wp:positionV>
+                <wp:extent cx="3589655" cy="3208655"/>
+                <wp:effectExtent l="0" t="0" r="0" b="0"/>
+                <wp:wrapNone/>
+                <wp:docPr id="1729424235" name="Rectángulo: esquinas redondeadas 1729424235"/>
+                <wp:cNvGraphicFramePr>
+                  <a:graphicFrameLocks xmlns:a="http://schemas.openxmlformats.org/drawingml/2006/main"/>
+                </wp:cNvGraphicFramePr>
+                <a:graphic xmlns:a="http://schemas.openxmlformats.org/drawingml/2006/main">
+                  <a:graphicData uri="http://schemas.microsoft.com/office/word/2010/wordprocessingShape">
+                    <wps:wsp>
+                      <wps:cNvSpPr>
+                        <a:spLocks noChangeArrowheads="1"/>
+                      </wps:cNvSpPr>
+                      <wps:spPr bwMode="auto">
+                        <a:xfrm>
+                          <a:off x="0" y="0"/>
+                          <a:ext cx="3589655" cy="3208655"/>
+                        </a:xfrm>
+                        <a:prstGeom prst="roundRect">
+                          <a:avLst>
+                            <a:gd name="adj" fmla="val 16667"/>
+                          </a:avLst>
+                        </a:prstGeom>
+                        <a:noFill/>
+                        <a:ln w="9525">
+                          <a:noFill/>
+                          <a:miter lim="800000"/>
+                          <a:headEnd/>
+                          <a:tailEnd/>
+                        </a:ln>
+                      </wps:spPr>
+                      <wps:txbx>
+                        <w:txbxContent>
+                          <w:p>
+                            <w:pPr>
+                              <w:jc w:val="center"/>
+                              <w:rPr>
+                                <w:u w:val="single"/>
+                              </w:rPr>
+                            </w:pPr>
+                            <w:r>
+                              <w:rPr>
+                                <w:rFonts w:ascii="Arial" w:eastAsia="Arial Unicode MS" w:hAnsi="Arial"/>
+                                <w:sz w:val="18"/>
+                                <w:szCs w:val="18"/>
+                                <w:u w:val="single"/>
+                              </w:rPr>
+                              <w:fldChar w:fldCharType="begin"/>
+                            </w:r>
+                            <w:r>
+                              <w:rPr>
+                                <w:rFonts w:ascii="Arial" w:eastAsia="Arial Unicode MS" w:hAnsi="Arial"/>
+                                <w:sz w:val="18"/>
+                                <w:szCs w:val="18"/>
+                                <w:u w:val="single"/>
+                              </w:rPr>
+                              <w:instrText xml:space="preserve"> MERGEFIELD  Image:imagenQr  \* MERGEFORMAT </w:instrText>
+                            </w:r>
+                            <w:r>
+                              <w:rPr>
+                                <w:rFonts w:ascii="Arial" w:eastAsia="Arial Unicode MS" w:hAnsi="Arial"/>
+                                <w:sz w:val="18"/>
+                                <w:szCs w:val="18"/>
+                                <w:u w:val="single"/>
+                              </w:rPr>
+                              <w:fldChar w:fldCharType="separate"/>
+                            </w:r>
+                            <w:r>
+                              <w:rPr>
+                                <w:rFonts w:ascii="Arial" w:eastAsia="Arial Unicode MS" w:hAnsi="Arial"/>
+                                <w:noProof/>
+                                <w:sz w:val="18"/>
+                                <w:szCs w:val="18"/>
+                                <w:u w:val="single"/>
+                              </w:rPr>
+                              <w:t>«Image:imagenQr»</w:t>
+                            </w:r>
+                            <w:r>
+                              <w:rPr>
+                                <w:rFonts w:ascii="Arial" w:eastAsia="Arial Unicode MS" w:hAnsi="Arial"/>
+                                <w:sz w:val="18"/>
+                                <w:szCs w:val="18"/>
+                                <w:u w:val="single"/>
+                              </w:rPr>
+                              <w:fldChar w:fldCharType="end"/>
+                            </w:r>
+                          </w:p>
+                          <w:p/>
+                        </w:txbxContent>
+                      </wps:txbx>
+                      <wps:bodyPr rot="0" vertOverflow="clip" horzOverflow="clip" vert="horz" wrap="square" lIns="91440" tIns="45720" rIns="91440" bIns="45720" anchor="t" anchorCtr="0" upright="1">
+                        <a:noAutofit/>
+                      </wps:bodyPr>
+                    </wps:wsp>
+                  </a:graphicData>
+                </a:graphic>
+                <wp14:sizeRelH relativeFrom="margin">
+                  <wp14:pctWidth>0</wp14:pctWidth>
+                </wp14:sizeRelH>
+                <wp14:sizeRelV relativeFrom="margin">
+                  <wp14:pctHeight>0</wp14:pctHeight>
+                </wp14:sizeRelV>
+              </wp:anchor>
+            </w:drawing>
+          </mc:Choice>
+          <mc:Fallback>
+            <w:pict>
+              <v:roundrect w14:anchorId="59435B1C" id="Rectángulo: esquinas redondeadas 1729424235" o:spid="_x0000_s1026" style="position:absolute;margin-left:530.7pt;margin-top:.35pt;width:282.65pt;height:252.65pt;z-index:251679744;visibility:visible;mso-wrap-style:square;mso-width-percent:0;mso-height-percent:0;mso-wrap-distance-left:9pt;mso-wrap-distance-top:0;mso-wrap-distance-right:9pt;mso-wrap-distance-bottom:0;mso-position-horizontal:absolute;mso-position-horizontal-relative:margin;mso-position-vertical:absolute;mso-position-vertical-relative:text;mso-width-percent:0;mso-height-percent:0;mso-width-relative:margin;mso-height-relative:margin;v-text-anchor:top" arcsize="10923f" o:gfxdata="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" filled="f" stroked="f">
+                <v:stroke joinstyle="miter"/>
+                <v:textbox>
+                  <w:txbxContent>
+                    <w:p>
+                      <w:pPr>
+                        <w:jc w:val="center"/>
+                        <w:rPr>
+                          <w:u w:val="single"/>
+                        </w:rPr>
+                      </w:pPr>
+                      <w:r>
+                        <w:rPr>
+                          <w:rFonts w:ascii="Arial" w:eastAsia="Arial Unicode MS" w:hAnsi="Arial"/>
+                          <w:sz w:val="18"/>
+                          <w:szCs w:val="18"/>
+                          <w:u w:val="single"/>
+                        </w:rPr>
+                        <w:fldChar w:fldCharType="begin"/>
+                      </w:r>
+                      <w:r>
+                        <w:rPr>
+                          <w:rFonts w:ascii="Arial" w:eastAsia="Arial Unicode MS" w:hAnsi="Arial"/>
+                          <w:sz w:val="18"/>
+                          <w:szCs w:val="18"/>
+                          <w:u w:val="single"/>
+                        </w:rPr>
+                        <w:instrText xml:space="preserve"> MERGEFIELD  Image:imagenQr  \* MERGEFORMAT </w:instrText>
+                      </w:r>
+                      <w:r>
+                        <w:rPr>
+                          <w:rFonts w:ascii="Arial" w:eastAsia="Arial Unicode MS" w:hAnsi="Arial"/>
+                          <w:sz w:val="18"/>
+                          <w:szCs w:val="18"/>
+                          <w:u w:val="single"/>
+                        </w:rPr>
+                        <w:fldChar w:fldCharType="separate"/>
+                      </w:r>
+                      <w:r>
+                        <w:rPr>
+                          <w:rFonts w:ascii="Arial" w:eastAsia="Arial Unicode MS" w:hAnsi="Arial"/>
+                          <w:noProof/>
+                          <w:sz w:val="18"/>
+                          <w:szCs w:val="18"/>
+                          <w:u w:val="single"/>
+                        </w:rPr>
+                        <w:t>«Image:imagenQr»</w:t>
+                      </w:r>
+                      <w:r>
+                        <w:rPr>
+                          <w:rFonts w:ascii="Arial" w:eastAsia="Arial Unicode MS" w:hAnsi="Arial"/>
+                          <w:sz w:val="18"/>
+                          <w:szCs w:val="18"/>
+                          <w:u w:val="single"/>
+                        </w:rPr>
+                        <w:fldChar w:fldCharType="end"/>
+                      </w:r>
+                    </w:p>
+                    <w:p/>
+                  </w:txbxContent>
+                </v:textbox>
+                <w10:wrap anchorx="margin"/>
+              </v:roundrect>
+            </w:pict>
+          </mc:Fallback>
+        </mc:AlternateContent>
+      </w:r>
+    </w:p>
     <w:tbl>
       <w:tblPr>
         <w:tblW w:w="5000" w:type="pct"/>
+        <w:tblInd w:w="-284" w:type="dxa"/>
         <w:tblLayout w:type="fixed"/>
         <w:tblCellMar>
           <w:left w:w="0" w:type="dxa"/>
@@ -16,10 +207,10 @@
       </w:tblPr>
       <w:tblGrid>
         <w:gridCol w:w="2974"/>
-        <w:gridCol w:w="3404"/>
-        <w:gridCol w:w="2836"/>
-        <w:gridCol w:w="2555"/>
-        <w:gridCol w:w="4003"/>
+        <w:gridCol w:w="3123"/>
+        <w:gridCol w:w="3546"/>
+        <w:gridCol w:w="2833"/>
+        <w:gridCol w:w="3296"/>
       </w:tblGrid>
       <w:tr>
         <w:trPr>
@@ -31,6 +222,9 @@
           </w:tcPr>
           <w:p>
             <w:r>
+              <w:rPr>
+                <w:noProof/>
+              </w:rPr>
               <mc:AlternateContent>
                 <mc:Choice Requires="wps">
                   <w:drawing>
@@ -202,7 +396,7 @@
         </w:tc>
         <w:tc>
           <w:tcPr>
-            <w:tcW w:w="2788" w:type="pct"/>
+            <w:tcW w:w="3012" w:type="pct"/>
             <w:gridSpan w:val="3"/>
           </w:tcPr>
           <w:p>
@@ -210,65 +404,47 @@
               <w:jc w:val="center"/>
               <w:rPr>
                 <w:rFonts w:ascii="Aptos Black" w:hAnsi="Aptos Black"/>
-                <w:sz w:val="240"/>
-                <w:szCs w:val="240"/>
+                <w:sz w:val="300"/>
+                <w:szCs w:val="300"/>
               </w:rPr>
             </w:pPr>
             <w:r>
               <w:rPr>
                 <w:rFonts w:ascii="Aptos Black" w:hAnsi="Aptos Black"/>
-                <w:sz w:val="240"/>
-                <w:szCs w:val="240"/>
+                <w:sz w:val="300"/>
+                <w:szCs w:val="300"/>
               </w:rPr>
               <w:fldChar w:fldCharType="begin"/>
             </w:r>
             <w:r>
               <w:rPr>
                 <w:rFonts w:ascii="Aptos Black" w:hAnsi="Aptos Black"/>
-                <w:sz w:val="240"/>
-                <w:szCs w:val="240"/>
+                <w:sz w:val="300"/>
+                <w:szCs w:val="300"/>
               </w:rPr>
               <w:instrText xml:space="preserve"> MERGEFIELD  nro  \* MERGEFORMAT </w:instrText>
             </w:r>
             <w:r>
               <w:rPr>
                 <w:rFonts w:ascii="Aptos Black" w:hAnsi="Aptos Black"/>
-                <w:sz w:val="240"/>
-                <w:szCs w:val="240"/>
+                <w:sz w:val="300"/>
+                <w:szCs w:val="300"/>
               </w:rPr>
               <w:fldChar w:fldCharType="separate"/>
             </w:r>
             <w:r>
               <w:rPr>
                 <w:rFonts w:ascii="Aptos Black" w:hAnsi="Aptos Black"/>
-                <w:sz w:val="240"/>
-                <w:szCs w:val="240"/>
-              </w:rPr>
-              <w:t>«</w:t>
-            </w:r>
-            <w:proofErr w:type="spellStart"/>
-            <w:r>
-              <w:rPr>
-                <w:rFonts w:ascii="Aptos Black" w:hAnsi="Aptos Black"/>
-                <w:sz w:val="240"/>
-                <w:szCs w:val="240"/>
-              </w:rPr>
-              <w:t>nro</w:t>
-            </w:r>
-            <w:proofErr w:type="spellEnd"/>
-            <w:r>
-              <w:rPr>
-                <w:rFonts w:ascii="Aptos Black" w:hAnsi="Aptos Black"/>
-                <w:sz w:val="240"/>
-                <w:szCs w:val="240"/>
-              </w:rPr>
-              <w:t>»</w:t>
-            </w:r>
-            <w:r>
-              <w:rPr>
-                <w:rFonts w:ascii="Aptos Black" w:hAnsi="Aptos Black"/>
-                <w:sz w:val="240"/>
-                <w:szCs w:val="240"/>
+                <w:sz w:val="300"/>
+                <w:szCs w:val="300"/>
+              </w:rPr>
+              <w:t>«nro»</w:t>
+            </w:r>
+            <w:r>
+              <w:rPr>
+                <w:rFonts w:ascii="Aptos Black" w:hAnsi="Aptos Black"/>
+                <w:sz w:val="300"/>
+                <w:szCs w:val="300"/>
               </w:rPr>
               <w:fldChar w:fldCharType="end"/>
             </w:r>
@@ -276,197 +452,10 @@
         </w:tc>
         <w:tc>
           <w:tcPr>
-            <w:tcW w:w="1269" w:type="pct"/>
+            <w:tcW w:w="1045" w:type="pct"/>
             <w:vAlign w:val="center"/>
           </w:tcPr>
-          <w:p>
-            <w:r>
-              <mc:AlternateContent>
-                <mc:Choice Requires="wps">
-                  <w:drawing>
-                    <wp:anchor distT="0" distB="0" distL="114300" distR="114300" simplePos="0" relativeHeight="251679744" behindDoc="0" locked="0" layoutInCell="1" allowOverlap="1" wp14:anchorId="59435B1C" wp14:editId="21F67F5A">
-                      <wp:simplePos x="0" y="0"/>
-                      <wp:positionH relativeFrom="margin">
-                        <wp:posOffset>-860425</wp:posOffset>
-                      </wp:positionH>
-                      <wp:positionV relativeFrom="paragraph">
-                        <wp:posOffset>33655</wp:posOffset>
-                      </wp:positionV>
-                      <wp:extent cx="3589655" cy="3208655"/>
-                      <wp:effectExtent l="0" t="0" r="0" b="0"/>
-                      <wp:wrapNone/>
-                      <wp:docPr id="1729424235" name="Rectángulo: esquinas redondeadas 1729424235"/>
-                      <wp:cNvGraphicFramePr>
-                        <a:graphicFrameLocks xmlns:a="http://schemas.openxmlformats.org/drawingml/2006/main"/>
-                      </wp:cNvGraphicFramePr>
-                      <a:graphic xmlns:a="http://schemas.openxmlformats.org/drawingml/2006/main">
-                        <a:graphicData uri="http://schemas.microsoft.com/office/word/2010/wordprocessingShape">
-                          <wps:wsp>
-                            <wps:cNvSpPr>
-                              <a:spLocks noChangeArrowheads="1"/>
-                            </wps:cNvSpPr>
-                            <wps:spPr bwMode="auto">
-                              <a:xfrm>
-                                <a:off x="0" y="0"/>
-                                <a:ext cx="3589655" cy="3208655"/>
-                              </a:xfrm>
-                              <a:prstGeom prst="roundRect">
-                                <a:avLst>
-                                  <a:gd name="adj" fmla="val 16667"/>
-                                </a:avLst>
-                              </a:prstGeom>
-                              <a:noFill/>
-                              <a:ln w="9525">
-                                <a:noFill/>
-                                <a:miter lim="800000"/>
-                                <a:headEnd/>
-                                <a:tailEnd/>
-                              </a:ln>
-                            </wps:spPr>
-                            <wps:txbx>
-                              <w:txbxContent>
-                                <w:p>
-                                  <w:pPr>
-                                    <w:jc w:val="center"/>
-                                    <w:rPr>
-                                      <w:u w:val="single"/>
-                                    </w:rPr>
-                                  </w:pPr>
-                                  <w:r>
-                                    <w:rPr>
-                                      <w:rFonts w:ascii="Arial" w:eastAsia="Arial Unicode MS" w:hAnsi="Arial"/>
-                                      <w:sz w:val="18"/>
-                                      <w:szCs w:val="18"/>
-                                      <w:u w:val="single"/>
-                                    </w:rPr>
-                                    <w:fldChar w:fldCharType="begin"/>
-                                  </w:r>
-                                  <w:r>
-                                    <w:rPr>
-                                      <w:rFonts w:ascii="Arial" w:eastAsia="Arial Unicode MS" w:hAnsi="Arial"/>
-                                      <w:sz w:val="18"/>
-                                      <w:szCs w:val="18"/>
-                                      <w:u w:val="single"/>
-                                    </w:rPr>
-                                    <w:instrText xml:space="preserve"> MERGEFIELD  Image:imagenQr  \* MERGEFORMAT </w:instrText>
-                                  </w:r>
-                                  <w:r>
-                                    <w:rPr>
-                                      <w:rFonts w:ascii="Arial" w:eastAsia="Arial Unicode MS" w:hAnsi="Arial"/>
-                                      <w:sz w:val="18"/>
-                                      <w:szCs w:val="18"/>
-                                      <w:u w:val="single"/>
-                                    </w:rPr>
-                                    <w:fldChar w:fldCharType="separate"/>
-                                  </w:r>
-                                  <w:r>
-                                    <w:rPr>
-                                      <w:rFonts w:ascii="Arial" w:eastAsia="Arial Unicode MS" w:hAnsi="Arial"/>
-                                      <w:noProof/>
-                                      <w:sz w:val="18"/>
-                                      <w:szCs w:val="18"/>
-                                      <w:u w:val="single"/>
-                                    </w:rPr>
-                                    <w:t>«Image:imagenQr»</w:t>
-                                  </w:r>
-                                  <w:r>
-                                    <w:rPr>
-                                      <w:rFonts w:ascii="Arial" w:eastAsia="Arial Unicode MS" w:hAnsi="Arial"/>
-                                      <w:sz w:val="18"/>
-                                      <w:szCs w:val="18"/>
-                                      <w:u w:val="single"/>
-                                    </w:rPr>
-                                    <w:fldChar w:fldCharType="end"/>
-                                  </w:r>
-                                </w:p>
-                                <w:p/>
-                              </w:txbxContent>
-                            </wps:txbx>
-                            <wps:bodyPr rot="0" vertOverflow="clip" horzOverflow="clip" vert="horz" wrap="square" lIns="91440" tIns="45720" rIns="91440" bIns="45720" anchor="t" anchorCtr="0" upright="1">
-                              <a:noAutofit/>
-                            </wps:bodyPr>
-                          </wps:wsp>
-                        </a:graphicData>
-                      </a:graphic>
-                      <wp14:sizeRelH relativeFrom="margin">
-                        <wp14:pctWidth>0</wp14:pctWidth>
-                      </wp14:sizeRelH>
-                      <wp14:sizeRelV relativeFrom="margin">
-                        <wp14:pctHeight>0</wp14:pctHeight>
-                      </wp14:sizeRelV>
-                    </wp:anchor>
-                  </w:drawing>
-                </mc:Choice>
-                <mc:Fallback>
-                  <w:pict>
-                    <v:roundrect w14:anchorId="59435B1C" id="Rectángulo: esquinas redondeadas 1729424235" o:spid="_x0000_s1027" style="position:absolute;margin-left:-67.75pt;margin-top:2.65pt;width:282.65pt;height:252.65pt;z-index:251679744;visibility:visible;mso-wrap-style:square;mso-width-percent:0;mso-height-percent:0;mso-wrap-distance-left:9pt;mso-wrap-distance-top:0;mso-wrap-distance-right:9pt;mso-wrap-distance-bottom:0;mso-position-horizontal:absolute;mso-position-horizontal-relative:margin;mso-position-vertical:absolute;mso-position-vertical-relative:text;mso-width-percent:0;mso-height-percent:0;mso-width-relative:margin;mso-height-relative:margin;v-text-anchor:top" arcsize="10923f" o:gfxdata="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" filled="f" stroked="f">
-                      <v:stroke joinstyle="miter"/>
-                      <v:textbox>
-                        <w:txbxContent>
-                          <w:p>
-                            <w:pPr>
-                              <w:jc w:val="center"/>
-                              <w:rPr>
-                                <w:u w:val="single"/>
-                              </w:rPr>
-                            </w:pPr>
-                            <w:r>
-                              <w:rPr>
-                                <w:rFonts w:ascii="Arial" w:eastAsia="Arial Unicode MS" w:hAnsi="Arial"/>
-                                <w:sz w:val="18"/>
-                                <w:szCs w:val="18"/>
-                                <w:u w:val="single"/>
-                              </w:rPr>
-                              <w:fldChar w:fldCharType="begin"/>
-                            </w:r>
-                            <w:r>
-                              <w:rPr>
-                                <w:rFonts w:ascii="Arial" w:eastAsia="Arial Unicode MS" w:hAnsi="Arial"/>
-                                <w:sz w:val="18"/>
-                                <w:szCs w:val="18"/>
-                                <w:u w:val="single"/>
-                              </w:rPr>
-                              <w:instrText xml:space="preserve"> MERGEFIELD  Image:imagenQr  \* MERGEFORMAT </w:instrText>
-                            </w:r>
-                            <w:r>
-                              <w:rPr>
-                                <w:rFonts w:ascii="Arial" w:eastAsia="Arial Unicode MS" w:hAnsi="Arial"/>
-                                <w:sz w:val="18"/>
-                                <w:szCs w:val="18"/>
-                                <w:u w:val="single"/>
-                              </w:rPr>
-                              <w:fldChar w:fldCharType="separate"/>
-                            </w:r>
-                            <w:r>
-                              <w:rPr>
-                                <w:rFonts w:ascii="Arial" w:eastAsia="Arial Unicode MS" w:hAnsi="Arial"/>
-                                <w:noProof/>
-                                <w:sz w:val="18"/>
-                                <w:szCs w:val="18"/>
-                                <w:u w:val="single"/>
-                              </w:rPr>
-                              <w:t>«Image:imagenQr»</w:t>
-                            </w:r>
-                            <w:r>
-                              <w:rPr>
-                                <w:rFonts w:ascii="Arial" w:eastAsia="Arial Unicode MS" w:hAnsi="Arial"/>
-                                <w:sz w:val="18"/>
-                                <w:szCs w:val="18"/>
-                                <w:u w:val="single"/>
-                              </w:rPr>
-                              <w:fldChar w:fldCharType="end"/>
-                            </w:r>
-                          </w:p>
-                          <w:p/>
-                        </w:txbxContent>
-                      </v:textbox>
-                      <w10:wrap anchorx="margin"/>
-                    </v:roundrect>
-                  </w:pict>
-                </mc:Fallback>
-              </mc:AlternateContent>
-            </w:r>
-          </w:p>
+          <w:p/>
         </w:tc>
       </w:tr>
       <w:tr>
@@ -483,47 +472,47 @@
               <w:jc w:val="center"/>
               <w:rPr>
                 <w:rFonts w:ascii="Aptos Black" w:hAnsi="Aptos Black"/>
-                <w:sz w:val="440"/>
-                <w:szCs w:val="440"/>
+                <w:sz w:val="420"/>
+                <w:szCs w:val="420"/>
               </w:rPr>
             </w:pPr>
             <w:r>
               <w:rPr>
                 <w:rFonts w:ascii="Aptos Black" w:hAnsi="Aptos Black"/>
-                <w:sz w:val="440"/>
-                <w:szCs w:val="440"/>
+                <w:sz w:val="420"/>
+                <w:szCs w:val="420"/>
               </w:rPr>
               <w:fldChar w:fldCharType="begin"/>
             </w:r>
             <w:r>
               <w:rPr>
                 <w:rFonts w:ascii="Aptos Black" w:hAnsi="Aptos Black"/>
-                <w:sz w:val="440"/>
-                <w:szCs w:val="440"/>
+                <w:sz w:val="420"/>
+                <w:szCs w:val="420"/>
               </w:rPr>
               <w:instrText xml:space="preserve"> MERGEFIELD  corre  \* MERGEFORMAT </w:instrText>
             </w:r>
             <w:r>
               <w:rPr>
                 <w:rFonts w:ascii="Aptos Black" w:hAnsi="Aptos Black"/>
-                <w:sz w:val="440"/>
-                <w:szCs w:val="440"/>
+                <w:sz w:val="420"/>
+                <w:szCs w:val="420"/>
               </w:rPr>
               <w:fldChar w:fldCharType="separate"/>
             </w:r>
             <w:r>
               <w:rPr>
                 <w:rFonts w:ascii="Aptos Black" w:hAnsi="Aptos Black"/>
-                <w:sz w:val="440"/>
-                <w:szCs w:val="440"/>
+                <w:sz w:val="420"/>
+                <w:szCs w:val="420"/>
               </w:rPr>
               <w:t>«corre»</w:t>
             </w:r>
             <w:r>
               <w:rPr>
                 <w:rFonts w:ascii="Aptos Black" w:hAnsi="Aptos Black"/>
-                <w:sz w:val="440"/>
-                <w:szCs w:val="440"/>
+                <w:sz w:val="420"/>
+                <w:szCs w:val="420"/>
               </w:rPr>
               <w:fldChar w:fldCharType="end"/>
             </w:r>
@@ -532,7 +521,7 @@
       </w:tr>
       <w:tr>
         <w:trPr>
-          <w:trHeight w:val="805"/>
+          <w:trHeight w:val="793"/>
         </w:trPr>
         <w:tc>
           <w:tcPr>
@@ -542,16 +531,14 @@
             <w:pPr>
               <w:jc w:val="center"/>
               <w:rPr>
-                <w:b/>
-                <w:bCs/>
+                <w:rFonts w:ascii="Aptos Black" w:hAnsi="Aptos Black"/>
                 <w:sz w:val="56"/>
                 <w:szCs w:val="56"/>
               </w:rPr>
             </w:pPr>
             <w:r>
               <w:rPr>
-                <w:b/>
-                <w:bCs/>
+                <w:rFonts w:ascii="Aptos Black" w:hAnsi="Aptos Black"/>
                 <w:sz w:val="56"/>
                 <w:szCs w:val="56"/>
               </w:rPr>
@@ -559,8 +546,7 @@
             </w:r>
             <w:r>
               <w:rPr>
-                <w:b/>
-                <w:bCs/>
+                <w:rFonts w:ascii="Aptos Black" w:hAnsi="Aptos Black"/>
                 <w:sz w:val="56"/>
                 <w:szCs w:val="56"/>
               </w:rPr>
@@ -568,8 +554,7 @@
             </w:r>
             <w:r>
               <w:rPr>
-                <w:b/>
-                <w:bCs/>
+                <w:rFonts w:ascii="Aptos Black" w:hAnsi="Aptos Black"/>
                 <w:sz w:val="56"/>
                 <w:szCs w:val="56"/>
               </w:rPr>
@@ -577,8 +562,7 @@
             </w:r>
             <w:r>
               <w:rPr>
-                <w:b/>
-                <w:bCs/>
+                <w:rFonts w:ascii="Aptos Black" w:hAnsi="Aptos Black"/>
                 <w:sz w:val="56"/>
                 <w:szCs w:val="56"/>
               </w:rPr>
@@ -586,8 +570,7 @@
             </w:r>
             <w:r>
               <w:rPr>
-                <w:b/>
-                <w:bCs/>
+                <w:rFonts w:ascii="Aptos Black" w:hAnsi="Aptos Black"/>
                 <w:sz w:val="56"/>
                 <w:szCs w:val="56"/>
               </w:rPr>
@@ -597,22 +580,20 @@
         </w:tc>
         <w:tc>
           <w:tcPr>
-            <w:tcW w:w="1079" w:type="pct"/>
+            <w:tcW w:w="990" w:type="pct"/>
           </w:tcPr>
           <w:p>
             <w:pPr>
               <w:jc w:val="center"/>
               <w:rPr>
-                <w:b/>
-                <w:bCs/>
+                <w:rFonts w:ascii="Aptos Black" w:hAnsi="Aptos Black"/>
                 <w:sz w:val="56"/>
                 <w:szCs w:val="56"/>
               </w:rPr>
             </w:pPr>
             <w:r>
               <w:rPr>
-                <w:b/>
-                <w:bCs/>
+                <w:rFonts w:ascii="Aptos Black" w:hAnsi="Aptos Black"/>
                 <w:sz w:val="56"/>
                 <w:szCs w:val="56"/>
               </w:rPr>
@@ -620,8 +601,7 @@
             </w:r>
             <w:r>
               <w:rPr>
-                <w:b/>
-                <w:bCs/>
+                <w:rFonts w:ascii="Aptos Black" w:hAnsi="Aptos Black"/>
                 <w:sz w:val="56"/>
                 <w:szCs w:val="56"/>
               </w:rPr>
@@ -629,8 +609,7 @@
             </w:r>
             <w:r>
               <w:rPr>
-                <w:b/>
-                <w:bCs/>
+                <w:rFonts w:ascii="Aptos Black" w:hAnsi="Aptos Black"/>
                 <w:sz w:val="56"/>
                 <w:szCs w:val="56"/>
               </w:rPr>
@@ -638,37 +617,15 @@
             </w:r>
             <w:r>
               <w:rPr>
-                <w:b/>
-                <w:bCs/>
-                <w:sz w:val="56"/>
-                <w:szCs w:val="56"/>
-              </w:rPr>
-              <w:t>«</w:t>
-            </w:r>
-            <w:proofErr w:type="spellStart"/>
-            <w:r>
-              <w:rPr>
-                <w:b/>
-                <w:bCs/>
-                <w:sz w:val="56"/>
-                <w:szCs w:val="56"/>
-              </w:rPr>
-              <w:t>tmh</w:t>
-            </w:r>
-            <w:proofErr w:type="spellEnd"/>
-            <w:r>
-              <w:rPr>
-                <w:b/>
-                <w:bCs/>
-                <w:sz w:val="56"/>
-                <w:szCs w:val="56"/>
-              </w:rPr>
-              <w:t>»</w:t>
-            </w:r>
-            <w:r>
-              <w:rPr>
-                <w:b/>
-                <w:bCs/>
+                <w:rFonts w:ascii="Aptos Black" w:hAnsi="Aptos Black"/>
+                <w:sz w:val="56"/>
+                <w:szCs w:val="56"/>
+              </w:rPr>
+              <w:t>«tmh»</w:t>
+            </w:r>
+            <w:r>
+              <w:rPr>
+                <w:rFonts w:ascii="Aptos Black" w:hAnsi="Aptos Black"/>
                 <w:sz w:val="56"/>
                 <w:szCs w:val="56"/>
               </w:rPr>
@@ -678,22 +635,20 @@
         </w:tc>
         <w:tc>
           <w:tcPr>
-            <w:tcW w:w="899" w:type="pct"/>
+            <w:tcW w:w="1124" w:type="pct"/>
           </w:tcPr>
           <w:p>
             <w:pPr>
               <w:jc w:val="center"/>
               <w:rPr>
-                <w:b/>
-                <w:bCs/>
+                <w:rFonts w:ascii="Aptos Black" w:hAnsi="Aptos Black"/>
                 <w:sz w:val="56"/>
                 <w:szCs w:val="56"/>
               </w:rPr>
             </w:pPr>
             <w:r>
               <w:rPr>
-                <w:b/>
-                <w:bCs/>
+                <w:rFonts w:ascii="Aptos Black" w:hAnsi="Aptos Black"/>
                 <w:sz w:val="56"/>
                 <w:szCs w:val="56"/>
               </w:rPr>
@@ -701,8 +656,7 @@
             </w:r>
             <w:r>
               <w:rPr>
-                <w:b/>
-                <w:bCs/>
+                <w:rFonts w:ascii="Aptos Black" w:hAnsi="Aptos Black"/>
                 <w:sz w:val="56"/>
                 <w:szCs w:val="56"/>
               </w:rPr>
@@ -710,8 +664,7 @@
             </w:r>
             <w:r>
               <w:rPr>
-                <w:b/>
-                <w:bCs/>
+                <w:rFonts w:ascii="Aptos Black" w:hAnsi="Aptos Black"/>
                 <w:sz w:val="56"/>
                 <w:szCs w:val="56"/>
               </w:rPr>
@@ -719,8 +672,7 @@
             </w:r>
             <w:r>
               <w:rPr>
-                <w:b/>
-                <w:bCs/>
+                <w:rFonts w:ascii="Aptos Black" w:hAnsi="Aptos Black"/>
                 <w:sz w:val="56"/>
                 <w:szCs w:val="56"/>
               </w:rPr>
@@ -728,44 +680,30 @@
             </w:r>
             <w:r>
               <w:rPr>
-                <w:b/>
-                <w:bCs/>
+                <w:rFonts w:ascii="Aptos Black" w:hAnsi="Aptos Black"/>
                 <w:sz w:val="56"/>
                 <w:szCs w:val="56"/>
               </w:rPr>
               <w:fldChar w:fldCharType="end"/>
             </w:r>
-          </w:p>
-          <w:p>
-            <w:pPr>
-              <w:jc w:val="center"/>
-              <w:rPr>
-                <w:b/>
-                <w:bCs/>
-                <w:sz w:val="56"/>
-                <w:szCs w:val="56"/>
-              </w:rPr>
-            </w:pPr>
           </w:p>
         </w:tc>
         <w:tc>
           <w:tcPr>
-            <w:tcW w:w="810" w:type="pct"/>
+            <w:tcW w:w="898" w:type="pct"/>
           </w:tcPr>
           <w:p>
             <w:pPr>
               <w:jc w:val="center"/>
               <w:rPr>
-                <w:b/>
-                <w:bCs/>
+                <w:rFonts w:ascii="Aptos Black" w:hAnsi="Aptos Black"/>
                 <w:sz w:val="56"/>
                 <w:szCs w:val="56"/>
               </w:rPr>
             </w:pPr>
             <w:r>
               <w:rPr>
-                <w:b/>
-                <w:bCs/>
+                <w:rFonts w:ascii="Aptos Black" w:hAnsi="Aptos Black"/>
                 <w:sz w:val="56"/>
                 <w:szCs w:val="56"/>
               </w:rPr>
@@ -773,8 +711,7 @@
             </w:r>
             <w:r>
               <w:rPr>
-                <w:b/>
-                <w:bCs/>
+                <w:rFonts w:ascii="Aptos Black" w:hAnsi="Aptos Black"/>
                 <w:sz w:val="56"/>
                 <w:szCs w:val="56"/>
               </w:rPr>
@@ -782,8 +719,7 @@
             </w:r>
             <w:r>
               <w:rPr>
-                <w:b/>
-                <w:bCs/>
+                <w:rFonts w:ascii="Aptos Black" w:hAnsi="Aptos Black"/>
                 <w:sz w:val="56"/>
                 <w:szCs w:val="56"/>
               </w:rPr>
@@ -791,8 +727,7 @@
             </w:r>
             <w:r>
               <w:rPr>
-                <w:b/>
-                <w:bCs/>
+                <w:rFonts w:ascii="Aptos Black" w:hAnsi="Aptos Black"/>
                 <w:sz w:val="56"/>
                 <w:szCs w:val="56"/>
               </w:rPr>
@@ -800,44 +735,30 @@
             </w:r>
             <w:r>
               <w:rPr>
-                <w:b/>
-                <w:bCs/>
+                <w:rFonts w:ascii="Aptos Black" w:hAnsi="Aptos Black"/>
                 <w:sz w:val="56"/>
                 <w:szCs w:val="56"/>
               </w:rPr>
               <w:fldChar w:fldCharType="end"/>
             </w:r>
-          </w:p>
-          <w:p>
-            <w:pPr>
-              <w:jc w:val="center"/>
-              <w:rPr>
-                <w:b/>
-                <w:bCs/>
-                <w:sz w:val="56"/>
-                <w:szCs w:val="56"/>
-              </w:rPr>
-            </w:pPr>
           </w:p>
         </w:tc>
         <w:tc>
           <w:tcPr>
-            <w:tcW w:w="1269" w:type="pct"/>
+            <w:tcW w:w="1045" w:type="pct"/>
           </w:tcPr>
           <w:p>
             <w:pPr>
               <w:jc w:val="center"/>
               <w:rPr>
-                <w:b/>
-                <w:bCs/>
+                <w:rFonts w:ascii="Aptos Black" w:hAnsi="Aptos Black"/>
                 <w:sz w:val="56"/>
                 <w:szCs w:val="56"/>
               </w:rPr>
             </w:pPr>
             <w:r>
               <w:rPr>
-                <w:b/>
-                <w:bCs/>
+                <w:rFonts w:ascii="Aptos Black" w:hAnsi="Aptos Black"/>
                 <w:sz w:val="56"/>
                 <w:szCs w:val="56"/>
               </w:rPr>
@@ -845,8 +766,7 @@
             </w:r>
             <w:r>
               <w:rPr>
-                <w:b/>
-                <w:bCs/>
+                <w:rFonts w:ascii="Aptos Black" w:hAnsi="Aptos Black"/>
                 <w:sz w:val="56"/>
                 <w:szCs w:val="56"/>
               </w:rPr>
@@ -854,8 +774,7 @@
             </w:r>
             <w:r>
               <w:rPr>
-                <w:b/>
-                <w:bCs/>
+                <w:rFonts w:ascii="Aptos Black" w:hAnsi="Aptos Black"/>
                 <w:sz w:val="56"/>
                 <w:szCs w:val="56"/>
               </w:rPr>
@@ -863,8 +782,7 @@
             </w:r>
             <w:r>
               <w:rPr>
-                <w:b/>
-                <w:bCs/>
+                <w:rFonts w:ascii="Aptos Black" w:hAnsi="Aptos Black"/>
                 <w:sz w:val="56"/>
                 <w:szCs w:val="56"/>
               </w:rPr>
@@ -872,30 +790,18 @@
             </w:r>
             <w:r>
               <w:rPr>
-                <w:b/>
-                <w:bCs/>
+                <w:rFonts w:ascii="Aptos Black" w:hAnsi="Aptos Black"/>
                 <w:sz w:val="56"/>
                 <w:szCs w:val="56"/>
               </w:rPr>
               <w:fldChar w:fldCharType="end"/>
             </w:r>
-          </w:p>
-          <w:p>
-            <w:pPr>
-              <w:jc w:val="center"/>
-              <w:rPr>
-                <w:b/>
-                <w:bCs/>
-                <w:sz w:val="56"/>
-                <w:szCs w:val="56"/>
-              </w:rPr>
-            </w:pPr>
           </w:p>
         </w:tc>
       </w:tr>
       <w:tr>
         <w:trPr>
-          <w:trHeight w:val="1146"/>
+          <w:trHeight w:val="623"/>
         </w:trPr>
         <w:tc>
           <w:tcPr>
@@ -906,8 +812,6 @@
               <w:jc w:val="center"/>
               <w:rPr>
                 <w:rFonts w:ascii="Aptos Black" w:hAnsi="Aptos Black"/>
-                <w:b/>
-                <w:bCs/>
                 <w:sz w:val="56"/>
                 <w:szCs w:val="56"/>
               </w:rPr>
@@ -915,8 +819,6 @@
             <w:r>
               <w:rPr>
                 <w:rFonts w:ascii="Aptos Black" w:hAnsi="Aptos Black"/>
-                <w:b/>
-                <w:bCs/>
                 <w:sz w:val="56"/>
                 <w:szCs w:val="56"/>
               </w:rPr>
@@ -926,15 +828,13 @@
         </w:tc>
         <w:tc>
           <w:tcPr>
-            <w:tcW w:w="1079" w:type="pct"/>
+            <w:tcW w:w="990" w:type="pct"/>
           </w:tcPr>
           <w:p>
             <w:pPr>
               <w:jc w:val="center"/>
               <w:rPr>
                 <w:rFonts w:ascii="Aptos Black" w:hAnsi="Aptos Black"/>
-                <w:b/>
-                <w:bCs/>
                 <w:sz w:val="56"/>
                 <w:szCs w:val="56"/>
               </w:rPr>
@@ -942,8 +842,6 @@
             <w:r>
               <w:rPr>
                 <w:rFonts w:ascii="Aptos Black" w:hAnsi="Aptos Black"/>
-                <w:b/>
-                <w:bCs/>
                 <w:sz w:val="56"/>
                 <w:szCs w:val="56"/>
               </w:rPr>
@@ -953,15 +851,13 @@
         </w:tc>
         <w:tc>
           <w:tcPr>
-            <w:tcW w:w="899" w:type="pct"/>
+            <w:tcW w:w="1124" w:type="pct"/>
           </w:tcPr>
           <w:p>
             <w:pPr>
               <w:jc w:val="center"/>
               <w:rPr>
                 <w:rFonts w:ascii="Aptos Black" w:hAnsi="Aptos Black"/>
-                <w:b/>
-                <w:bCs/>
                 <w:sz w:val="56"/>
                 <w:szCs w:val="56"/>
               </w:rPr>
@@ -969,8 +865,6 @@
             <w:r>
               <w:rPr>
                 <w:rFonts w:ascii="Aptos Black" w:hAnsi="Aptos Black"/>
-                <w:b/>
-                <w:bCs/>
                 <w:sz w:val="56"/>
                 <w:szCs w:val="56"/>
               </w:rPr>
@@ -980,15 +874,13 @@
         </w:tc>
         <w:tc>
           <w:tcPr>
-            <w:tcW w:w="810" w:type="pct"/>
+            <w:tcW w:w="898" w:type="pct"/>
           </w:tcPr>
           <w:p>
             <w:pPr>
               <w:jc w:val="center"/>
               <w:rPr>
                 <w:rFonts w:ascii="Aptos Black" w:hAnsi="Aptos Black"/>
-                <w:b/>
-                <w:bCs/>
                 <w:sz w:val="56"/>
                 <w:szCs w:val="56"/>
               </w:rPr>
@@ -996,8 +888,6 @@
             <w:r>
               <w:rPr>
                 <w:rFonts w:ascii="Aptos Black" w:hAnsi="Aptos Black"/>
-                <w:b/>
-                <w:bCs/>
                 <w:sz w:val="56"/>
                 <w:szCs w:val="56"/>
               </w:rPr>
@@ -1007,15 +897,13 @@
         </w:tc>
         <w:tc>
           <w:tcPr>
-            <w:tcW w:w="1269" w:type="pct"/>
+            <w:tcW w:w="1045" w:type="pct"/>
           </w:tcPr>
           <w:p>
             <w:pPr>
               <w:jc w:val="center"/>
               <w:rPr>
                 <w:rFonts w:ascii="Aptos Black" w:hAnsi="Aptos Black"/>
-                <w:b/>
-                <w:bCs/>
                 <w:sz w:val="56"/>
                 <w:szCs w:val="56"/>
               </w:rPr>
@@ -1023,8 +911,6 @@
             <w:r>
               <w:rPr>
                 <w:rFonts w:ascii="Aptos Black" w:hAnsi="Aptos Black"/>
-                <w:b/>
-                <w:bCs/>
                 <w:sz w:val="56"/>
                 <w:szCs w:val="56"/>
               </w:rPr>

</xml_diff>

<commit_message>
feat: actualizar plantilla chancado
</commit_message>
<xml_diff>
--- a/chancado/analytica/Report/PrintPaleta.docx
+++ b/chancado/analytica/Report/PrintPaleta.docx
@@ -1,6 +1,6 @@
 
 <file path=word/document.xml><?xml version="1.0" encoding="utf-8"?>
-<w:document xmlns:wpc="http://schemas.microsoft.com/office/word/2010/wordprocessingCanvas" xmlns:cx="http://schemas.microsoft.com/office/drawing/2014/chartex" xmlns:cx1="http://schemas.microsoft.com/office/drawing/2015/9/8/chartex" xmlns:cx2="http://schemas.microsoft.com/office/drawing/2015/10/21/chartex" xmlns:cx3="http://schemas.microsoft.com/office/drawing/2016/5/9/chartex" xmlns:cx4="http://schemas.microsoft.com/office/drawing/2016/5/10/chartex" xmlns:cx5="http://schemas.microsoft.com/office/drawing/2016/5/11/chartex" xmlns:cx6="http://schemas.microsoft.com/office/drawing/2016/5/12/chartex" xmlns:cx7="http://schemas.microsoft.com/office/drawing/2016/5/13/chartex" xmlns:cx8="http://schemas.microsoft.com/office/drawing/2016/5/14/chartex" xmlns:mc="http://schemas.openxmlformats.org/markup-compatibility/2006" xmlns:aink="http://schemas.microsoft.com/office/drawing/2016/ink" xmlns:am3d="http://schemas.microsoft.com/office/drawing/2017/model3d" xmlns:o="urn:schemas-microsoft-com:office:office" xmlns:oel="http://schemas.microsoft.com/office/2019/extlst" xmlns:r="http://schemas.openxmlformats.org/officeDocument/2006/relationships" xmlns:m="http://schemas.openxmlformats.org/officeDocument/2006/math" xmlns:v="urn:schemas-microsoft-com:vml" xmlns:wp14="http://schemas.microsoft.com/office/word/2010/wordprocessingDrawing" xmlns:wp="http://schemas.openxmlformats.org/drawingml/2006/wordprocessingDrawing" xmlns:w10="urn:schemas-microsoft-com:office:word" xmlns:w="http://schemas.openxmlformats.org/wordprocessingml/2006/main" xmlns:w14="http://schemas.microsoft.com/office/word/2010/wordml" xmlns:w15="http://schemas.microsoft.com/office/word/2012/wordml" xmlns:w16cex="http://schemas.microsoft.com/office/word/2018/wordml/cex" xmlns:w16cid="http://schemas.microsoft.com/office/word/2016/wordml/cid" xmlns:w16="http://schemas.microsoft.com/office/word/2018/wordml" xmlns:w16du="http://schemas.microsoft.com/office/word/2023/wordml/word16du" xmlns:w16sdtdh="http://schemas.microsoft.com/office/word/2020/wordml/sdtdatahash" xmlns:w16sdtfl="http://schemas.microsoft.com/office/word/2024/wordml/sdtformatlock" xmlns:w16se="http://schemas.microsoft.com/office/word/2015/wordml/symex" xmlns:wpg="http://schemas.microsoft.com/office/word/2010/wordprocessingGroup" xmlns:wpi="http://schemas.microsoft.com/office/word/2010/wordprocessingInk" xmlns:wne="http://schemas.microsoft.com/office/word/2006/wordml" xmlns:wps="http://schemas.microsoft.com/office/word/2010/wordprocessingShape" mc:Ignorable="w14 w15 w16se w16cid w16 w16cex w16sdtdh w16sdtfl w16du wp14">
+<w:document xmlns:wpc="http://schemas.microsoft.com/office/word/2010/wordprocessingCanvas" xmlns:cx="http://schemas.microsoft.com/office/drawing/2014/chartex" xmlns:cx1="http://schemas.microsoft.com/office/drawing/2015/9/8/chartex" xmlns:cx2="http://schemas.microsoft.com/office/drawing/2015/10/21/chartex" xmlns:cx3="http://schemas.microsoft.com/office/drawing/2016/5/9/chartex" xmlns:cx4="http://schemas.microsoft.com/office/drawing/2016/5/10/chartex" xmlns:cx5="http://schemas.microsoft.com/office/drawing/2016/5/11/chartex" xmlns:cx6="http://schemas.microsoft.com/office/drawing/2016/5/12/chartex" xmlns:cx7="http://schemas.microsoft.com/office/drawing/2016/5/13/chartex" xmlns:cx8="http://schemas.microsoft.com/office/drawing/2016/5/14/chartex" xmlns:mc="http://schemas.openxmlformats.org/markup-compatibility/2006" xmlns:aink="http://schemas.microsoft.com/office/drawing/2016/ink" xmlns:am3d="http://schemas.microsoft.com/office/drawing/2017/model3d" xmlns:o="urn:schemas-microsoft-com:office:office" xmlns:oel="http://schemas.microsoft.com/office/2019/extlst" xmlns:r="http://schemas.openxmlformats.org/officeDocument/2006/relationships" xmlns:m="http://schemas.openxmlformats.org/officeDocument/2006/math" xmlns:v="urn:schemas-microsoft-com:vml" xmlns:wp14="http://schemas.microsoft.com/office/word/2010/wordprocessingDrawing" xmlns:wp="http://schemas.openxmlformats.org/drawingml/2006/wordprocessingDrawing" xmlns:w10="urn:schemas-microsoft-com:office:word" xmlns:w="http://schemas.openxmlformats.org/wordprocessingml/2006/main" xmlns:w14="http://schemas.microsoft.com/office/word/2010/wordml" xmlns:w15="http://schemas.microsoft.com/office/word/2012/wordml" xmlns:w16cei="http://schemas.microsoft.com/office/word/2026/wordml/cei" xmlns:w16cex="http://schemas.microsoft.com/office/word/2018/wordml/cex" xmlns:w16cid="http://schemas.microsoft.com/office/word/2016/wordml/cid" xmlns:w16="http://schemas.microsoft.com/office/word/2018/wordml" xmlns:w16du="http://schemas.microsoft.com/office/word/2023/wordml/word16du" xmlns:w16sdtdh="http://schemas.microsoft.com/office/word/2020/wordml/sdtdatahash" xmlns:w16sdtfl="http://schemas.microsoft.com/office/word/2024/wordml/sdtformatlock" xmlns:w16se="http://schemas.microsoft.com/office/word/2015/wordml/symex" xmlns:wpg="http://schemas.microsoft.com/office/word/2010/wordprocessingGroup" xmlns:wpi="http://schemas.microsoft.com/office/word/2010/wordprocessingInk" xmlns:wne="http://schemas.microsoft.com/office/word/2006/wordml" xmlns:wps="http://schemas.microsoft.com/office/word/2010/wordprocessingShape" mc:Ignorable="w14 w15 w16se w16cid w16 w16cex w16sdtdh w16sdtfl w16du wp14">
   <w:body>
     <w:p>
       <w:r>
@@ -822,7 +822,40 @@
                 <w:sz w:val="56"/>
                 <w:szCs w:val="56"/>
               </w:rPr>
-              <w:t>SACOS</w:t>
+              <w:fldChar w:fldCharType="begin"/>
+            </w:r>
+            <w:r>
+              <w:rPr>
+                <w:rFonts w:ascii="Aptos Black" w:hAnsi="Aptos Black"/>
+                <w:sz w:val="56"/>
+                <w:szCs w:val="56"/>
+              </w:rPr>
+              <w:instrText xml:space="preserve"> MERGEFIELD  presentacion  \* MERGEFORMAT </w:instrText>
+            </w:r>
+            <w:r>
+              <w:rPr>
+                <w:rFonts w:ascii="Aptos Black" w:hAnsi="Aptos Black"/>
+                <w:sz w:val="56"/>
+                <w:szCs w:val="56"/>
+              </w:rPr>
+              <w:fldChar w:fldCharType="separate"/>
+            </w:r>
+            <w:r>
+              <w:rPr>
+                <w:rFonts w:ascii="Aptos Black" w:hAnsi="Aptos Black"/>
+                <w:noProof/>
+                <w:sz w:val="56"/>
+                <w:szCs w:val="56"/>
+              </w:rPr>
+              <w:t>«presentacion»</w:t>
+            </w:r>
+            <w:r>
+              <w:rPr>
+                <w:rFonts w:ascii="Aptos Black" w:hAnsi="Aptos Black"/>
+                <w:sz w:val="56"/>
+                <w:szCs w:val="56"/>
+              </w:rPr>
+              <w:fldChar w:fldCharType="end"/>
             </w:r>
           </w:p>
         </w:tc>
@@ -940,7 +973,7 @@
 </file>
 
 <file path=word/endnotes.xml><?xml version="1.0" encoding="utf-8"?>
-<w:endnotes xmlns:wpc="http://schemas.microsoft.com/office/word/2010/wordprocessingCanvas" xmlns:cx="http://schemas.microsoft.com/office/drawing/2014/chartex" xmlns:cx1="http://schemas.microsoft.com/office/drawing/2015/9/8/chartex" xmlns:cx2="http://schemas.microsoft.com/office/drawing/2015/10/21/chartex" xmlns:cx3="http://schemas.microsoft.com/office/drawing/2016/5/9/chartex" xmlns:cx4="http://schemas.microsoft.com/office/drawing/2016/5/10/chartex" xmlns:cx5="http://schemas.microsoft.com/office/drawing/2016/5/11/chartex" xmlns:cx6="http://schemas.microsoft.com/office/drawing/2016/5/12/chartex" xmlns:cx7="http://schemas.microsoft.com/office/drawing/2016/5/13/chartex" xmlns:cx8="http://schemas.microsoft.com/office/drawing/2016/5/14/chartex" xmlns:mc="http://schemas.openxmlformats.org/markup-compatibility/2006" xmlns:aink="http://schemas.microsoft.com/office/drawing/2016/ink" xmlns:am3d="http://schemas.microsoft.com/office/drawing/2017/model3d" xmlns:o="urn:schemas-microsoft-com:office:office" xmlns:oel="http://schemas.microsoft.com/office/2019/extlst" xmlns:r="http://schemas.openxmlformats.org/officeDocument/2006/relationships" xmlns:m="http://schemas.openxmlformats.org/officeDocument/2006/math" xmlns:v="urn:schemas-microsoft-com:vml" xmlns:wp14="http://schemas.microsoft.com/office/word/2010/wordprocessingDrawing" xmlns:wp="http://schemas.openxmlformats.org/drawingml/2006/wordprocessingDrawing" xmlns:w10="urn:schemas-microsoft-com:office:word" xmlns:w="http://schemas.openxmlformats.org/wordprocessingml/2006/main" xmlns:w14="http://schemas.microsoft.com/office/word/2010/wordml" xmlns:w15="http://schemas.microsoft.com/office/word/2012/wordml" xmlns:w16cex="http://schemas.microsoft.com/office/word/2018/wordml/cex" xmlns:w16cid="http://schemas.microsoft.com/office/word/2016/wordml/cid" xmlns:w16="http://schemas.microsoft.com/office/word/2018/wordml" xmlns:w16du="http://schemas.microsoft.com/office/word/2023/wordml/word16du" xmlns:w16sdtdh="http://schemas.microsoft.com/office/word/2020/wordml/sdtdatahash" xmlns:w16sdtfl="http://schemas.microsoft.com/office/word/2024/wordml/sdtformatlock" xmlns:w16se="http://schemas.microsoft.com/office/word/2015/wordml/symex" xmlns:wpg="http://schemas.microsoft.com/office/word/2010/wordprocessingGroup" xmlns:wpi="http://schemas.microsoft.com/office/word/2010/wordprocessingInk" xmlns:wne="http://schemas.microsoft.com/office/word/2006/wordml" xmlns:wps="http://schemas.microsoft.com/office/word/2010/wordprocessingShape" mc:Ignorable="w14 w15 w16se w16cid w16 w16cex w16sdtdh w16sdtfl w16du wp14">
+<w:endnotes xmlns:wpc="http://schemas.microsoft.com/office/word/2010/wordprocessingCanvas" xmlns:cx="http://schemas.microsoft.com/office/drawing/2014/chartex" xmlns:cx1="http://schemas.microsoft.com/office/drawing/2015/9/8/chartex" xmlns:cx2="http://schemas.microsoft.com/office/drawing/2015/10/21/chartex" xmlns:cx3="http://schemas.microsoft.com/office/drawing/2016/5/9/chartex" xmlns:cx4="http://schemas.microsoft.com/office/drawing/2016/5/10/chartex" xmlns:cx5="http://schemas.microsoft.com/office/drawing/2016/5/11/chartex" xmlns:cx6="http://schemas.microsoft.com/office/drawing/2016/5/12/chartex" xmlns:cx7="http://schemas.microsoft.com/office/drawing/2016/5/13/chartex" xmlns:cx8="http://schemas.microsoft.com/office/drawing/2016/5/14/chartex" xmlns:mc="http://schemas.openxmlformats.org/markup-compatibility/2006" xmlns:aink="http://schemas.microsoft.com/office/drawing/2016/ink" xmlns:am3d="http://schemas.microsoft.com/office/drawing/2017/model3d" xmlns:o="urn:schemas-microsoft-com:office:office" xmlns:oel="http://schemas.microsoft.com/office/2019/extlst" xmlns:r="http://schemas.openxmlformats.org/officeDocument/2006/relationships" xmlns:m="http://schemas.openxmlformats.org/officeDocument/2006/math" xmlns:v="urn:schemas-microsoft-com:vml" xmlns:wp14="http://schemas.microsoft.com/office/word/2010/wordprocessingDrawing" xmlns:wp="http://schemas.openxmlformats.org/drawingml/2006/wordprocessingDrawing" xmlns:w10="urn:schemas-microsoft-com:office:word" xmlns:w="http://schemas.openxmlformats.org/wordprocessingml/2006/main" xmlns:w14="http://schemas.microsoft.com/office/word/2010/wordml" xmlns:w15="http://schemas.microsoft.com/office/word/2012/wordml" xmlns:w16cei="http://schemas.microsoft.com/office/word/2026/wordml/cei" xmlns:w16cex="http://schemas.microsoft.com/office/word/2018/wordml/cex" xmlns:w16cid="http://schemas.microsoft.com/office/word/2016/wordml/cid" xmlns:w16="http://schemas.microsoft.com/office/word/2018/wordml" xmlns:w16du="http://schemas.microsoft.com/office/word/2023/wordml/word16du" xmlns:w16sdtdh="http://schemas.microsoft.com/office/word/2020/wordml/sdtdatahash" xmlns:w16sdtfl="http://schemas.microsoft.com/office/word/2024/wordml/sdtformatlock" xmlns:w16se="http://schemas.microsoft.com/office/word/2015/wordml/symex" xmlns:wpg="http://schemas.microsoft.com/office/word/2010/wordprocessingGroup" xmlns:wpi="http://schemas.microsoft.com/office/word/2010/wordprocessingInk" xmlns:wne="http://schemas.microsoft.com/office/word/2006/wordml" xmlns:wps="http://schemas.microsoft.com/office/word/2010/wordprocessingShape" mc:Ignorable="w14 w15 w16se w16cid w16 w16cex w16sdtdh w16sdtfl w16du wp14">
   <w:endnote w:type="separator" w:id="-1">
     <w:p>
       <w:pPr>
@@ -967,7 +1000,7 @@
 </file>
 
 <file path=word/footer1.xml><?xml version="1.0" encoding="utf-8"?>
-<w:ftr xmlns:wpc="http://schemas.microsoft.com/office/word/2010/wordprocessingCanvas" xmlns:cx="http://schemas.microsoft.com/office/drawing/2014/chartex" xmlns:cx1="http://schemas.microsoft.com/office/drawing/2015/9/8/chartex" xmlns:cx2="http://schemas.microsoft.com/office/drawing/2015/10/21/chartex" xmlns:cx3="http://schemas.microsoft.com/office/drawing/2016/5/9/chartex" xmlns:cx4="http://schemas.microsoft.com/office/drawing/2016/5/10/chartex" xmlns:cx5="http://schemas.microsoft.com/office/drawing/2016/5/11/chartex" xmlns:cx6="http://schemas.microsoft.com/office/drawing/2016/5/12/chartex" xmlns:cx7="http://schemas.microsoft.com/office/drawing/2016/5/13/chartex" xmlns:cx8="http://schemas.microsoft.com/office/drawing/2016/5/14/chartex" xmlns:mc="http://schemas.openxmlformats.org/markup-compatibility/2006" xmlns:aink="http://schemas.microsoft.com/office/drawing/2016/ink" xmlns:am3d="http://schemas.microsoft.com/office/drawing/2017/model3d" xmlns:o="urn:schemas-microsoft-com:office:office" xmlns:oel="http://schemas.microsoft.com/office/2019/extlst" xmlns:r="http://schemas.openxmlformats.org/officeDocument/2006/relationships" xmlns:m="http://schemas.openxmlformats.org/officeDocument/2006/math" xmlns:v="urn:schemas-microsoft-com:vml" xmlns:wp14="http://schemas.microsoft.com/office/word/2010/wordprocessingDrawing" xmlns:wp="http://schemas.openxmlformats.org/drawingml/2006/wordprocessingDrawing" xmlns:w10="urn:schemas-microsoft-com:office:word" xmlns:w="http://schemas.openxmlformats.org/wordprocessingml/2006/main" xmlns:w14="http://schemas.microsoft.com/office/word/2010/wordml" xmlns:w15="http://schemas.microsoft.com/office/word/2012/wordml" xmlns:w16cex="http://schemas.microsoft.com/office/word/2018/wordml/cex" xmlns:w16cid="http://schemas.microsoft.com/office/word/2016/wordml/cid" xmlns:w16="http://schemas.microsoft.com/office/word/2018/wordml" xmlns:w16du="http://schemas.microsoft.com/office/word/2023/wordml/word16du" xmlns:w16sdtdh="http://schemas.microsoft.com/office/word/2020/wordml/sdtdatahash" xmlns:w16sdtfl="http://schemas.microsoft.com/office/word/2024/wordml/sdtformatlock" xmlns:w16se="http://schemas.microsoft.com/office/word/2015/wordml/symex" xmlns:wpg="http://schemas.microsoft.com/office/word/2010/wordprocessingGroup" xmlns:wpi="http://schemas.microsoft.com/office/word/2010/wordprocessingInk" xmlns:wne="http://schemas.microsoft.com/office/word/2006/wordml" xmlns:wps="http://schemas.microsoft.com/office/word/2010/wordprocessingShape" mc:Ignorable="w14 w15 w16se w16cid w16 w16cex w16sdtdh w16sdtfl w16du wp14">
+<w:ftr xmlns:wpc="http://schemas.microsoft.com/office/word/2010/wordprocessingCanvas" xmlns:cx="http://schemas.microsoft.com/office/drawing/2014/chartex" xmlns:cx1="http://schemas.microsoft.com/office/drawing/2015/9/8/chartex" xmlns:cx2="http://schemas.microsoft.com/office/drawing/2015/10/21/chartex" xmlns:cx3="http://schemas.microsoft.com/office/drawing/2016/5/9/chartex" xmlns:cx4="http://schemas.microsoft.com/office/drawing/2016/5/10/chartex" xmlns:cx5="http://schemas.microsoft.com/office/drawing/2016/5/11/chartex" xmlns:cx6="http://schemas.microsoft.com/office/drawing/2016/5/12/chartex" xmlns:cx7="http://schemas.microsoft.com/office/drawing/2016/5/13/chartex" xmlns:cx8="http://schemas.microsoft.com/office/drawing/2016/5/14/chartex" xmlns:mc="http://schemas.openxmlformats.org/markup-compatibility/2006" xmlns:aink="http://schemas.microsoft.com/office/drawing/2016/ink" xmlns:am3d="http://schemas.microsoft.com/office/drawing/2017/model3d" xmlns:o="urn:schemas-microsoft-com:office:office" xmlns:oel="http://schemas.microsoft.com/office/2019/extlst" xmlns:r="http://schemas.openxmlformats.org/officeDocument/2006/relationships" xmlns:m="http://schemas.openxmlformats.org/officeDocument/2006/math" xmlns:v="urn:schemas-microsoft-com:vml" xmlns:wp14="http://schemas.microsoft.com/office/word/2010/wordprocessingDrawing" xmlns:wp="http://schemas.openxmlformats.org/drawingml/2006/wordprocessingDrawing" xmlns:w10="urn:schemas-microsoft-com:office:word" xmlns:w="http://schemas.openxmlformats.org/wordprocessingml/2006/main" xmlns:w14="http://schemas.microsoft.com/office/word/2010/wordml" xmlns:w15="http://schemas.microsoft.com/office/word/2012/wordml" xmlns:w16cei="http://schemas.microsoft.com/office/word/2026/wordml/cei" xmlns:w16cex="http://schemas.microsoft.com/office/word/2018/wordml/cex" xmlns:w16cid="http://schemas.microsoft.com/office/word/2016/wordml/cid" xmlns:w16="http://schemas.microsoft.com/office/word/2018/wordml" xmlns:w16du="http://schemas.microsoft.com/office/word/2023/wordml/word16du" xmlns:w16sdtdh="http://schemas.microsoft.com/office/word/2020/wordml/sdtdatahash" xmlns:w16sdtfl="http://schemas.microsoft.com/office/word/2024/wordml/sdtformatlock" xmlns:w16se="http://schemas.microsoft.com/office/word/2015/wordml/symex" xmlns:wpg="http://schemas.microsoft.com/office/word/2010/wordprocessingGroup" xmlns:wpi="http://schemas.microsoft.com/office/word/2010/wordprocessingInk" xmlns:wne="http://schemas.microsoft.com/office/word/2006/wordml" xmlns:wps="http://schemas.microsoft.com/office/word/2010/wordprocessingShape" mc:Ignorable="w14 w15 w16se w16cid w16 w16cex w16sdtdh w16sdtfl w16du wp14">
   <w:p>
     <w:pPr>
       <w:pStyle w:val="Piedepgina"/>
@@ -1032,7 +1065,7 @@
 </file>
 
 <file path=word/footnotes.xml><?xml version="1.0" encoding="utf-8"?>
-<w:footnotes xmlns:wpc="http://schemas.microsoft.com/office/word/2010/wordprocessingCanvas" xmlns:cx="http://schemas.microsoft.com/office/drawing/2014/chartex" xmlns:cx1="http://schemas.microsoft.com/office/drawing/2015/9/8/chartex" xmlns:cx2="http://schemas.microsoft.com/office/drawing/2015/10/21/chartex" xmlns:cx3="http://schemas.microsoft.com/office/drawing/2016/5/9/chartex" xmlns:cx4="http://schemas.microsoft.com/office/drawing/2016/5/10/chartex" xmlns:cx5="http://schemas.microsoft.com/office/drawing/2016/5/11/chartex" xmlns:cx6="http://schemas.microsoft.com/office/drawing/2016/5/12/chartex" xmlns:cx7="http://schemas.microsoft.com/office/drawing/2016/5/13/chartex" xmlns:cx8="http://schemas.microsoft.com/office/drawing/2016/5/14/chartex" xmlns:mc="http://schemas.openxmlformats.org/markup-compatibility/2006" xmlns:aink="http://schemas.microsoft.com/office/drawing/2016/ink" xmlns:am3d="http://schemas.microsoft.com/office/drawing/2017/model3d" xmlns:o="urn:schemas-microsoft-com:office:office" xmlns:oel="http://schemas.microsoft.com/office/2019/extlst" xmlns:r="http://schemas.openxmlformats.org/officeDocument/2006/relationships" xmlns:m="http://schemas.openxmlformats.org/officeDocument/2006/math" xmlns:v="urn:schemas-microsoft-com:vml" xmlns:wp14="http://schemas.microsoft.com/office/word/2010/wordprocessingDrawing" xmlns:wp="http://schemas.openxmlformats.org/drawingml/2006/wordprocessingDrawing" xmlns:w10="urn:schemas-microsoft-com:office:word" xmlns:w="http://schemas.openxmlformats.org/wordprocessingml/2006/main" xmlns:w14="http://schemas.microsoft.com/office/word/2010/wordml" xmlns:w15="http://schemas.microsoft.com/office/word/2012/wordml" xmlns:w16cex="http://schemas.microsoft.com/office/word/2018/wordml/cex" xmlns:w16cid="http://schemas.microsoft.com/office/word/2016/wordml/cid" xmlns:w16="http://schemas.microsoft.com/office/word/2018/wordml" xmlns:w16du="http://schemas.microsoft.com/office/word/2023/wordml/word16du" xmlns:w16sdtdh="http://schemas.microsoft.com/office/word/2020/wordml/sdtdatahash" xmlns:w16sdtfl="http://schemas.microsoft.com/office/word/2024/wordml/sdtformatlock" xmlns:w16se="http://schemas.microsoft.com/office/word/2015/wordml/symex" xmlns:wpg="http://schemas.microsoft.com/office/word/2010/wordprocessingGroup" xmlns:wpi="http://schemas.microsoft.com/office/word/2010/wordprocessingInk" xmlns:wne="http://schemas.microsoft.com/office/word/2006/wordml" xmlns:wps="http://schemas.microsoft.com/office/word/2010/wordprocessingShape" mc:Ignorable="w14 w15 w16se w16cid w16 w16cex w16sdtdh w16sdtfl w16du wp14">
+<w:footnotes xmlns:wpc="http://schemas.microsoft.com/office/word/2010/wordprocessingCanvas" xmlns:cx="http://schemas.microsoft.com/office/drawing/2014/chartex" xmlns:cx1="http://schemas.microsoft.com/office/drawing/2015/9/8/chartex" xmlns:cx2="http://schemas.microsoft.com/office/drawing/2015/10/21/chartex" xmlns:cx3="http://schemas.microsoft.com/office/drawing/2016/5/9/chartex" xmlns:cx4="http://schemas.microsoft.com/office/drawing/2016/5/10/chartex" xmlns:cx5="http://schemas.microsoft.com/office/drawing/2016/5/11/chartex" xmlns:cx6="http://schemas.microsoft.com/office/drawing/2016/5/12/chartex" xmlns:cx7="http://schemas.microsoft.com/office/drawing/2016/5/13/chartex" xmlns:cx8="http://schemas.microsoft.com/office/drawing/2016/5/14/chartex" xmlns:mc="http://schemas.openxmlformats.org/markup-compatibility/2006" xmlns:aink="http://schemas.microsoft.com/office/drawing/2016/ink" xmlns:am3d="http://schemas.microsoft.com/office/drawing/2017/model3d" xmlns:o="urn:schemas-microsoft-com:office:office" xmlns:oel="http://schemas.microsoft.com/office/2019/extlst" xmlns:r="http://schemas.openxmlformats.org/officeDocument/2006/relationships" xmlns:m="http://schemas.openxmlformats.org/officeDocument/2006/math" xmlns:v="urn:schemas-microsoft-com:vml" xmlns:wp14="http://schemas.microsoft.com/office/word/2010/wordprocessingDrawing" xmlns:wp="http://schemas.openxmlformats.org/drawingml/2006/wordprocessingDrawing" xmlns:w10="urn:schemas-microsoft-com:office:word" xmlns:w="http://schemas.openxmlformats.org/wordprocessingml/2006/main" xmlns:w14="http://schemas.microsoft.com/office/word/2010/wordml" xmlns:w15="http://schemas.microsoft.com/office/word/2012/wordml" xmlns:w16cei="http://schemas.microsoft.com/office/word/2026/wordml/cei" xmlns:w16cex="http://schemas.microsoft.com/office/word/2018/wordml/cex" xmlns:w16cid="http://schemas.microsoft.com/office/word/2016/wordml/cid" xmlns:w16="http://schemas.microsoft.com/office/word/2018/wordml" xmlns:w16du="http://schemas.microsoft.com/office/word/2023/wordml/word16du" xmlns:w16sdtdh="http://schemas.microsoft.com/office/word/2020/wordml/sdtdatahash" xmlns:w16sdtfl="http://schemas.microsoft.com/office/word/2024/wordml/sdtformatlock" xmlns:w16se="http://schemas.microsoft.com/office/word/2015/wordml/symex" xmlns:wpg="http://schemas.microsoft.com/office/word/2010/wordprocessingGroup" xmlns:wpi="http://schemas.microsoft.com/office/word/2010/wordprocessingInk" xmlns:wne="http://schemas.microsoft.com/office/word/2006/wordml" xmlns:wps="http://schemas.microsoft.com/office/word/2010/wordprocessingShape" mc:Ignorable="w14 w15 w16se w16cid w16 w16cex w16sdtdh w16sdtfl w16du wp14">
   <w:footnote w:type="separator" w:id="-1">
     <w:p>
       <w:pPr>
@@ -1059,7 +1092,7 @@
 </file>
 
 <file path=word/numbering.xml><?xml version="1.0" encoding="utf-8"?>
-<w:numbering xmlns:wpc="http://schemas.microsoft.com/office/word/2010/wordprocessingCanvas" xmlns:cx="http://schemas.microsoft.com/office/drawing/2014/chartex" xmlns:cx1="http://schemas.microsoft.com/office/drawing/2015/9/8/chartex" xmlns:cx2="http://schemas.microsoft.com/office/drawing/2015/10/21/chartex" xmlns:cx3="http://schemas.microsoft.com/office/drawing/2016/5/9/chartex" xmlns:cx4="http://schemas.microsoft.com/office/drawing/2016/5/10/chartex" xmlns:cx5="http://schemas.microsoft.com/office/drawing/2016/5/11/chartex" xmlns:cx6="http://schemas.microsoft.com/office/drawing/2016/5/12/chartex" xmlns:cx7="http://schemas.microsoft.com/office/drawing/2016/5/13/chartex" xmlns:cx8="http://schemas.microsoft.com/office/drawing/2016/5/14/chartex" xmlns:mc="http://schemas.openxmlformats.org/markup-compatibility/2006" xmlns:aink="http://schemas.microsoft.com/office/drawing/2016/ink" xmlns:am3d="http://schemas.microsoft.com/office/drawing/2017/model3d" xmlns:o="urn:schemas-microsoft-com:office:office" xmlns:oel="http://schemas.microsoft.com/office/2019/extlst" xmlns:r="http://schemas.openxmlformats.org/officeDocument/2006/relationships" xmlns:m="http://schemas.openxmlformats.org/officeDocument/2006/math" xmlns:v="urn:schemas-microsoft-com:vml" xmlns:wp14="http://schemas.microsoft.com/office/word/2010/wordprocessingDrawing" xmlns:wp="http://schemas.openxmlformats.org/drawingml/2006/wordprocessingDrawing" xmlns:w10="urn:schemas-microsoft-com:office:word" xmlns:w="http://schemas.openxmlformats.org/wordprocessingml/2006/main" xmlns:w14="http://schemas.microsoft.com/office/word/2010/wordml" xmlns:w15="http://schemas.microsoft.com/office/word/2012/wordml" xmlns:w16cex="http://schemas.microsoft.com/office/word/2018/wordml/cex" xmlns:w16cid="http://schemas.microsoft.com/office/word/2016/wordml/cid" xmlns:w16="http://schemas.microsoft.com/office/word/2018/wordml" xmlns:w16du="http://schemas.microsoft.com/office/word/2023/wordml/word16du" xmlns:w16sdtdh="http://schemas.microsoft.com/office/word/2020/wordml/sdtdatahash" xmlns:w16sdtfl="http://schemas.microsoft.com/office/word/2024/wordml/sdtformatlock" xmlns:w16se="http://schemas.microsoft.com/office/word/2015/wordml/symex" xmlns:wpg="http://schemas.microsoft.com/office/word/2010/wordprocessingGroup" xmlns:wpi="http://schemas.microsoft.com/office/word/2010/wordprocessingInk" xmlns:wne="http://schemas.microsoft.com/office/word/2006/wordml" xmlns:wps="http://schemas.microsoft.com/office/word/2010/wordprocessingShape" mc:Ignorable="w14 w15 w16se w16cid w16 w16cex w16sdtdh w16sdtfl w16du wp14">
+<w:numbering xmlns:wpc="http://schemas.microsoft.com/office/word/2010/wordprocessingCanvas" xmlns:cx="http://schemas.microsoft.com/office/drawing/2014/chartex" xmlns:cx1="http://schemas.microsoft.com/office/drawing/2015/9/8/chartex" xmlns:cx2="http://schemas.microsoft.com/office/drawing/2015/10/21/chartex" xmlns:cx3="http://schemas.microsoft.com/office/drawing/2016/5/9/chartex" xmlns:cx4="http://schemas.microsoft.com/office/drawing/2016/5/10/chartex" xmlns:cx5="http://schemas.microsoft.com/office/drawing/2016/5/11/chartex" xmlns:cx6="http://schemas.microsoft.com/office/drawing/2016/5/12/chartex" xmlns:cx7="http://schemas.microsoft.com/office/drawing/2016/5/13/chartex" xmlns:cx8="http://schemas.microsoft.com/office/drawing/2016/5/14/chartex" xmlns:mc="http://schemas.openxmlformats.org/markup-compatibility/2006" xmlns:aink="http://schemas.microsoft.com/office/drawing/2016/ink" xmlns:am3d="http://schemas.microsoft.com/office/drawing/2017/model3d" xmlns:o="urn:schemas-microsoft-com:office:office" xmlns:oel="http://schemas.microsoft.com/office/2019/extlst" xmlns:r="http://schemas.openxmlformats.org/officeDocument/2006/relationships" xmlns:m="http://schemas.openxmlformats.org/officeDocument/2006/math" xmlns:v="urn:schemas-microsoft-com:vml" xmlns:wp14="http://schemas.microsoft.com/office/word/2010/wordprocessingDrawing" xmlns:wp="http://schemas.openxmlformats.org/drawingml/2006/wordprocessingDrawing" xmlns:w10="urn:schemas-microsoft-com:office:word" xmlns:w="http://schemas.openxmlformats.org/wordprocessingml/2006/main" xmlns:w14="http://schemas.microsoft.com/office/word/2010/wordml" xmlns:w15="http://schemas.microsoft.com/office/word/2012/wordml" xmlns:w16cei="http://schemas.microsoft.com/office/word/2026/wordml/cei" xmlns:w16cex="http://schemas.microsoft.com/office/word/2018/wordml/cex" xmlns:w16cid="http://schemas.microsoft.com/office/word/2016/wordml/cid" xmlns:w16="http://schemas.microsoft.com/office/word/2018/wordml" xmlns:w16du="http://schemas.microsoft.com/office/word/2023/wordml/word16du" xmlns:w16sdtdh="http://schemas.microsoft.com/office/word/2020/wordml/sdtdatahash" xmlns:w16sdtfl="http://schemas.microsoft.com/office/word/2024/wordml/sdtformatlock" xmlns:w16se="http://schemas.microsoft.com/office/word/2015/wordml/symex" xmlns:wpg="http://schemas.microsoft.com/office/word/2010/wordprocessingGroup" xmlns:wpi="http://schemas.microsoft.com/office/word/2010/wordprocessingInk" xmlns:wne="http://schemas.microsoft.com/office/word/2006/wordml" xmlns:wps="http://schemas.microsoft.com/office/word/2010/wordprocessingShape" mc:Ignorable="w14 w15 w16se w16cid w16 w16cex w16sdtdh w16sdtfl w16du wp14">
   <w:abstractNum w:abstractNumId="0" w15:restartNumberingAfterBreak="0">
     <w:nsid w:val="FFFFFF7C"/>
     <w:multiLevelType w:val="singleLevel"/>
@@ -2976,11 +3009,12 @@
 </file>
 
 <file path=customXml/item1.xml><?xml version="1.0" encoding="utf-8"?>
-<p:properties xmlns:p="http://schemas.microsoft.com/office/2006/metadata/properties" xmlns:xsi="http://www.w3.org/2001/XMLSchema-instance" xmlns:pc="http://schemas.microsoft.com/office/infopath/2007/PartnerControls">
-  <documentManagement>
-    <MediaServiceKeyPoints xmlns="71af3243-3dd4-4a8d-8c0d-dd76da1f02a5" xsi:nil="true"/>
-  </documentManagement>
-</p:properties>
+<?mso-contentType ?>
+<FormTemplates xmlns="http://schemas.microsoft.com/sharepoint/v3/contenttype/forms">
+  <Display>DocumentLibraryForm</Display>
+  <Edit>DocumentLibraryForm</Edit>
+  <New>DocumentLibraryForm</New>
+</FormTemplates>
 </file>
 
 <file path=customXml/item2.xml><?xml version="1.0" encoding="utf-8"?>
@@ -3195,20 +3229,17 @@
 </file>
 
 <file path=customXml/item3.xml><?xml version="1.0" encoding="utf-8"?>
-<?mso-contentType ?>
-<FormTemplates xmlns="http://schemas.microsoft.com/sharepoint/v3/contenttype/forms">
-  <Display>DocumentLibraryForm</Display>
-  <Edit>DocumentLibraryForm</Edit>
-  <New>DocumentLibraryForm</New>
-</FormTemplates>
+<p:properties xmlns:p="http://schemas.microsoft.com/office/2006/metadata/properties" xmlns:xsi="http://www.w3.org/2001/XMLSchema-instance" xmlns:pc="http://schemas.microsoft.com/office/infopath/2007/PartnerControls">
+  <documentManagement>
+    <MediaServiceKeyPoints xmlns="71af3243-3dd4-4a8d-8c0d-dd76da1f02a5" xsi:nil="true"/>
+  </documentManagement>
+</p:properties>
 </file>
 
 <file path=customXml/itemProps1.xml><?xml version="1.0" encoding="utf-8"?>
-<ds:datastoreItem xmlns:ds="http://schemas.openxmlformats.org/officeDocument/2006/customXml" ds:itemID="{B550BB7C-2FBC-4612-9ECE-2EA076035D14}">
+<ds:datastoreItem xmlns:ds="http://schemas.openxmlformats.org/officeDocument/2006/customXml" ds:itemID="{BEA6D05B-AD60-405F-B8DB-FC61ABCDF8E2}">
   <ds:schemaRefs>
-    <ds:schemaRef ds:uri="http://schemas.microsoft.com/office/2006/metadata/properties"/>
-    <ds:schemaRef ds:uri="http://schemas.microsoft.com/office/infopath/2007/PartnerControls"/>
-    <ds:schemaRef ds:uri="71af3243-3dd4-4a8d-8c0d-dd76da1f02a5"/>
+    <ds:schemaRef ds:uri="http://schemas.microsoft.com/sharepoint/v3/contenttype/forms"/>
   </ds:schemaRefs>
 </ds:datastoreItem>
 </file>
@@ -3233,9 +3264,11 @@
 </file>
 
 <file path=customXml/itemProps3.xml><?xml version="1.0" encoding="utf-8"?>
-<ds:datastoreItem xmlns:ds="http://schemas.openxmlformats.org/officeDocument/2006/customXml" ds:itemID="{BEA6D05B-AD60-405F-B8DB-FC61ABCDF8E2}">
+<ds:datastoreItem xmlns:ds="http://schemas.openxmlformats.org/officeDocument/2006/customXml" ds:itemID="{B550BB7C-2FBC-4612-9ECE-2EA076035D14}">
   <ds:schemaRefs>
-    <ds:schemaRef ds:uri="http://schemas.microsoft.com/sharepoint/v3/contenttype/forms"/>
+    <ds:schemaRef ds:uri="http://schemas.microsoft.com/office/2006/metadata/properties"/>
+    <ds:schemaRef ds:uri="http://schemas.microsoft.com/office/infopath/2007/PartnerControls"/>
+    <ds:schemaRef ds:uri="71af3243-3dd4-4a8d-8c0d-dd76da1f02a5"/>
   </ds:schemaRefs>
 </ds:datastoreItem>
 </file>
</xml_diff>